<commit_message>
Removed unnecessary blanket approvals
</commit_message>
<xml_diff>
--- a/Portal/src/Datahub.Portal/Controllers/OpenDataApprovalForm.docx
+++ b/Portal/src/Datahub.Portal/Controllers/OpenDataApprovalForm.docx
@@ -1,6 +1,6 @@
 
 <file path=word/document.xml><?xml version="1.0" encoding="utf-8"?>
-<w:document xmlns:wpc="http://schemas.microsoft.com/office/word/2010/wordprocessingCanvas" xmlns:cx="http://schemas.microsoft.com/office/drawing/2014/chartex" xmlns:cx1="http://schemas.microsoft.com/office/drawing/2015/9/8/chartex" xmlns:cx2="http://schemas.microsoft.com/office/drawing/2015/10/21/chartex" xmlns:cx3="http://schemas.microsoft.com/office/drawing/2016/5/9/chartex" xmlns:cx4="http://schemas.microsoft.com/office/drawing/2016/5/10/chartex" xmlns:cx5="http://schemas.microsoft.com/office/drawing/2016/5/11/chartex" xmlns:cx6="http://schemas.microsoft.com/office/drawing/2016/5/12/chartex" xmlns:cx7="http://schemas.microsoft.com/office/drawing/2016/5/13/chartex" xmlns:cx8="http://schemas.microsoft.com/office/drawing/2016/5/14/chartex" xmlns:mc="http://schemas.openxmlformats.org/markup-compatibility/2006" xmlns:aink="http://schemas.microsoft.com/office/drawing/2016/ink" xmlns:am3d="http://schemas.microsoft.com/office/drawing/2017/model3d" xmlns:o="urn:schemas-microsoft-com:office:office" xmlns:oel="http://schemas.microsoft.com/office/2019/extlst" xmlns:r="http://schemas.openxmlformats.org/officeDocument/2006/relationships" xmlns:m="http://schemas.openxmlformats.org/officeDocument/2006/math" xmlns:v="urn:schemas-microsoft-com:vml" xmlns:wp14="http://schemas.microsoft.com/office/word/2010/wordprocessingDrawing" xmlns:wp="http://schemas.openxmlformats.org/drawingml/2006/wordprocessingDrawing" xmlns:w10="urn:schemas-microsoft-com:office:word" xmlns:w="http://schemas.openxmlformats.org/wordprocessingml/2006/main" xmlns:w14="http://schemas.microsoft.com/office/word/2010/wordml" xmlns:w15="http://schemas.microsoft.com/office/word/2012/wordml" xmlns:w16cex="http://schemas.microsoft.com/office/word/2018/wordml/cex" xmlns:w16cid="http://schemas.microsoft.com/office/word/2016/wordml/cid" xmlns:w16="http://schemas.microsoft.com/office/word/2018/wordml" xmlns:w16sdtdh="http://schemas.microsoft.com/office/word/2020/wordml/sdtdatahash" xmlns:w16se="http://schemas.microsoft.com/office/word/2015/wordml/symex" xmlns:wpg="http://schemas.microsoft.com/office/word/2010/wordprocessingGroup" xmlns:wpi="http://schemas.microsoft.com/office/word/2010/wordprocessingInk" xmlns:wne="http://schemas.microsoft.com/office/word/2006/wordml" xmlns:wps="http://schemas.microsoft.com/office/word/2010/wordprocessingShape" mc:Ignorable="w14 w15 w16se w16cid w16 w16cex w16sdtdh wp14">
+<w:document xmlns:wpc="http://schemas.microsoft.com/office/word/2010/wordprocessingCanvas" xmlns:cx="http://schemas.microsoft.com/office/drawing/2014/chartex" xmlns:cx1="http://schemas.microsoft.com/office/drawing/2015/9/8/chartex" xmlns:cx2="http://schemas.microsoft.com/office/drawing/2015/10/21/chartex" xmlns:cx3="http://schemas.microsoft.com/office/drawing/2016/5/9/chartex" xmlns:cx4="http://schemas.microsoft.com/office/drawing/2016/5/10/chartex" xmlns:cx5="http://schemas.microsoft.com/office/drawing/2016/5/11/chartex" xmlns:cx6="http://schemas.microsoft.com/office/drawing/2016/5/12/chartex" xmlns:cx7="http://schemas.microsoft.com/office/drawing/2016/5/13/chartex" xmlns:cx8="http://schemas.microsoft.com/office/drawing/2016/5/14/chartex" xmlns:mc="http://schemas.openxmlformats.org/markup-compatibility/2006" xmlns:aink="http://schemas.microsoft.com/office/drawing/2016/ink" xmlns:am3d="http://schemas.microsoft.com/office/drawing/2017/model3d" xmlns:o="urn:schemas-microsoft-com:office:office" xmlns:oel="http://schemas.microsoft.com/office/2019/extlst" xmlns:r="http://schemas.openxmlformats.org/officeDocument/2006/relationships" xmlns:m="http://schemas.openxmlformats.org/officeDocument/2006/math" xmlns:v="urn:schemas-microsoft-com:vml" xmlns:wp14="http://schemas.microsoft.com/office/word/2010/wordprocessingDrawing" xmlns:wp="http://schemas.openxmlformats.org/drawingml/2006/wordprocessingDrawing" xmlns:w10="urn:schemas-microsoft-com:office:word" xmlns:w="http://schemas.openxmlformats.org/wordprocessingml/2006/main" xmlns:w14="http://schemas.microsoft.com/office/word/2010/wordml" xmlns:w15="http://schemas.microsoft.com/office/word/2012/wordml" xmlns:w16cex="http://schemas.microsoft.com/office/word/2018/wordml/cex" xmlns:w16cid="http://schemas.microsoft.com/office/word/2016/wordml/cid" xmlns:w16="http://schemas.microsoft.com/office/word/2018/wordml" xmlns:w16du="http://schemas.microsoft.com/office/word/2023/wordml/word16du" xmlns:w16sdtdh="http://schemas.microsoft.com/office/word/2020/wordml/sdtdatahash" xmlns:w16se="http://schemas.microsoft.com/office/word/2015/wordml/symex" xmlns:wpg="http://schemas.microsoft.com/office/word/2010/wordprocessingGroup" xmlns:wpi="http://schemas.microsoft.com/office/word/2010/wordprocessingInk" xmlns:wne="http://schemas.microsoft.com/office/word/2006/wordml" xmlns:wps="http://schemas.microsoft.com/office/word/2010/wordprocessingShape" mc:Ignorable="w14 w15 w16se w16cid w16 w16cex w16sdtdh w16du wp14">
   <w:body>
     <w:p>
       <w:pPr>
@@ -2085,82 +2085,6 @@
             <w:pPr>
               <w:ind w:left="360"/>
               <w:rPr>
-                <w:iCs/>
-              </w:rPr>
-            </w:pPr>
-            <w:r>
-              <w:rPr>
-                <w:iCs/>
-              </w:rPr>
-              <w:t>TEMPLATE_BlkApprov2</w:t>
-            </w:r>
-            <w:r>
-              <w:rPr>
-                <w:iCs/>
-              </w:rPr>
-              <w:t> </w:t>
-            </w:r>
-            <w:r>
-              <w:rPr>
-                <w:iCs/>
-              </w:rPr>
-              <w:t xml:space="preserve">  </w:t>
-            </w:r>
-            <w:r>
-              <w:rPr>
-                <w:iCs/>
-              </w:rPr>
-              <w:t>Represents a collection of datasets or data products with a consistently applied specification or model</w:t>
-            </w:r>
-          </w:p>
-          <w:p>
-            <w:pPr>
-              <w:ind w:left="360"/>
-              <w:rPr>
-                <w:iCs/>
-              </w:rPr>
-            </w:pPr>
-            <w:r>
-              <w:rPr>
-                <w:iCs/>
-              </w:rPr>
-              <w:t>TEMPLATE_BlkApprov3</w:t>
-            </w:r>
-            <w:r>
-              <w:rPr>
-                <w:iCs/>
-              </w:rPr>
-              <w:t> </w:t>
-            </w:r>
-            <w:r>
-              <w:rPr>
-                <w:iCs/>
-              </w:rPr>
-              <w:t xml:space="preserve">  </w:t>
-            </w:r>
-            <w:r>
-              <w:rPr>
-                <w:iCs/>
-              </w:rPr>
-              <w:t>Represents a series of observation data</w:t>
-            </w:r>
-            <w:r>
-              <w:rPr>
-                <w:iCs/>
-              </w:rPr>
-              <w:t xml:space="preserve">, </w:t>
-            </w:r>
-            <w:r>
-              <w:rPr>
-                <w:rFonts w:eastAsia="Times New Roman"/>
-              </w:rPr>
-              <w:t>such as data collected from in-situ sensors.</w:t>
-            </w:r>
-          </w:p>
-          <w:p>
-            <w:pPr>
-              <w:ind w:left="360"/>
-              <w:rPr>
                 <w:rFonts w:eastAsia="Times New Roman"/>
               </w:rPr>
             </w:pPr>
@@ -2355,7 +2279,6 @@
     </w:p>
     <w:p>
       <w:r>
-        <w:lastRenderedPageBreak/>
         <w:t xml:space="preserve">I hereby authorize the publication </w:t>
       </w:r>
       <w:r>
@@ -2417,6 +2340,7 @@
           <w:sz w:val="24"/>
           <w:u w:val="single"/>
         </w:rPr>
+        <w:lastRenderedPageBreak/>
         <w:t xml:space="preserve">Level 1: </w:t>
       </w:r>
       <w:r>
@@ -2766,7 +2690,7 @@
 </file>
 
 <file path=word/endnotes.xml><?xml version="1.0" encoding="utf-8"?>
-<w:endnotes xmlns:wpc="http://schemas.microsoft.com/office/word/2010/wordprocessingCanvas" xmlns:cx="http://schemas.microsoft.com/office/drawing/2014/chartex" xmlns:cx1="http://schemas.microsoft.com/office/drawing/2015/9/8/chartex" xmlns:cx2="http://schemas.microsoft.com/office/drawing/2015/10/21/chartex" xmlns:cx3="http://schemas.microsoft.com/office/drawing/2016/5/9/chartex" xmlns:cx4="http://schemas.microsoft.com/office/drawing/2016/5/10/chartex" xmlns:cx5="http://schemas.microsoft.com/office/drawing/2016/5/11/chartex" xmlns:cx6="http://schemas.microsoft.com/office/drawing/2016/5/12/chartex" xmlns:cx7="http://schemas.microsoft.com/office/drawing/2016/5/13/chartex" xmlns:cx8="http://schemas.microsoft.com/office/drawing/2016/5/14/chartex" xmlns:mc="http://schemas.openxmlformats.org/markup-compatibility/2006" xmlns:aink="http://schemas.microsoft.com/office/drawing/2016/ink" xmlns:am3d="http://schemas.microsoft.com/office/drawing/2017/model3d" xmlns:o="urn:schemas-microsoft-com:office:office" xmlns:oel="http://schemas.microsoft.com/office/2019/extlst" xmlns:r="http://schemas.openxmlformats.org/officeDocument/2006/relationships" xmlns:m="http://schemas.openxmlformats.org/officeDocument/2006/math" xmlns:v="urn:schemas-microsoft-com:vml" xmlns:wp14="http://schemas.microsoft.com/office/word/2010/wordprocessingDrawing" xmlns:wp="http://schemas.openxmlformats.org/drawingml/2006/wordprocessingDrawing" xmlns:w10="urn:schemas-microsoft-com:office:word" xmlns:w="http://schemas.openxmlformats.org/wordprocessingml/2006/main" xmlns:w14="http://schemas.microsoft.com/office/word/2010/wordml" xmlns:w15="http://schemas.microsoft.com/office/word/2012/wordml" xmlns:w16cex="http://schemas.microsoft.com/office/word/2018/wordml/cex" xmlns:w16cid="http://schemas.microsoft.com/office/word/2016/wordml/cid" xmlns:w16="http://schemas.microsoft.com/office/word/2018/wordml" xmlns:w16sdtdh="http://schemas.microsoft.com/office/word/2020/wordml/sdtdatahash" xmlns:w16se="http://schemas.microsoft.com/office/word/2015/wordml/symex" xmlns:wpg="http://schemas.microsoft.com/office/word/2010/wordprocessingGroup" xmlns:wpi="http://schemas.microsoft.com/office/word/2010/wordprocessingInk" xmlns:wne="http://schemas.microsoft.com/office/word/2006/wordml" xmlns:wps="http://schemas.microsoft.com/office/word/2010/wordprocessingShape" mc:Ignorable="w14 w15 w16se w16cid w16 w16cex w16sdtdh wp14">
+<w:endnotes xmlns:wpc="http://schemas.microsoft.com/office/word/2010/wordprocessingCanvas" xmlns:cx="http://schemas.microsoft.com/office/drawing/2014/chartex" xmlns:cx1="http://schemas.microsoft.com/office/drawing/2015/9/8/chartex" xmlns:cx2="http://schemas.microsoft.com/office/drawing/2015/10/21/chartex" xmlns:cx3="http://schemas.microsoft.com/office/drawing/2016/5/9/chartex" xmlns:cx4="http://schemas.microsoft.com/office/drawing/2016/5/10/chartex" xmlns:cx5="http://schemas.microsoft.com/office/drawing/2016/5/11/chartex" xmlns:cx6="http://schemas.microsoft.com/office/drawing/2016/5/12/chartex" xmlns:cx7="http://schemas.microsoft.com/office/drawing/2016/5/13/chartex" xmlns:cx8="http://schemas.microsoft.com/office/drawing/2016/5/14/chartex" xmlns:mc="http://schemas.openxmlformats.org/markup-compatibility/2006" xmlns:aink="http://schemas.microsoft.com/office/drawing/2016/ink" xmlns:am3d="http://schemas.microsoft.com/office/drawing/2017/model3d" xmlns:o="urn:schemas-microsoft-com:office:office" xmlns:oel="http://schemas.microsoft.com/office/2019/extlst" xmlns:r="http://schemas.openxmlformats.org/officeDocument/2006/relationships" xmlns:m="http://schemas.openxmlformats.org/officeDocument/2006/math" xmlns:v="urn:schemas-microsoft-com:vml" xmlns:wp14="http://schemas.microsoft.com/office/word/2010/wordprocessingDrawing" xmlns:wp="http://schemas.openxmlformats.org/drawingml/2006/wordprocessingDrawing" xmlns:w10="urn:schemas-microsoft-com:office:word" xmlns:w="http://schemas.openxmlformats.org/wordprocessingml/2006/main" xmlns:w14="http://schemas.microsoft.com/office/word/2010/wordml" xmlns:w15="http://schemas.microsoft.com/office/word/2012/wordml" xmlns:w16cex="http://schemas.microsoft.com/office/word/2018/wordml/cex" xmlns:w16cid="http://schemas.microsoft.com/office/word/2016/wordml/cid" xmlns:w16="http://schemas.microsoft.com/office/word/2018/wordml" xmlns:w16du="http://schemas.microsoft.com/office/word/2023/wordml/word16du" xmlns:w16sdtdh="http://schemas.microsoft.com/office/word/2020/wordml/sdtdatahash" xmlns:w16se="http://schemas.microsoft.com/office/word/2015/wordml/symex" xmlns:wpg="http://schemas.microsoft.com/office/word/2010/wordprocessingGroup" xmlns:wpi="http://schemas.microsoft.com/office/word/2010/wordprocessingInk" xmlns:wne="http://schemas.microsoft.com/office/word/2006/wordml" xmlns:wps="http://schemas.microsoft.com/office/word/2010/wordprocessingShape" mc:Ignorable="w14 w15 w16se w16cid w16 w16cex w16sdtdh w16du wp14">
   <w:endnote w:type="separator" w:id="-1">
     <w:p>
       <w:pPr>
@@ -2791,7 +2715,7 @@
 </file>
 
 <file path=word/footer1.xml><?xml version="1.0" encoding="utf-8"?>
-<w:ftr xmlns:wpc="http://schemas.microsoft.com/office/word/2010/wordprocessingCanvas" xmlns:cx="http://schemas.microsoft.com/office/drawing/2014/chartex" xmlns:cx1="http://schemas.microsoft.com/office/drawing/2015/9/8/chartex" xmlns:cx2="http://schemas.microsoft.com/office/drawing/2015/10/21/chartex" xmlns:cx3="http://schemas.microsoft.com/office/drawing/2016/5/9/chartex" xmlns:cx4="http://schemas.microsoft.com/office/drawing/2016/5/10/chartex" xmlns:cx5="http://schemas.microsoft.com/office/drawing/2016/5/11/chartex" xmlns:cx6="http://schemas.microsoft.com/office/drawing/2016/5/12/chartex" xmlns:cx7="http://schemas.microsoft.com/office/drawing/2016/5/13/chartex" xmlns:cx8="http://schemas.microsoft.com/office/drawing/2016/5/14/chartex" xmlns:mc="http://schemas.openxmlformats.org/markup-compatibility/2006" xmlns:aink="http://schemas.microsoft.com/office/drawing/2016/ink" xmlns:am3d="http://schemas.microsoft.com/office/drawing/2017/model3d" xmlns:o="urn:schemas-microsoft-com:office:office" xmlns:oel="http://schemas.microsoft.com/office/2019/extlst" xmlns:r="http://schemas.openxmlformats.org/officeDocument/2006/relationships" xmlns:m="http://schemas.openxmlformats.org/officeDocument/2006/math" xmlns:v="urn:schemas-microsoft-com:vml" xmlns:wp14="http://schemas.microsoft.com/office/word/2010/wordprocessingDrawing" xmlns:wp="http://schemas.openxmlformats.org/drawingml/2006/wordprocessingDrawing" xmlns:w10="urn:schemas-microsoft-com:office:word" xmlns:w="http://schemas.openxmlformats.org/wordprocessingml/2006/main" xmlns:w14="http://schemas.microsoft.com/office/word/2010/wordml" xmlns:w15="http://schemas.microsoft.com/office/word/2012/wordml" xmlns:w16cex="http://schemas.microsoft.com/office/word/2018/wordml/cex" xmlns:w16cid="http://schemas.microsoft.com/office/word/2016/wordml/cid" xmlns:w16="http://schemas.microsoft.com/office/word/2018/wordml" xmlns:w16sdtdh="http://schemas.microsoft.com/office/word/2020/wordml/sdtdatahash" xmlns:w16se="http://schemas.microsoft.com/office/word/2015/wordml/symex" xmlns:wpg="http://schemas.microsoft.com/office/word/2010/wordprocessingGroup" xmlns:wpi="http://schemas.microsoft.com/office/word/2010/wordprocessingInk" xmlns:wne="http://schemas.microsoft.com/office/word/2006/wordml" xmlns:wps="http://schemas.microsoft.com/office/word/2010/wordprocessingShape" mc:Ignorable="w14 w15 w16se w16cid w16 w16cex w16sdtdh wp14">
+<w:ftr xmlns:wpc="http://schemas.microsoft.com/office/word/2010/wordprocessingCanvas" xmlns:cx="http://schemas.microsoft.com/office/drawing/2014/chartex" xmlns:cx1="http://schemas.microsoft.com/office/drawing/2015/9/8/chartex" xmlns:cx2="http://schemas.microsoft.com/office/drawing/2015/10/21/chartex" xmlns:cx3="http://schemas.microsoft.com/office/drawing/2016/5/9/chartex" xmlns:cx4="http://schemas.microsoft.com/office/drawing/2016/5/10/chartex" xmlns:cx5="http://schemas.microsoft.com/office/drawing/2016/5/11/chartex" xmlns:cx6="http://schemas.microsoft.com/office/drawing/2016/5/12/chartex" xmlns:cx7="http://schemas.microsoft.com/office/drawing/2016/5/13/chartex" xmlns:cx8="http://schemas.microsoft.com/office/drawing/2016/5/14/chartex" xmlns:mc="http://schemas.openxmlformats.org/markup-compatibility/2006" xmlns:aink="http://schemas.microsoft.com/office/drawing/2016/ink" xmlns:am3d="http://schemas.microsoft.com/office/drawing/2017/model3d" xmlns:o="urn:schemas-microsoft-com:office:office" xmlns:oel="http://schemas.microsoft.com/office/2019/extlst" xmlns:r="http://schemas.openxmlformats.org/officeDocument/2006/relationships" xmlns:m="http://schemas.openxmlformats.org/officeDocument/2006/math" xmlns:v="urn:schemas-microsoft-com:vml" xmlns:wp14="http://schemas.microsoft.com/office/word/2010/wordprocessingDrawing" xmlns:wp="http://schemas.openxmlformats.org/drawingml/2006/wordprocessingDrawing" xmlns:w10="urn:schemas-microsoft-com:office:word" xmlns:w="http://schemas.openxmlformats.org/wordprocessingml/2006/main" xmlns:w14="http://schemas.microsoft.com/office/word/2010/wordml" xmlns:w15="http://schemas.microsoft.com/office/word/2012/wordml" xmlns:w16cex="http://schemas.microsoft.com/office/word/2018/wordml/cex" xmlns:w16cid="http://schemas.microsoft.com/office/word/2016/wordml/cid" xmlns:w16="http://schemas.microsoft.com/office/word/2018/wordml" xmlns:w16du="http://schemas.microsoft.com/office/word/2023/wordml/word16du" xmlns:w16sdtdh="http://schemas.microsoft.com/office/word/2020/wordml/sdtdatahash" xmlns:w16se="http://schemas.microsoft.com/office/word/2015/wordml/symex" xmlns:wpg="http://schemas.microsoft.com/office/word/2010/wordprocessingGroup" xmlns:wpi="http://schemas.microsoft.com/office/word/2010/wordprocessingInk" xmlns:wne="http://schemas.microsoft.com/office/word/2006/wordml" xmlns:wps="http://schemas.microsoft.com/office/word/2010/wordprocessingShape" mc:Ignorable="w14 w15 w16se w16cid w16 w16cex w16sdtdh w16du wp14">
   <w:sdt>
     <w:sdtPr>
       <w:id w:val="-1743780762"/>
@@ -2853,7 +2777,7 @@
 </file>
 
 <file path=word/footnotes.xml><?xml version="1.0" encoding="utf-8"?>
-<w:footnotes xmlns:wpc="http://schemas.microsoft.com/office/word/2010/wordprocessingCanvas" xmlns:cx="http://schemas.microsoft.com/office/drawing/2014/chartex" xmlns:cx1="http://schemas.microsoft.com/office/drawing/2015/9/8/chartex" xmlns:cx2="http://schemas.microsoft.com/office/drawing/2015/10/21/chartex" xmlns:cx3="http://schemas.microsoft.com/office/drawing/2016/5/9/chartex" xmlns:cx4="http://schemas.microsoft.com/office/drawing/2016/5/10/chartex" xmlns:cx5="http://schemas.microsoft.com/office/drawing/2016/5/11/chartex" xmlns:cx6="http://schemas.microsoft.com/office/drawing/2016/5/12/chartex" xmlns:cx7="http://schemas.microsoft.com/office/drawing/2016/5/13/chartex" xmlns:cx8="http://schemas.microsoft.com/office/drawing/2016/5/14/chartex" xmlns:mc="http://schemas.openxmlformats.org/markup-compatibility/2006" xmlns:aink="http://schemas.microsoft.com/office/drawing/2016/ink" xmlns:am3d="http://schemas.microsoft.com/office/drawing/2017/model3d" xmlns:o="urn:schemas-microsoft-com:office:office" xmlns:oel="http://schemas.microsoft.com/office/2019/extlst" xmlns:r="http://schemas.openxmlformats.org/officeDocument/2006/relationships" xmlns:m="http://schemas.openxmlformats.org/officeDocument/2006/math" xmlns:v="urn:schemas-microsoft-com:vml" xmlns:wp14="http://schemas.microsoft.com/office/word/2010/wordprocessingDrawing" xmlns:wp="http://schemas.openxmlformats.org/drawingml/2006/wordprocessingDrawing" xmlns:w10="urn:schemas-microsoft-com:office:word" xmlns:w="http://schemas.openxmlformats.org/wordprocessingml/2006/main" xmlns:w14="http://schemas.microsoft.com/office/word/2010/wordml" xmlns:w15="http://schemas.microsoft.com/office/word/2012/wordml" xmlns:w16cex="http://schemas.microsoft.com/office/word/2018/wordml/cex" xmlns:w16cid="http://schemas.microsoft.com/office/word/2016/wordml/cid" xmlns:w16="http://schemas.microsoft.com/office/word/2018/wordml" xmlns:w16sdtdh="http://schemas.microsoft.com/office/word/2020/wordml/sdtdatahash" xmlns:w16se="http://schemas.microsoft.com/office/word/2015/wordml/symex" xmlns:wpg="http://schemas.microsoft.com/office/word/2010/wordprocessingGroup" xmlns:wpi="http://schemas.microsoft.com/office/word/2010/wordprocessingInk" xmlns:wne="http://schemas.microsoft.com/office/word/2006/wordml" xmlns:wps="http://schemas.microsoft.com/office/word/2010/wordprocessingShape" mc:Ignorable="w14 w15 w16se w16cid w16 w16cex w16sdtdh wp14">
+<w:footnotes xmlns:wpc="http://schemas.microsoft.com/office/word/2010/wordprocessingCanvas" xmlns:cx="http://schemas.microsoft.com/office/drawing/2014/chartex" xmlns:cx1="http://schemas.microsoft.com/office/drawing/2015/9/8/chartex" xmlns:cx2="http://schemas.microsoft.com/office/drawing/2015/10/21/chartex" xmlns:cx3="http://schemas.microsoft.com/office/drawing/2016/5/9/chartex" xmlns:cx4="http://schemas.microsoft.com/office/drawing/2016/5/10/chartex" xmlns:cx5="http://schemas.microsoft.com/office/drawing/2016/5/11/chartex" xmlns:cx6="http://schemas.microsoft.com/office/drawing/2016/5/12/chartex" xmlns:cx7="http://schemas.microsoft.com/office/drawing/2016/5/13/chartex" xmlns:cx8="http://schemas.microsoft.com/office/drawing/2016/5/14/chartex" xmlns:mc="http://schemas.openxmlformats.org/markup-compatibility/2006" xmlns:aink="http://schemas.microsoft.com/office/drawing/2016/ink" xmlns:am3d="http://schemas.microsoft.com/office/drawing/2017/model3d" xmlns:o="urn:schemas-microsoft-com:office:office" xmlns:oel="http://schemas.microsoft.com/office/2019/extlst" xmlns:r="http://schemas.openxmlformats.org/officeDocument/2006/relationships" xmlns:m="http://schemas.openxmlformats.org/officeDocument/2006/math" xmlns:v="urn:schemas-microsoft-com:vml" xmlns:wp14="http://schemas.microsoft.com/office/word/2010/wordprocessingDrawing" xmlns:wp="http://schemas.openxmlformats.org/drawingml/2006/wordprocessingDrawing" xmlns:w10="urn:schemas-microsoft-com:office:word" xmlns:w="http://schemas.openxmlformats.org/wordprocessingml/2006/main" xmlns:w14="http://schemas.microsoft.com/office/word/2010/wordml" xmlns:w15="http://schemas.microsoft.com/office/word/2012/wordml" xmlns:w16cex="http://schemas.microsoft.com/office/word/2018/wordml/cex" xmlns:w16cid="http://schemas.microsoft.com/office/word/2016/wordml/cid" xmlns:w16="http://schemas.microsoft.com/office/word/2018/wordml" xmlns:w16du="http://schemas.microsoft.com/office/word/2023/wordml/word16du" xmlns:w16sdtdh="http://schemas.microsoft.com/office/word/2020/wordml/sdtdatahash" xmlns:w16se="http://schemas.microsoft.com/office/word/2015/wordml/symex" xmlns:wpg="http://schemas.microsoft.com/office/word/2010/wordprocessingGroup" xmlns:wpi="http://schemas.microsoft.com/office/word/2010/wordprocessingInk" xmlns:wne="http://schemas.microsoft.com/office/word/2006/wordml" xmlns:wps="http://schemas.microsoft.com/office/word/2010/wordprocessingShape" mc:Ignorable="w14 w15 w16se w16cid w16 w16cex w16sdtdh w16du wp14">
   <w:footnote w:type="separator" w:id="-1">
     <w:p>
       <w:pPr>
@@ -2878,7 +2802,7 @@
 </file>
 
 <file path=word/header1.xml><?xml version="1.0" encoding="utf-8"?>
-<w:hdr xmlns:wpc="http://schemas.microsoft.com/office/word/2010/wordprocessingCanvas" xmlns:cx="http://schemas.microsoft.com/office/drawing/2014/chartex" xmlns:cx1="http://schemas.microsoft.com/office/drawing/2015/9/8/chartex" xmlns:cx2="http://schemas.microsoft.com/office/drawing/2015/10/21/chartex" xmlns:cx3="http://schemas.microsoft.com/office/drawing/2016/5/9/chartex" xmlns:cx4="http://schemas.microsoft.com/office/drawing/2016/5/10/chartex" xmlns:cx5="http://schemas.microsoft.com/office/drawing/2016/5/11/chartex" xmlns:cx6="http://schemas.microsoft.com/office/drawing/2016/5/12/chartex" xmlns:cx7="http://schemas.microsoft.com/office/drawing/2016/5/13/chartex" xmlns:cx8="http://schemas.microsoft.com/office/drawing/2016/5/14/chartex" xmlns:mc="http://schemas.openxmlformats.org/markup-compatibility/2006" xmlns:aink="http://schemas.microsoft.com/office/drawing/2016/ink" xmlns:am3d="http://schemas.microsoft.com/office/drawing/2017/model3d" xmlns:o="urn:schemas-microsoft-com:office:office" xmlns:oel="http://schemas.microsoft.com/office/2019/extlst" xmlns:r="http://schemas.openxmlformats.org/officeDocument/2006/relationships" xmlns:m="http://schemas.openxmlformats.org/officeDocument/2006/math" xmlns:v="urn:schemas-microsoft-com:vml" xmlns:wp14="http://schemas.microsoft.com/office/word/2010/wordprocessingDrawing" xmlns:wp="http://schemas.openxmlformats.org/drawingml/2006/wordprocessingDrawing" xmlns:w10="urn:schemas-microsoft-com:office:word" xmlns:w="http://schemas.openxmlformats.org/wordprocessingml/2006/main" xmlns:w14="http://schemas.microsoft.com/office/word/2010/wordml" xmlns:w15="http://schemas.microsoft.com/office/word/2012/wordml" xmlns:w16cex="http://schemas.microsoft.com/office/word/2018/wordml/cex" xmlns:w16cid="http://schemas.microsoft.com/office/word/2016/wordml/cid" xmlns:w16="http://schemas.microsoft.com/office/word/2018/wordml" xmlns:w16sdtdh="http://schemas.microsoft.com/office/word/2020/wordml/sdtdatahash" xmlns:w16se="http://schemas.microsoft.com/office/word/2015/wordml/symex" xmlns:wpg="http://schemas.microsoft.com/office/word/2010/wordprocessingGroup" xmlns:wpi="http://schemas.microsoft.com/office/word/2010/wordprocessingInk" xmlns:wne="http://schemas.microsoft.com/office/word/2006/wordml" xmlns:wps="http://schemas.microsoft.com/office/word/2010/wordprocessingShape" mc:Ignorable="w14 w15 w16se w16cid w16 w16cex w16sdtdh wp14">
+<w:hdr xmlns:wpc="http://schemas.microsoft.com/office/word/2010/wordprocessingCanvas" xmlns:cx="http://schemas.microsoft.com/office/drawing/2014/chartex" xmlns:cx1="http://schemas.microsoft.com/office/drawing/2015/9/8/chartex" xmlns:cx2="http://schemas.microsoft.com/office/drawing/2015/10/21/chartex" xmlns:cx3="http://schemas.microsoft.com/office/drawing/2016/5/9/chartex" xmlns:cx4="http://schemas.microsoft.com/office/drawing/2016/5/10/chartex" xmlns:cx5="http://schemas.microsoft.com/office/drawing/2016/5/11/chartex" xmlns:cx6="http://schemas.microsoft.com/office/drawing/2016/5/12/chartex" xmlns:cx7="http://schemas.microsoft.com/office/drawing/2016/5/13/chartex" xmlns:cx8="http://schemas.microsoft.com/office/drawing/2016/5/14/chartex" xmlns:mc="http://schemas.openxmlformats.org/markup-compatibility/2006" xmlns:aink="http://schemas.microsoft.com/office/drawing/2016/ink" xmlns:am3d="http://schemas.microsoft.com/office/drawing/2017/model3d" xmlns:o="urn:schemas-microsoft-com:office:office" xmlns:oel="http://schemas.microsoft.com/office/2019/extlst" xmlns:r="http://schemas.openxmlformats.org/officeDocument/2006/relationships" xmlns:m="http://schemas.openxmlformats.org/officeDocument/2006/math" xmlns:v="urn:schemas-microsoft-com:vml" xmlns:wp14="http://schemas.microsoft.com/office/word/2010/wordprocessingDrawing" xmlns:wp="http://schemas.openxmlformats.org/drawingml/2006/wordprocessingDrawing" xmlns:w10="urn:schemas-microsoft-com:office:word" xmlns:w="http://schemas.openxmlformats.org/wordprocessingml/2006/main" xmlns:w14="http://schemas.microsoft.com/office/word/2010/wordml" xmlns:w15="http://schemas.microsoft.com/office/word/2012/wordml" xmlns:w16cex="http://schemas.microsoft.com/office/word/2018/wordml/cex" xmlns:w16cid="http://schemas.microsoft.com/office/word/2016/wordml/cid" xmlns:w16="http://schemas.microsoft.com/office/word/2018/wordml" xmlns:w16du="http://schemas.microsoft.com/office/word/2023/wordml/word16du" xmlns:w16sdtdh="http://schemas.microsoft.com/office/word/2020/wordml/sdtdatahash" xmlns:w16se="http://schemas.microsoft.com/office/word/2015/wordml/symex" xmlns:wpg="http://schemas.microsoft.com/office/word/2010/wordprocessingGroup" xmlns:wpi="http://schemas.microsoft.com/office/word/2010/wordprocessingInk" xmlns:wne="http://schemas.microsoft.com/office/word/2006/wordml" xmlns:wps="http://schemas.microsoft.com/office/word/2010/wordprocessingShape" mc:Ignorable="w14 w15 w16se w16cid w16 w16cex w16sdtdh w16du wp14">
   <w:p>
     <w:pPr>
       <w:pStyle w:val="Header"/>
@@ -2971,7 +2895,6 @@
               <v:path gradientshapeok="t" o:connecttype="rect"/>
             </v:shapetype>
             <v:shape id="Text Box 3" o:spid="_x0000_s1026" type="#_x0000_t202" alt="Unclassified | Non classifié" style="position:absolute;margin-left:-16.25pt;margin-top:0;width:34.95pt;height:34.95pt;z-index:251660288;visibility:visible;mso-wrap-style:none;mso-wrap-distance-left:0;mso-wrap-distance-top:0;mso-wrap-distance-right:0;mso-wrap-distance-bottom:0;mso-position-horizontal:right;mso-position-horizontal-relative:page;mso-position-vertical:top;mso-position-vertical-relative:page;v-text-anchor:top" o:gfxdata="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" filled="f" stroked="f">
-              <v:fill o:detectmouseclick="t"/>
               <v:textbox style="mso-fit-shape-to-text:t" inset="0,15pt,20pt,0">
                 <w:txbxContent>
                   <w:p>
@@ -3009,7 +2932,7 @@
 </file>
 
 <file path=word/header2.xml><?xml version="1.0" encoding="utf-8"?>
-<w:hdr xmlns:wpc="http://schemas.microsoft.com/office/word/2010/wordprocessingCanvas" xmlns:cx="http://schemas.microsoft.com/office/drawing/2014/chartex" xmlns:cx1="http://schemas.microsoft.com/office/drawing/2015/9/8/chartex" xmlns:cx2="http://schemas.microsoft.com/office/drawing/2015/10/21/chartex" xmlns:cx3="http://schemas.microsoft.com/office/drawing/2016/5/9/chartex" xmlns:cx4="http://schemas.microsoft.com/office/drawing/2016/5/10/chartex" xmlns:cx5="http://schemas.microsoft.com/office/drawing/2016/5/11/chartex" xmlns:cx6="http://schemas.microsoft.com/office/drawing/2016/5/12/chartex" xmlns:cx7="http://schemas.microsoft.com/office/drawing/2016/5/13/chartex" xmlns:cx8="http://schemas.microsoft.com/office/drawing/2016/5/14/chartex" xmlns:mc="http://schemas.openxmlformats.org/markup-compatibility/2006" xmlns:aink="http://schemas.microsoft.com/office/drawing/2016/ink" xmlns:am3d="http://schemas.microsoft.com/office/drawing/2017/model3d" xmlns:o="urn:schemas-microsoft-com:office:office" xmlns:oel="http://schemas.microsoft.com/office/2019/extlst" xmlns:r="http://schemas.openxmlformats.org/officeDocument/2006/relationships" xmlns:m="http://schemas.openxmlformats.org/officeDocument/2006/math" xmlns:v="urn:schemas-microsoft-com:vml" xmlns:wp14="http://schemas.microsoft.com/office/word/2010/wordprocessingDrawing" xmlns:wp="http://schemas.openxmlformats.org/drawingml/2006/wordprocessingDrawing" xmlns:w10="urn:schemas-microsoft-com:office:word" xmlns:w="http://schemas.openxmlformats.org/wordprocessingml/2006/main" xmlns:w14="http://schemas.microsoft.com/office/word/2010/wordml" xmlns:w15="http://schemas.microsoft.com/office/word/2012/wordml" xmlns:w16cex="http://schemas.microsoft.com/office/word/2018/wordml/cex" xmlns:w16cid="http://schemas.microsoft.com/office/word/2016/wordml/cid" xmlns:w16="http://schemas.microsoft.com/office/word/2018/wordml" xmlns:w16sdtdh="http://schemas.microsoft.com/office/word/2020/wordml/sdtdatahash" xmlns:w16se="http://schemas.microsoft.com/office/word/2015/wordml/symex" xmlns:wpg="http://schemas.microsoft.com/office/word/2010/wordprocessingGroup" xmlns:wpi="http://schemas.microsoft.com/office/word/2010/wordprocessingInk" xmlns:wne="http://schemas.microsoft.com/office/word/2006/wordml" xmlns:wps="http://schemas.microsoft.com/office/word/2010/wordprocessingShape" mc:Ignorable="w14 w15 w16se w16cid w16 w16cex w16sdtdh wp14">
+<w:hdr xmlns:wpc="http://schemas.microsoft.com/office/word/2010/wordprocessingCanvas" xmlns:cx="http://schemas.microsoft.com/office/drawing/2014/chartex" xmlns:cx1="http://schemas.microsoft.com/office/drawing/2015/9/8/chartex" xmlns:cx2="http://schemas.microsoft.com/office/drawing/2015/10/21/chartex" xmlns:cx3="http://schemas.microsoft.com/office/drawing/2016/5/9/chartex" xmlns:cx4="http://schemas.microsoft.com/office/drawing/2016/5/10/chartex" xmlns:cx5="http://schemas.microsoft.com/office/drawing/2016/5/11/chartex" xmlns:cx6="http://schemas.microsoft.com/office/drawing/2016/5/12/chartex" xmlns:cx7="http://schemas.microsoft.com/office/drawing/2016/5/13/chartex" xmlns:cx8="http://schemas.microsoft.com/office/drawing/2016/5/14/chartex" xmlns:mc="http://schemas.openxmlformats.org/markup-compatibility/2006" xmlns:aink="http://schemas.microsoft.com/office/drawing/2016/ink" xmlns:am3d="http://schemas.microsoft.com/office/drawing/2017/model3d" xmlns:o="urn:schemas-microsoft-com:office:office" xmlns:oel="http://schemas.microsoft.com/office/2019/extlst" xmlns:r="http://schemas.openxmlformats.org/officeDocument/2006/relationships" xmlns:m="http://schemas.openxmlformats.org/officeDocument/2006/math" xmlns:v="urn:schemas-microsoft-com:vml" xmlns:wp14="http://schemas.microsoft.com/office/word/2010/wordprocessingDrawing" xmlns:wp="http://schemas.openxmlformats.org/drawingml/2006/wordprocessingDrawing" xmlns:w10="urn:schemas-microsoft-com:office:word" xmlns:w="http://schemas.openxmlformats.org/wordprocessingml/2006/main" xmlns:w14="http://schemas.microsoft.com/office/word/2010/wordml" xmlns:w15="http://schemas.microsoft.com/office/word/2012/wordml" xmlns:w16cex="http://schemas.microsoft.com/office/word/2018/wordml/cex" xmlns:w16cid="http://schemas.microsoft.com/office/word/2016/wordml/cid" xmlns:w16="http://schemas.microsoft.com/office/word/2018/wordml" xmlns:w16du="http://schemas.microsoft.com/office/word/2023/wordml/word16du" xmlns:w16sdtdh="http://schemas.microsoft.com/office/word/2020/wordml/sdtdatahash" xmlns:w16se="http://schemas.microsoft.com/office/word/2015/wordml/symex" xmlns:wpg="http://schemas.microsoft.com/office/word/2010/wordprocessingGroup" xmlns:wpi="http://schemas.microsoft.com/office/word/2010/wordprocessingInk" xmlns:wne="http://schemas.microsoft.com/office/word/2006/wordml" xmlns:wps="http://schemas.microsoft.com/office/word/2010/wordprocessingShape" mc:Ignorable="w14 w15 w16se w16cid w16 w16cex w16sdtdh w16du wp14">
   <w:p>
     <w:pPr>
       <w:pStyle w:val="Header"/>
@@ -3103,7 +3026,6 @@
               <v:path gradientshapeok="t" o:connecttype="rect"/>
             </v:shapetype>
             <v:shape id="Text Box 4" o:spid="_x0000_s1027" type="#_x0000_t202" alt="Unclassified | Non classifié" style="position:absolute;margin-left:-16.25pt;margin-top:0;width:34.95pt;height:34.95pt;z-index:251661312;visibility:visible;mso-wrap-style:none;mso-wrap-distance-left:0;mso-wrap-distance-top:0;mso-wrap-distance-right:0;mso-wrap-distance-bottom:0;mso-position-horizontal:right;mso-position-horizontal-relative:page;mso-position-vertical:top;mso-position-vertical-relative:page;v-text-anchor:top" o:gfxdata="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" filled="f" stroked="f">
-              <v:fill o:detectmouseclick="t"/>
               <v:textbox style="mso-fit-shape-to-text:t" inset="0,15pt,20pt,0">
                 <w:txbxContent>
                   <w:p>
@@ -3226,7 +3148,7 @@
 </file>
 
 <file path=word/header3.xml><?xml version="1.0" encoding="utf-8"?>
-<w:hdr xmlns:wpc="http://schemas.microsoft.com/office/word/2010/wordprocessingCanvas" xmlns:cx="http://schemas.microsoft.com/office/drawing/2014/chartex" xmlns:cx1="http://schemas.microsoft.com/office/drawing/2015/9/8/chartex" xmlns:cx2="http://schemas.microsoft.com/office/drawing/2015/10/21/chartex" xmlns:cx3="http://schemas.microsoft.com/office/drawing/2016/5/9/chartex" xmlns:cx4="http://schemas.microsoft.com/office/drawing/2016/5/10/chartex" xmlns:cx5="http://schemas.microsoft.com/office/drawing/2016/5/11/chartex" xmlns:cx6="http://schemas.microsoft.com/office/drawing/2016/5/12/chartex" xmlns:cx7="http://schemas.microsoft.com/office/drawing/2016/5/13/chartex" xmlns:cx8="http://schemas.microsoft.com/office/drawing/2016/5/14/chartex" xmlns:mc="http://schemas.openxmlformats.org/markup-compatibility/2006" xmlns:aink="http://schemas.microsoft.com/office/drawing/2016/ink" xmlns:am3d="http://schemas.microsoft.com/office/drawing/2017/model3d" xmlns:o="urn:schemas-microsoft-com:office:office" xmlns:oel="http://schemas.microsoft.com/office/2019/extlst" xmlns:r="http://schemas.openxmlformats.org/officeDocument/2006/relationships" xmlns:m="http://schemas.openxmlformats.org/officeDocument/2006/math" xmlns:v="urn:schemas-microsoft-com:vml" xmlns:wp14="http://schemas.microsoft.com/office/word/2010/wordprocessingDrawing" xmlns:wp="http://schemas.openxmlformats.org/drawingml/2006/wordprocessingDrawing" xmlns:w10="urn:schemas-microsoft-com:office:word" xmlns:w="http://schemas.openxmlformats.org/wordprocessingml/2006/main" xmlns:w14="http://schemas.microsoft.com/office/word/2010/wordml" xmlns:w15="http://schemas.microsoft.com/office/word/2012/wordml" xmlns:w16cex="http://schemas.microsoft.com/office/word/2018/wordml/cex" xmlns:w16cid="http://schemas.microsoft.com/office/word/2016/wordml/cid" xmlns:w16="http://schemas.microsoft.com/office/word/2018/wordml" xmlns:w16sdtdh="http://schemas.microsoft.com/office/word/2020/wordml/sdtdatahash" xmlns:w16se="http://schemas.microsoft.com/office/word/2015/wordml/symex" xmlns:wpg="http://schemas.microsoft.com/office/word/2010/wordprocessingGroup" xmlns:wpi="http://schemas.microsoft.com/office/word/2010/wordprocessingInk" xmlns:wne="http://schemas.microsoft.com/office/word/2006/wordml" xmlns:wps="http://schemas.microsoft.com/office/word/2010/wordprocessingShape" mc:Ignorable="w14 w15 w16se w16cid w16 w16cex w16sdtdh wp14">
+<w:hdr xmlns:wpc="http://schemas.microsoft.com/office/word/2010/wordprocessingCanvas" xmlns:cx="http://schemas.microsoft.com/office/drawing/2014/chartex" xmlns:cx1="http://schemas.microsoft.com/office/drawing/2015/9/8/chartex" xmlns:cx2="http://schemas.microsoft.com/office/drawing/2015/10/21/chartex" xmlns:cx3="http://schemas.microsoft.com/office/drawing/2016/5/9/chartex" xmlns:cx4="http://schemas.microsoft.com/office/drawing/2016/5/10/chartex" xmlns:cx5="http://schemas.microsoft.com/office/drawing/2016/5/11/chartex" xmlns:cx6="http://schemas.microsoft.com/office/drawing/2016/5/12/chartex" xmlns:cx7="http://schemas.microsoft.com/office/drawing/2016/5/13/chartex" xmlns:cx8="http://schemas.microsoft.com/office/drawing/2016/5/14/chartex" xmlns:mc="http://schemas.openxmlformats.org/markup-compatibility/2006" xmlns:aink="http://schemas.microsoft.com/office/drawing/2016/ink" xmlns:am3d="http://schemas.microsoft.com/office/drawing/2017/model3d" xmlns:o="urn:schemas-microsoft-com:office:office" xmlns:oel="http://schemas.microsoft.com/office/2019/extlst" xmlns:r="http://schemas.openxmlformats.org/officeDocument/2006/relationships" xmlns:m="http://schemas.openxmlformats.org/officeDocument/2006/math" xmlns:v="urn:schemas-microsoft-com:vml" xmlns:wp14="http://schemas.microsoft.com/office/word/2010/wordprocessingDrawing" xmlns:wp="http://schemas.openxmlformats.org/drawingml/2006/wordprocessingDrawing" xmlns:w10="urn:schemas-microsoft-com:office:word" xmlns:w="http://schemas.openxmlformats.org/wordprocessingml/2006/main" xmlns:w14="http://schemas.microsoft.com/office/word/2010/wordml" xmlns:w15="http://schemas.microsoft.com/office/word/2012/wordml" xmlns:w16cex="http://schemas.microsoft.com/office/word/2018/wordml/cex" xmlns:w16cid="http://schemas.microsoft.com/office/word/2016/wordml/cid" xmlns:w16="http://schemas.microsoft.com/office/word/2018/wordml" xmlns:w16du="http://schemas.microsoft.com/office/word/2023/wordml/word16du" xmlns:w16sdtdh="http://schemas.microsoft.com/office/word/2020/wordml/sdtdatahash" xmlns:w16se="http://schemas.microsoft.com/office/word/2015/wordml/symex" xmlns:wpg="http://schemas.microsoft.com/office/word/2010/wordprocessingGroup" xmlns:wpi="http://schemas.microsoft.com/office/word/2010/wordprocessingInk" xmlns:wne="http://schemas.microsoft.com/office/word/2006/wordml" xmlns:wps="http://schemas.microsoft.com/office/word/2010/wordprocessingShape" mc:Ignorable="w14 w15 w16se w16cid w16 w16cex w16sdtdh w16du wp14">
   <w:p>
     <w:pPr>
       <w:pStyle w:val="Header"/>
@@ -3319,7 +3241,6 @@
               <v:path gradientshapeok="t" o:connecttype="rect"/>
             </v:shapetype>
             <v:shape id="Text Box 1" o:spid="_x0000_s1028" type="#_x0000_t202" alt="Unclassified | Non classifié" style="position:absolute;margin-left:-16.25pt;margin-top:0;width:34.95pt;height:34.95pt;z-index:251659264;visibility:visible;mso-wrap-style:none;mso-wrap-distance-left:0;mso-wrap-distance-top:0;mso-wrap-distance-right:0;mso-wrap-distance-bottom:0;mso-position-horizontal:right;mso-position-horizontal-relative:page;mso-position-vertical:top;mso-position-vertical-relative:page;v-text-anchor:top" o:gfxdata="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" filled="f" stroked="f">
-              <v:fill o:detectmouseclick="t"/>
               <v:textbox style="mso-fit-shape-to-text:t" inset="0,15pt,20pt,0">
                 <w:txbxContent>
                   <w:p>
@@ -3357,7 +3278,7 @@
 </file>
 
 <file path=word/numbering.xml><?xml version="1.0" encoding="utf-8"?>
-<w:numbering xmlns:wpc="http://schemas.microsoft.com/office/word/2010/wordprocessingCanvas" xmlns:cx="http://schemas.microsoft.com/office/drawing/2014/chartex" xmlns:cx1="http://schemas.microsoft.com/office/drawing/2015/9/8/chartex" xmlns:cx2="http://schemas.microsoft.com/office/drawing/2015/10/21/chartex" xmlns:cx3="http://schemas.microsoft.com/office/drawing/2016/5/9/chartex" xmlns:cx4="http://schemas.microsoft.com/office/drawing/2016/5/10/chartex" xmlns:cx5="http://schemas.microsoft.com/office/drawing/2016/5/11/chartex" xmlns:cx6="http://schemas.microsoft.com/office/drawing/2016/5/12/chartex" xmlns:cx7="http://schemas.microsoft.com/office/drawing/2016/5/13/chartex" xmlns:cx8="http://schemas.microsoft.com/office/drawing/2016/5/14/chartex" xmlns:mc="http://schemas.openxmlformats.org/markup-compatibility/2006" xmlns:aink="http://schemas.microsoft.com/office/drawing/2016/ink" xmlns:am3d="http://schemas.microsoft.com/office/drawing/2017/model3d" xmlns:o="urn:schemas-microsoft-com:office:office" xmlns:oel="http://schemas.microsoft.com/office/2019/extlst" xmlns:r="http://schemas.openxmlformats.org/officeDocument/2006/relationships" xmlns:m="http://schemas.openxmlformats.org/officeDocument/2006/math" xmlns:v="urn:schemas-microsoft-com:vml" xmlns:wp14="http://schemas.microsoft.com/office/word/2010/wordprocessingDrawing" xmlns:wp="http://schemas.openxmlformats.org/drawingml/2006/wordprocessingDrawing" xmlns:w10="urn:schemas-microsoft-com:office:word" xmlns:w="http://schemas.openxmlformats.org/wordprocessingml/2006/main" xmlns:w14="http://schemas.microsoft.com/office/word/2010/wordml" xmlns:w15="http://schemas.microsoft.com/office/word/2012/wordml" xmlns:w16cex="http://schemas.microsoft.com/office/word/2018/wordml/cex" xmlns:w16cid="http://schemas.microsoft.com/office/word/2016/wordml/cid" xmlns:w16="http://schemas.microsoft.com/office/word/2018/wordml" xmlns:w16sdtdh="http://schemas.microsoft.com/office/word/2020/wordml/sdtdatahash" xmlns:w16se="http://schemas.microsoft.com/office/word/2015/wordml/symex" xmlns:wpg="http://schemas.microsoft.com/office/word/2010/wordprocessingGroup" xmlns:wpi="http://schemas.microsoft.com/office/word/2010/wordprocessingInk" xmlns:wne="http://schemas.microsoft.com/office/word/2006/wordml" xmlns:wps="http://schemas.microsoft.com/office/word/2010/wordprocessingShape" mc:Ignorable="w14 w15 w16se w16cid w16 w16cex w16sdtdh wp14">
+<w:numbering xmlns:wpc="http://schemas.microsoft.com/office/word/2010/wordprocessingCanvas" xmlns:cx="http://schemas.microsoft.com/office/drawing/2014/chartex" xmlns:cx1="http://schemas.microsoft.com/office/drawing/2015/9/8/chartex" xmlns:cx2="http://schemas.microsoft.com/office/drawing/2015/10/21/chartex" xmlns:cx3="http://schemas.microsoft.com/office/drawing/2016/5/9/chartex" xmlns:cx4="http://schemas.microsoft.com/office/drawing/2016/5/10/chartex" xmlns:cx5="http://schemas.microsoft.com/office/drawing/2016/5/11/chartex" xmlns:cx6="http://schemas.microsoft.com/office/drawing/2016/5/12/chartex" xmlns:cx7="http://schemas.microsoft.com/office/drawing/2016/5/13/chartex" xmlns:cx8="http://schemas.microsoft.com/office/drawing/2016/5/14/chartex" xmlns:mc="http://schemas.openxmlformats.org/markup-compatibility/2006" xmlns:aink="http://schemas.microsoft.com/office/drawing/2016/ink" xmlns:am3d="http://schemas.microsoft.com/office/drawing/2017/model3d" xmlns:o="urn:schemas-microsoft-com:office:office" xmlns:oel="http://schemas.microsoft.com/office/2019/extlst" xmlns:r="http://schemas.openxmlformats.org/officeDocument/2006/relationships" xmlns:m="http://schemas.openxmlformats.org/officeDocument/2006/math" xmlns:v="urn:schemas-microsoft-com:vml" xmlns:wp14="http://schemas.microsoft.com/office/word/2010/wordprocessingDrawing" xmlns:wp="http://schemas.openxmlformats.org/drawingml/2006/wordprocessingDrawing" xmlns:w10="urn:schemas-microsoft-com:office:word" xmlns:w="http://schemas.openxmlformats.org/wordprocessingml/2006/main" xmlns:w14="http://schemas.microsoft.com/office/word/2010/wordml" xmlns:w15="http://schemas.microsoft.com/office/word/2012/wordml" xmlns:w16cex="http://schemas.microsoft.com/office/word/2018/wordml/cex" xmlns:w16cid="http://schemas.microsoft.com/office/word/2016/wordml/cid" xmlns:w16="http://schemas.microsoft.com/office/word/2018/wordml" xmlns:w16du="http://schemas.microsoft.com/office/word/2023/wordml/word16du" xmlns:w16sdtdh="http://schemas.microsoft.com/office/word/2020/wordml/sdtdatahash" xmlns:w16se="http://schemas.microsoft.com/office/word/2015/wordml/symex" xmlns:wpg="http://schemas.microsoft.com/office/word/2010/wordprocessingGroup" xmlns:wpi="http://schemas.microsoft.com/office/word/2010/wordprocessingInk" xmlns:wne="http://schemas.microsoft.com/office/word/2006/wordml" xmlns:wps="http://schemas.microsoft.com/office/word/2010/wordprocessingShape" mc:Ignorable="w14 w15 w16se w16cid w16 w16cex w16sdtdh w16du wp14">
   <w:abstractNum w:abstractNumId="0" w15:restartNumberingAfterBreak="0">
     <w:nsid w:val="3A7D200A"/>
     <w:multiLevelType w:val="hybridMultilevel"/>
@@ -3953,7 +3874,7 @@
 </file>
 
 <file path=word/styles.xml><?xml version="1.0" encoding="utf-8"?>
-<w:styles xmlns:mc="http://schemas.openxmlformats.org/markup-compatibility/2006" xmlns:r="http://schemas.openxmlformats.org/officeDocument/2006/relationships" xmlns:w="http://schemas.openxmlformats.org/wordprocessingml/2006/main" xmlns:w14="http://schemas.microsoft.com/office/word/2010/wordml" xmlns:w15="http://schemas.microsoft.com/office/word/2012/wordml" xmlns:w16cex="http://schemas.microsoft.com/office/word/2018/wordml/cex" xmlns:w16cid="http://schemas.microsoft.com/office/word/2016/wordml/cid" xmlns:w16="http://schemas.microsoft.com/office/word/2018/wordml" xmlns:w16sdtdh="http://schemas.microsoft.com/office/word/2020/wordml/sdtdatahash" xmlns:w16se="http://schemas.microsoft.com/office/word/2015/wordml/symex" mc:Ignorable="w14 w15 w16se w16cid w16 w16cex w16sdtdh">
+<w:styles xmlns:mc="http://schemas.openxmlformats.org/markup-compatibility/2006" xmlns:r="http://schemas.openxmlformats.org/officeDocument/2006/relationships" xmlns:w="http://schemas.openxmlformats.org/wordprocessingml/2006/main" xmlns:w14="http://schemas.microsoft.com/office/word/2010/wordml" xmlns:w15="http://schemas.microsoft.com/office/word/2012/wordml" xmlns:w16cex="http://schemas.microsoft.com/office/word/2018/wordml/cex" xmlns:w16cid="http://schemas.microsoft.com/office/word/2016/wordml/cid" xmlns:w16="http://schemas.microsoft.com/office/word/2018/wordml" xmlns:w16du="http://schemas.microsoft.com/office/word/2023/wordml/word16du" xmlns:w16sdtdh="http://schemas.microsoft.com/office/word/2020/wordml/sdtdatahash" xmlns:w16se="http://schemas.microsoft.com/office/word/2015/wordml/symex" mc:Ignorable="w14 w15 w16se w16cid w16 w16cex w16sdtdh w16du">
   <w:docDefaults>
     <w:rPrDefault>
       <w:rPr>

</xml_diff>

<commit_message>
IMSO mandatory criteria updates
</commit_message>
<xml_diff>
--- a/Portal/src/Datahub.Portal/Controllers/OpenDataApprovalForm.docx
+++ b/Portal/src/Datahub.Portal/Controllers/OpenDataApprovalForm.docx
@@ -201,9 +201,11 @@
             <w:shd w:val="clear" w:color="auto" w:fill="DBE5F1" w:themeFill="accent1" w:themeFillTint="33"/>
           </w:tcPr>
           <w:p>
+            <w:proofErr w:type="spellStart"/>
             <w:r>
               <w:t>TEMPLATE_Department</w:t>
             </w:r>
+            <w:proofErr w:type="spellEnd"/>
           </w:p>
         </w:tc>
         <w:tc>
@@ -216,9 +218,11 @@
             <w:shd w:val="clear" w:color="auto" w:fill="DBE5F1" w:themeFill="accent1" w:themeFillTint="33"/>
           </w:tcPr>
           <w:p>
+            <w:proofErr w:type="spellStart"/>
             <w:r>
               <w:t>TEMPLATE_Sector</w:t>
             </w:r>
+            <w:proofErr w:type="spellEnd"/>
           </w:p>
         </w:tc>
       </w:tr>
@@ -287,9 +291,11 @@
             <w:shd w:val="clear" w:color="auto" w:fill="DBE5F1" w:themeFill="accent1" w:themeFillTint="33"/>
           </w:tcPr>
           <w:p>
+            <w:proofErr w:type="spellStart"/>
             <w:r>
               <w:t>TEMPLATE_Branch</w:t>
             </w:r>
+            <w:proofErr w:type="spellEnd"/>
           </w:p>
         </w:tc>
         <w:tc>
@@ -303,9 +309,11 @@
             <w:shd w:val="clear" w:color="auto" w:fill="DBE5F1" w:themeFill="accent1" w:themeFillTint="33"/>
           </w:tcPr>
           <w:p>
+            <w:proofErr w:type="spellStart"/>
             <w:r>
               <w:t>TEMPLATE_Division</w:t>
             </w:r>
+            <w:proofErr w:type="spellEnd"/>
           </w:p>
         </w:tc>
         <w:tc>
@@ -319,9 +327,11 @@
             <w:shd w:val="clear" w:color="auto" w:fill="DBE5F1" w:themeFill="accent1" w:themeFillTint="33"/>
           </w:tcPr>
           <w:p>
+            <w:proofErr w:type="spellStart"/>
             <w:r>
               <w:t>TEMPLATE_Section</w:t>
             </w:r>
+            <w:proofErr w:type="spellEnd"/>
           </w:p>
         </w:tc>
       </w:tr>
@@ -355,9 +365,11 @@
             <w:shd w:val="clear" w:color="auto" w:fill="DBE5F1" w:themeFill="accent1" w:themeFillTint="33"/>
           </w:tcPr>
           <w:p>
+            <w:proofErr w:type="spellStart"/>
             <w:r>
               <w:t>TEMPLATE_Name</w:t>
             </w:r>
+            <w:proofErr w:type="spellEnd"/>
           </w:p>
         </w:tc>
       </w:tr>
@@ -402,9 +414,11 @@
             <w:shd w:val="clear" w:color="auto" w:fill="DBE5F1" w:themeFill="accent1" w:themeFillTint="33"/>
           </w:tcPr>
           <w:p>
+            <w:proofErr w:type="spellStart"/>
             <w:r>
               <w:t>TEMPLATE_Phone</w:t>
             </w:r>
+            <w:proofErr w:type="spellEnd"/>
           </w:p>
         </w:tc>
         <w:tc>
@@ -417,9 +431,11 @@
             <w:shd w:val="clear" w:color="auto" w:fill="DBE5F1" w:themeFill="accent1" w:themeFillTint="33"/>
           </w:tcPr>
           <w:p>
+            <w:proofErr w:type="spellStart"/>
             <w:r>
               <w:t>TEMPLATE_Email</w:t>
             </w:r>
+            <w:proofErr w:type="spellEnd"/>
           </w:p>
         </w:tc>
       </w:tr>
@@ -527,9 +543,11 @@
             <w:shd w:val="clear" w:color="auto" w:fill="DBE5F1" w:themeFill="accent1" w:themeFillTint="33"/>
           </w:tcPr>
           <w:p>
+            <w:proofErr w:type="spellStart"/>
             <w:r>
               <w:t>TEMPLATE_Title</w:t>
             </w:r>
+            <w:proofErr w:type="spellEnd"/>
           </w:p>
         </w:tc>
         <w:tc>
@@ -546,9 +564,11 @@
             <w:pPr>
               <w:jc w:val="center"/>
             </w:pPr>
+            <w:proofErr w:type="spellStart"/>
             <w:r>
               <w:t>TEMPLATE_Data</w:t>
             </w:r>
+            <w:proofErr w:type="spellEnd"/>
           </w:p>
         </w:tc>
         <w:tc>
@@ -565,9 +585,11 @@
             <w:pPr>
               <w:jc w:val="center"/>
             </w:pPr>
+            <w:proofErr w:type="spellStart"/>
             <w:r>
               <w:t>TEMPLATE_Info</w:t>
             </w:r>
+            <w:proofErr w:type="spellEnd"/>
           </w:p>
         </w:tc>
       </w:tr>
@@ -587,7 +609,7 @@
       <w:tr>
         <w:tc>
           <w:tcPr>
-            <w:tcW w:w="9576" w:type="dxa"/>
+            <w:tcW w:w="0" w:type="auto"/>
             <w:gridSpan w:val="3"/>
             <w:shd w:val="clear" w:color="auto" w:fill="BFBFBF" w:themeFill="background1" w:themeFillShade="BF"/>
             <w:vAlign w:val="center"/>
@@ -630,7 +652,7 @@
         </w:tblPrEx>
         <w:tc>
           <w:tcPr>
-            <w:tcW w:w="7688" w:type="dxa"/>
+            <w:tcW w:w="0" w:type="auto"/>
             <w:shd w:val="clear" w:color="auto" w:fill="D9D9D9" w:themeFill="background1" w:themeFillShade="D9"/>
             <w:vAlign w:val="center"/>
           </w:tcPr>
@@ -644,19 +666,13 @@
               <w:rPr>
                 <w:b/>
               </w:rPr>
-              <w:t xml:space="preserve">Legal </w:t>
-            </w:r>
-            <w:r>
-              <w:rPr>
-                <w:b/>
-              </w:rPr>
-              <w:t>/ Licensing / Copyright</w:t>
-            </w:r>
-          </w:p>
-        </w:tc>
-        <w:tc>
-          <w:tcPr>
-            <w:tcW w:w="946" w:type="dxa"/>
+              <w:t>Confidentiality</w:t>
+            </w:r>
+          </w:p>
+        </w:tc>
+        <w:tc>
+          <w:tcPr>
+            <w:tcW w:w="0" w:type="auto"/>
             <w:shd w:val="clear" w:color="auto" w:fill="D9D9D9" w:themeFill="background1" w:themeFillShade="D9"/>
             <w:vAlign w:val="center"/>
           </w:tcPr>
@@ -677,7 +693,7 @@
         </w:tc>
         <w:tc>
           <w:tcPr>
-            <w:tcW w:w="942" w:type="dxa"/>
+            <w:tcW w:w="0" w:type="auto"/>
             <w:shd w:val="clear" w:color="auto" w:fill="D9D9D9" w:themeFill="background1" w:themeFillShade="D9"/>
             <w:vAlign w:val="center"/>
           </w:tcPr>
@@ -703,149 +719,60 @@
         </w:trPr>
         <w:tc>
           <w:tcPr>
-            <w:tcW w:w="7688" w:type="dxa"/>
-            <w:vAlign w:val="center"/>
-          </w:tcPr>
-          <w:p>
-            <w:pPr>
-              <w:pStyle w:val="ListParagraph"/>
-              <w:numPr>
-                <w:ilvl w:val="0"/>
-                <w:numId w:val="3"/>
-              </w:numPr>
-              <w:rPr>
-                <w:rFonts w:cs="Arial"/>
-              </w:rPr>
-            </w:pPr>
-            <w:r>
-              <w:rPr>
-                <w:rFonts w:cs="Arial"/>
-              </w:rPr>
-              <w:t>T</w:t>
-            </w:r>
-            <w:r>
-              <w:rPr>
-                <w:rFonts w:cs="Arial"/>
-              </w:rPr>
-              <w:t xml:space="preserve">here are no </w:t>
-            </w:r>
-            <w:r>
-              <w:rPr>
-                <w:rFonts w:cs="Arial"/>
-              </w:rPr>
-              <w:t xml:space="preserve">known </w:t>
-            </w:r>
-            <w:r>
-              <w:rPr>
-                <w:rFonts w:cs="Arial"/>
-              </w:rPr>
-              <w:t xml:space="preserve">legal, </w:t>
-            </w:r>
-            <w:r>
-              <w:rPr>
-                <w:rFonts w:cs="Arial"/>
-              </w:rPr>
-              <w:t xml:space="preserve">licensing, </w:t>
-            </w:r>
-            <w:r>
-              <w:rPr>
-                <w:rFonts w:cs="Arial"/>
-              </w:rPr>
-              <w:t>or copyright</w:t>
-            </w:r>
-            <w:r>
-              <w:rPr>
-                <w:rFonts w:cs="Arial"/>
-              </w:rPr>
-              <w:t xml:space="preserve"> restrictions </w:t>
-            </w:r>
-            <w:r>
-              <w:rPr>
-                <w:rFonts w:cs="Arial"/>
-              </w:rPr>
-              <w:t xml:space="preserve">to prevent the data or information </w:t>
-            </w:r>
-            <w:r>
-              <w:rPr>
-                <w:rFonts w:cs="Arial"/>
-              </w:rPr>
-              <w:t xml:space="preserve">from </w:t>
-            </w:r>
-            <w:r>
-              <w:rPr>
-                <w:rFonts w:cs="Arial"/>
-              </w:rPr>
-              <w:t>being released</w:t>
-            </w:r>
-            <w:r>
-              <w:rPr>
-                <w:rFonts w:cs="Arial"/>
-              </w:rPr>
-              <w:t xml:space="preserve"> by the </w:t>
-            </w:r>
-            <w:r>
-              <w:rPr>
-                <w:rFonts w:cs="Arial"/>
-              </w:rPr>
-              <w:t>department or agency</w:t>
-            </w:r>
-            <w:r>
-              <w:rPr>
-                <w:rFonts w:cs="Arial"/>
-              </w:rPr>
-              <w:t xml:space="preserve"> under the terms of the Open Government Licence</w:t>
-            </w:r>
-            <w:r>
-              <w:rPr>
-                <w:rFonts w:cs="Arial"/>
-              </w:rPr>
-              <w:t xml:space="preserve"> – Canada</w:t>
-            </w:r>
-            <w:r>
-              <w:rPr>
-                <w:rFonts w:cs="Arial"/>
-              </w:rPr>
-              <w:t>.</w:t>
-            </w:r>
-          </w:p>
-        </w:tc>
-        <w:tc>
-          <w:tcPr>
-            <w:tcW w:w="946" w:type="dxa"/>
-            <w:vAlign w:val="center"/>
-          </w:tcPr>
-          <w:p>
-            <w:pPr>
-              <w:jc w:val="center"/>
-              <w:rPr>
-                <w:rFonts w:cs="Arial"/>
-              </w:rPr>
-            </w:pPr>
-            <w:r>
-              <w:rPr>
-                <w:rFonts w:cs="Arial"/>
-              </w:rPr>
-              <w:t>TEMPLATE_Legal1</w:t>
-            </w:r>
-          </w:p>
-        </w:tc>
-        <w:tc>
-          <w:tcPr>
-            <w:tcW w:w="942" w:type="dxa"/>
-            <w:vAlign w:val="center"/>
-          </w:tcPr>
-          <w:p>
-            <w:pPr>
-              <w:jc w:val="center"/>
-              <w:rPr>
-                <w:rFonts w:cs="Arial"/>
-              </w:rPr>
-            </w:pPr>
-            <w:r>
-              <w:rPr>
-                <w:rFonts w:cs="Arial"/>
-              </w:rPr>
-              <w:t>TEMPLATE_Legal2</w:t>
+            <w:tcW w:w="0" w:type="auto"/>
+            <w:vAlign w:val="center"/>
+          </w:tcPr>
+          <w:p>
+            <w:pPr>
+              <w:rPr>
+                <w:rFonts w:cs="Arial"/>
+              </w:rPr>
+            </w:pPr>
+            <w:r>
+              <w:rPr>
+                <w:rFonts w:cs="Arial"/>
+              </w:rPr>
+              <w:t>The data or information resource is not subject to confidentiality restrictions, such as Cabinet confidences, solicitor-client privilege, classified or protected information, advice or recommendations, third party information, or information obtained in confidence.</w:t>
+            </w:r>
+          </w:p>
+        </w:tc>
+        <w:tc>
+          <w:tcPr>
+            <w:tcW w:w="0" w:type="auto"/>
+            <w:vAlign w:val="center"/>
+          </w:tcPr>
+          <w:p>
+            <w:pPr>
+              <w:jc w:val="center"/>
+              <w:rPr>
+                <w:rFonts w:cs="Arial"/>
+              </w:rPr>
+            </w:pPr>
+            <w:r>
+              <w:rPr>
+                <w:rFonts w:cs="Arial"/>
+              </w:rPr>
+              <w:t>TEMPLATE_Conf1</w:t>
+            </w:r>
+          </w:p>
+        </w:tc>
+        <w:tc>
+          <w:tcPr>
+            <w:tcW w:w="0" w:type="auto"/>
+            <w:vAlign w:val="center"/>
+          </w:tcPr>
+          <w:p>
+            <w:pPr>
+              <w:jc w:val="center"/>
+              <w:rPr>
+                <w:rFonts w:cs="Arial"/>
+              </w:rPr>
+            </w:pPr>
+            <w:r>
+              <w:rPr>
+                <w:rFonts w:cs="Arial"/>
+              </w:rPr>
+              <w:t>TEMPLATE_Conf2</w:t>
             </w:r>
           </w:p>
         </w:tc>
@@ -856,7 +783,7 @@
         </w:tblPrEx>
         <w:tc>
           <w:tcPr>
-            <w:tcW w:w="7688" w:type="dxa"/>
+            <w:tcW w:w="0" w:type="auto"/>
             <w:shd w:val="clear" w:color="auto" w:fill="D9D9D9" w:themeFill="background1" w:themeFillShade="D9"/>
             <w:vAlign w:val="center"/>
           </w:tcPr>
@@ -870,13 +797,13 @@
               <w:rPr>
                 <w:b/>
               </w:rPr>
-              <w:t>Authority to Release</w:t>
-            </w:r>
-          </w:p>
-        </w:tc>
-        <w:tc>
-          <w:tcPr>
-            <w:tcW w:w="946" w:type="dxa"/>
+              <w:t>Access to Information</w:t>
+            </w:r>
+          </w:p>
+        </w:tc>
+        <w:tc>
+          <w:tcPr>
+            <w:tcW w:w="0" w:type="auto"/>
             <w:shd w:val="clear" w:color="auto" w:fill="D9D9D9" w:themeFill="background1" w:themeFillShade="D9"/>
             <w:vAlign w:val="center"/>
           </w:tcPr>
@@ -897,7 +824,7 @@
         </w:tc>
         <w:tc>
           <w:tcPr>
-            <w:tcW w:w="942" w:type="dxa"/>
+            <w:tcW w:w="0" w:type="auto"/>
             <w:shd w:val="clear" w:color="auto" w:fill="D9D9D9" w:themeFill="background1" w:themeFillShade="D9"/>
             <w:vAlign w:val="center"/>
           </w:tcPr>
@@ -920,71 +847,60 @@
       <w:tr>
         <w:tc>
           <w:tcPr>
-            <w:tcW w:w="7688" w:type="dxa"/>
-            <w:vAlign w:val="center"/>
-          </w:tcPr>
-          <w:p>
-            <w:pPr>
-              <w:pStyle w:val="ListParagraph"/>
-              <w:numPr>
-                <w:ilvl w:val="0"/>
-                <w:numId w:val="3"/>
-              </w:numPr>
-              <w:rPr>
-                <w:rFonts w:cs="Arial"/>
-              </w:rPr>
-            </w:pPr>
-            <w:r>
-              <w:rPr>
-                <w:rFonts w:cs="Arial"/>
-              </w:rPr>
-              <w:t xml:space="preserve">The department or agency </w:t>
-            </w:r>
-            <w:r>
-              <w:rPr>
-                <w:rFonts w:cs="Arial"/>
-              </w:rPr>
-              <w:t>has the departmental mandate, legislative authority or permission from a third party provider to publish the data or information resource under the Open Government Licence – Canada.</w:t>
-            </w:r>
-          </w:p>
-        </w:tc>
-        <w:tc>
-          <w:tcPr>
-            <w:tcW w:w="946" w:type="dxa"/>
-            <w:vAlign w:val="center"/>
-          </w:tcPr>
-          <w:p>
-            <w:pPr>
-              <w:jc w:val="center"/>
-              <w:rPr>
-                <w:rFonts w:cs="Arial"/>
-              </w:rPr>
-            </w:pPr>
-            <w:r>
-              <w:rPr>
-                <w:rFonts w:cs="Arial"/>
-              </w:rPr>
-              <w:t>TEMPLATE_Auth1</w:t>
-            </w:r>
-          </w:p>
-        </w:tc>
-        <w:tc>
-          <w:tcPr>
-            <w:tcW w:w="942" w:type="dxa"/>
-            <w:vAlign w:val="center"/>
-          </w:tcPr>
-          <w:p>
-            <w:pPr>
-              <w:jc w:val="center"/>
-              <w:rPr>
-                <w:rFonts w:cs="Arial"/>
-              </w:rPr>
-            </w:pPr>
-            <w:r>
-              <w:rPr>
-                <w:rFonts w:cs="Arial"/>
-              </w:rPr>
-              <w:t>TEMPLATE_Auth2</w:t>
+            <w:tcW w:w="0" w:type="auto"/>
+            <w:vAlign w:val="center"/>
+          </w:tcPr>
+          <w:p>
+            <w:pPr>
+              <w:rPr>
+                <w:rFonts w:cs="Arial"/>
+              </w:rPr>
+            </w:pPr>
+            <w:r>
+              <w:rPr>
+                <w:rFonts w:cs="Arial"/>
+              </w:rPr>
+              <w:t>The data or information resource is not subject to any exemptions or exclusions under the Access to Information Act, or redactions under appropriate sections of the Act have been applied in consultation with the Access to Information and Privacy (ATIP) Directorate.</w:t>
+            </w:r>
+          </w:p>
+        </w:tc>
+        <w:tc>
+          <w:tcPr>
+            <w:tcW w:w="0" w:type="auto"/>
+            <w:vAlign w:val="center"/>
+          </w:tcPr>
+          <w:p>
+            <w:pPr>
+              <w:jc w:val="center"/>
+              <w:rPr>
+                <w:rFonts w:cs="Arial"/>
+              </w:rPr>
+            </w:pPr>
+            <w:r>
+              <w:rPr>
+                <w:rFonts w:cs="Arial"/>
+              </w:rPr>
+              <w:t>TEMPLATE_Access1</w:t>
+            </w:r>
+          </w:p>
+        </w:tc>
+        <w:tc>
+          <w:tcPr>
+            <w:tcW w:w="0" w:type="auto"/>
+            <w:vAlign w:val="center"/>
+          </w:tcPr>
+          <w:p>
+            <w:pPr>
+              <w:jc w:val="center"/>
+              <w:rPr>
+                <w:rFonts w:cs="Arial"/>
+              </w:rPr>
+            </w:pPr>
+            <w:r>
+              <w:rPr>
+                <w:rFonts w:cs="Arial"/>
+              </w:rPr>
+              <w:t>TEMPLATE_Access2</w:t>
             </w:r>
           </w:p>
         </w:tc>
@@ -992,185 +908,198 @@
       <w:tr>
         <w:tc>
           <w:tcPr>
-            <w:tcW w:w="7688" w:type="dxa"/>
-            <w:shd w:val="clear" w:color="auto" w:fill="D9D9D9" w:themeFill="background1" w:themeFillShade="D9"/>
-            <w:vAlign w:val="center"/>
-          </w:tcPr>
-          <w:p>
-            <w:pPr>
-              <w:rPr>
-                <w:rFonts w:cs="Arial"/>
-              </w:rPr>
-            </w:pPr>
-            <w:r>
-              <w:rPr>
-                <w:b/>
-              </w:rPr>
-              <w:t>Privacy</w:t>
-            </w:r>
-          </w:p>
-        </w:tc>
-        <w:tc>
-          <w:tcPr>
-            <w:tcW w:w="946" w:type="dxa"/>
-            <w:shd w:val="clear" w:color="auto" w:fill="D9D9D9" w:themeFill="background1" w:themeFillShade="D9"/>
-            <w:vAlign w:val="center"/>
-          </w:tcPr>
-          <w:p>
-            <w:pPr>
-              <w:jc w:val="center"/>
-              <w:rPr>
-                <w:rFonts w:cs="Arial"/>
-              </w:rPr>
-            </w:pPr>
-            <w:r>
-              <w:rPr>
-                <w:b/>
-              </w:rPr>
-              <w:t>True</w:t>
-            </w:r>
-          </w:p>
-        </w:tc>
-        <w:tc>
-          <w:tcPr>
-            <w:tcW w:w="942" w:type="dxa"/>
-            <w:shd w:val="clear" w:color="auto" w:fill="D9D9D9" w:themeFill="background1" w:themeFillShade="D9"/>
-            <w:vAlign w:val="center"/>
-          </w:tcPr>
-          <w:p>
-            <w:pPr>
-              <w:jc w:val="center"/>
-              <w:rPr>
-                <w:rFonts w:cs="Arial"/>
-              </w:rPr>
-            </w:pPr>
-            <w:r>
-              <w:rPr>
-                <w:b/>
-              </w:rPr>
-              <w:t>False</w:t>
-            </w:r>
+            <w:tcW w:w="0" w:type="auto"/>
+            <w:vAlign w:val="center"/>
+          </w:tcPr>
+          <w:p>
+            <w:pPr>
+              <w:rPr>
+                <w:rFonts w:cs="Arial"/>
+              </w:rPr>
+            </w:pPr>
+            <w:r>
+              <w:rPr>
+                <w:rFonts w:cs="Arial"/>
+                <w:i/>
+                <w:iCs/>
+              </w:rPr>
+              <w:t xml:space="preserve">If you are unsure whether the data or information is subject to any exemptions under the Access to Information Act and/or free of personal information in compliance with the Privacy Act, please contact the Access to </w:t>
+            </w:r>
+            <w:r>
+              <w:rPr>
+                <w:rFonts w:cs="Arial"/>
+                <w:i/>
+                <w:iCs/>
+              </w:rPr>
+              <w:lastRenderedPageBreak/>
+              <w:t>Information and Privacy (ATIP) Directorate within your department.</w:t>
+            </w:r>
+          </w:p>
+        </w:tc>
+        <w:tc>
+          <w:tcPr>
+            <w:tcW w:w="0" w:type="auto"/>
+            <w:vAlign w:val="center"/>
+          </w:tcPr>
+          <w:p>
+            <w:pPr>
+              <w:jc w:val="center"/>
+              <w:rPr>
+                <w:rFonts w:cs="Arial"/>
+              </w:rPr>
+            </w:pPr>
+          </w:p>
+        </w:tc>
+        <w:tc>
+          <w:tcPr>
+            <w:tcW w:w="0" w:type="auto"/>
+            <w:vAlign w:val="center"/>
+          </w:tcPr>
+          <w:p>
+            <w:pPr>
+              <w:jc w:val="center"/>
+              <w:rPr>
+                <w:rFonts w:cs="Arial"/>
+              </w:rPr>
+            </w:pPr>
           </w:p>
         </w:tc>
       </w:tr>
       <w:tr>
         <w:tc>
           <w:tcPr>
-            <w:tcW w:w="7688" w:type="dxa"/>
-            <w:vAlign w:val="center"/>
-          </w:tcPr>
-          <w:p>
-            <w:pPr>
-              <w:pStyle w:val="ListParagraph"/>
-              <w:numPr>
-                <w:ilvl w:val="0"/>
-                <w:numId w:val="3"/>
-              </w:numPr>
-              <w:rPr>
-                <w:rFonts w:cs="Arial"/>
-              </w:rPr>
-            </w:pPr>
-            <w:r>
-              <w:rPr>
-                <w:rFonts w:cs="Arial"/>
-              </w:rPr>
-              <w:t xml:space="preserve">The data or information resource </w:t>
-            </w:r>
-            <w:r>
-              <w:rPr>
-                <w:rFonts w:cs="Arial"/>
-              </w:rPr>
-              <w:t>does not contain any personal information</w:t>
-            </w:r>
-            <w:r>
-              <w:rPr>
-                <w:rFonts w:cs="Arial"/>
-              </w:rPr>
-              <w:t xml:space="preserve"> </w:t>
-            </w:r>
-            <w:r>
-              <w:rPr>
-                <w:rFonts w:cs="Arial"/>
-              </w:rPr>
-              <w:t xml:space="preserve">as defined in </w:t>
-            </w:r>
-            <w:r>
-              <w:rPr>
-                <w:rStyle w:val="margin-left-xlarge"/>
-                <w:rFonts w:cs="Helvetica"/>
-                <w:lang w:val="en"/>
-              </w:rPr>
-              <w:t xml:space="preserve">section 3 of the </w:t>
-            </w:r>
-            <w:r>
-              <w:rPr>
-                <w:rStyle w:val="Emphasis"/>
-                <w:rFonts w:cs="Helvetica"/>
-                <w:lang w:val="en"/>
-              </w:rPr>
-              <w:t>Privacy Act</w:t>
-            </w:r>
-            <w:r>
-              <w:rPr>
-                <w:rStyle w:val="margin-left-xlarge"/>
-                <w:rFonts w:cs="Helvetica"/>
-                <w:lang w:val="en"/>
-              </w:rPr>
-              <w:t xml:space="preserve">, R.S.C. 1985, c. P-21 </w:t>
-            </w:r>
-            <w:r>
-              <w:rPr>
-                <w:rFonts w:ascii="AvantGarde Bk BT" w:hAnsi="AvantGarde Bk BT"/>
-                <w:b/>
-                <w:bCs/>
-              </w:rPr>
-              <w:t>as confirmed by the ATIP Secretariat</w:t>
-            </w:r>
-            <w:r>
-              <w:rPr>
-                <w:rFonts w:ascii="AvantGarde Bk BT" w:hAnsi="AvantGarde Bk BT"/>
-              </w:rPr>
-              <w:t>.</w:t>
-            </w:r>
-          </w:p>
-        </w:tc>
-        <w:tc>
-          <w:tcPr>
-            <w:tcW w:w="946" w:type="dxa"/>
-            <w:vAlign w:val="center"/>
-          </w:tcPr>
-          <w:p>
-            <w:pPr>
-              <w:jc w:val="center"/>
-              <w:rPr>
-                <w:rFonts w:cs="Arial"/>
-              </w:rPr>
-            </w:pPr>
-            <w:r>
-              <w:rPr>
-                <w:rFonts w:cs="Arial"/>
-              </w:rPr>
-              <w:t>TEMPLATE_Privacy1</w:t>
-            </w:r>
-          </w:p>
-        </w:tc>
-        <w:tc>
-          <w:tcPr>
-            <w:tcW w:w="942" w:type="dxa"/>
-            <w:vAlign w:val="center"/>
-          </w:tcPr>
-          <w:p>
-            <w:pPr>
-              <w:jc w:val="center"/>
-              <w:rPr>
-                <w:rFonts w:cs="Arial"/>
-              </w:rPr>
-            </w:pPr>
-            <w:r>
-              <w:rPr>
-                <w:rFonts w:cs="Arial"/>
-              </w:rPr>
-              <w:t>TEMPLATE_Privacy2</w:t>
+            <w:tcW w:w="0" w:type="auto"/>
+            <w:shd w:val="clear" w:color="auto" w:fill="D9D9D9" w:themeFill="background1" w:themeFillShade="D9"/>
+            <w:vAlign w:val="center"/>
+          </w:tcPr>
+          <w:p>
+            <w:pPr>
+              <w:rPr>
+                <w:rFonts w:cs="Arial"/>
+              </w:rPr>
+            </w:pPr>
+            <w:r>
+              <w:rPr>
+                <w:b/>
+              </w:rPr>
+              <w:t>Authority to Release</w:t>
+            </w:r>
+          </w:p>
+        </w:tc>
+        <w:tc>
+          <w:tcPr>
+            <w:tcW w:w="0" w:type="auto"/>
+            <w:shd w:val="clear" w:color="auto" w:fill="D9D9D9" w:themeFill="background1" w:themeFillShade="D9"/>
+            <w:vAlign w:val="center"/>
+          </w:tcPr>
+          <w:p>
+            <w:pPr>
+              <w:jc w:val="center"/>
+              <w:rPr>
+                <w:rFonts w:cs="Arial"/>
+              </w:rPr>
+            </w:pPr>
+            <w:r>
+              <w:rPr>
+                <w:b/>
+              </w:rPr>
+              <w:t>True</w:t>
+            </w:r>
+          </w:p>
+        </w:tc>
+        <w:tc>
+          <w:tcPr>
+            <w:tcW w:w="0" w:type="auto"/>
+            <w:shd w:val="clear" w:color="auto" w:fill="D9D9D9" w:themeFill="background1" w:themeFillShade="D9"/>
+            <w:vAlign w:val="center"/>
+          </w:tcPr>
+          <w:p>
+            <w:pPr>
+              <w:jc w:val="center"/>
+              <w:rPr>
+                <w:rFonts w:cs="Arial"/>
+              </w:rPr>
+            </w:pPr>
+            <w:r>
+              <w:rPr>
+                <w:b/>
+              </w:rPr>
+              <w:t>False</w:t>
+            </w:r>
+          </w:p>
+        </w:tc>
+      </w:tr>
+      <w:tr>
+        <w:tc>
+          <w:tcPr>
+            <w:tcW w:w="0" w:type="auto"/>
+            <w:vAlign w:val="center"/>
+          </w:tcPr>
+          <w:p>
+            <w:pPr>
+              <w:rPr>
+                <w:rFonts w:cs="Arial"/>
+              </w:rPr>
+            </w:pPr>
+            <w:r>
+              <w:rPr>
+                <w:rFonts w:cs="Arial"/>
+              </w:rPr>
+              <w:t xml:space="preserve">The institution has the mandate, legislative authority or permission from a </w:t>
+            </w:r>
+            <w:proofErr w:type="gramStart"/>
+            <w:r>
+              <w:rPr>
+                <w:rFonts w:cs="Arial"/>
+              </w:rPr>
+              <w:t>third party</w:t>
+            </w:r>
+            <w:proofErr w:type="gramEnd"/>
+            <w:r>
+              <w:rPr>
+                <w:rFonts w:cs="Arial"/>
+              </w:rPr>
+              <w:t xml:space="preserve"> provider to publish the data or information resource under the Open Government Licence - Canada.</w:t>
+            </w:r>
+          </w:p>
+        </w:tc>
+        <w:tc>
+          <w:tcPr>
+            <w:tcW w:w="0" w:type="auto"/>
+            <w:vAlign w:val="center"/>
+          </w:tcPr>
+          <w:p>
+            <w:pPr>
+              <w:jc w:val="center"/>
+              <w:rPr>
+                <w:rFonts w:cs="Arial"/>
+              </w:rPr>
+            </w:pPr>
+            <w:r>
+              <w:rPr>
+                <w:rFonts w:cs="Arial"/>
+              </w:rPr>
+              <w:t>TEMPLATE_Auth1</w:t>
+            </w:r>
+          </w:p>
+        </w:tc>
+        <w:tc>
+          <w:tcPr>
+            <w:tcW w:w="0" w:type="auto"/>
+            <w:vAlign w:val="center"/>
+          </w:tcPr>
+          <w:p>
+            <w:pPr>
+              <w:jc w:val="center"/>
+              <w:rPr>
+                <w:rFonts w:cs="Arial"/>
+              </w:rPr>
+            </w:pPr>
+            <w:r>
+              <w:rPr>
+                <w:rFonts w:cs="Arial"/>
+              </w:rPr>
+              <w:t>TEMPLATE_Auth2</w:t>
             </w:r>
           </w:p>
         </w:tc>
@@ -1181,7 +1110,7 @@
         </w:tblPrEx>
         <w:tc>
           <w:tcPr>
-            <w:tcW w:w="7688" w:type="dxa"/>
+            <w:tcW w:w="0" w:type="auto"/>
             <w:shd w:val="clear" w:color="auto" w:fill="D9D9D9" w:themeFill="background1" w:themeFillShade="D9"/>
             <w:vAlign w:val="center"/>
           </w:tcPr>
@@ -1195,14 +1124,13 @@
               <w:rPr>
                 <w:b/>
               </w:rPr>
-              <w:lastRenderedPageBreak/>
-              <w:t>Access to Information</w:t>
-            </w:r>
-          </w:p>
-        </w:tc>
-        <w:tc>
-          <w:tcPr>
-            <w:tcW w:w="946" w:type="dxa"/>
+              <w:t>Privacy</w:t>
+            </w:r>
+          </w:p>
+        </w:tc>
+        <w:tc>
+          <w:tcPr>
+            <w:tcW w:w="0" w:type="auto"/>
             <w:shd w:val="clear" w:color="auto" w:fill="D9D9D9" w:themeFill="background1" w:themeFillShade="D9"/>
             <w:vAlign w:val="center"/>
           </w:tcPr>
@@ -1223,7 +1151,7 @@
         </w:tc>
         <w:tc>
           <w:tcPr>
-            <w:tcW w:w="942" w:type="dxa"/>
+            <w:tcW w:w="0" w:type="auto"/>
             <w:shd w:val="clear" w:color="auto" w:fill="D9D9D9" w:themeFill="background1" w:themeFillShade="D9"/>
             <w:vAlign w:val="center"/>
           </w:tcPr>
@@ -1249,16 +1177,11 @@
         </w:trPr>
         <w:tc>
           <w:tcPr>
-            <w:tcW w:w="7688" w:type="dxa"/>
-            <w:vAlign w:val="center"/>
-          </w:tcPr>
-          <w:p>
-            <w:pPr>
-              <w:pStyle w:val="ListParagraph"/>
-              <w:numPr>
-                <w:ilvl w:val="0"/>
-                <w:numId w:val="3"/>
-              </w:numPr>
+            <w:tcW w:w="0" w:type="auto"/>
+            <w:vAlign w:val="center"/>
+          </w:tcPr>
+          <w:p>
+            <w:pPr>
               <w:rPr>
                 <w:rFonts w:ascii="AvantGarde Bk BT" w:hAnsi="AvantGarde Bk BT"/>
               </w:rPr>
@@ -1267,77 +1190,166 @@
               <w:rPr>
                 <w:rFonts w:cs="Arial"/>
               </w:rPr>
-              <w:t xml:space="preserve">The data or information resource is not subject to any exemptions or exclusions under Section 13 “Exemptions” or Section 68 “Exclusions” of the </w:t>
-            </w:r>
+              <w:t>The data or information resource is not subject to any exemptions or exclusions under the Privacy Act, or redactions under appropriate sections of the Act have been applied in consultation with the Access to Information and Privacy (ATIP) Directorate.</w:t>
+            </w:r>
+          </w:p>
+        </w:tc>
+        <w:tc>
+          <w:tcPr>
+            <w:tcW w:w="0" w:type="auto"/>
+            <w:vAlign w:val="center"/>
+          </w:tcPr>
+          <w:p>
+            <w:pPr>
+              <w:jc w:val="center"/>
+              <w:rPr>
+                <w:rFonts w:cs="Arial"/>
+              </w:rPr>
+            </w:pPr>
+            <w:r>
+              <w:rPr>
+                <w:rFonts w:cs="Arial"/>
+              </w:rPr>
+              <w:t>TEMPLATE_PrivacyA1</w:t>
+            </w:r>
+          </w:p>
+        </w:tc>
+        <w:tc>
+          <w:tcPr>
+            <w:tcW w:w="0" w:type="auto"/>
+            <w:vAlign w:val="center"/>
+          </w:tcPr>
+          <w:p>
+            <w:pPr>
+              <w:jc w:val="center"/>
+              <w:rPr>
+                <w:rFonts w:cs="Arial"/>
+              </w:rPr>
+            </w:pPr>
+            <w:r>
+              <w:rPr>
+                <w:rFonts w:cs="Arial"/>
+              </w:rPr>
+              <w:t>TEMPLATE_PrivacyA2</w:t>
+            </w:r>
+          </w:p>
+        </w:tc>
+      </w:tr>
+      <w:tr>
+        <w:trPr>
+          <w:trHeight w:val="1493"/>
+        </w:trPr>
+        <w:tc>
+          <w:tcPr>
+            <w:tcW w:w="0" w:type="auto"/>
+            <w:vAlign w:val="center"/>
+          </w:tcPr>
+          <w:p>
+            <w:pPr>
+              <w:rPr>
+                <w:rFonts w:cs="Arial"/>
+              </w:rPr>
+            </w:pPr>
+            <w:r>
+              <w:rPr>
+                <w:rFonts w:cs="Arial"/>
+              </w:rPr>
+              <w:t>The data or information resource does not contain personal information, as defined in section 3 of the Privacy Act, unless the individual to whom it relates has consented to its release or unless it meets criteria outlined in section 8(2) of the Privacy Act.</w:t>
+            </w:r>
+          </w:p>
+        </w:tc>
+        <w:tc>
+          <w:tcPr>
+            <w:tcW w:w="0" w:type="auto"/>
+            <w:vAlign w:val="center"/>
+          </w:tcPr>
+          <w:p>
+            <w:pPr>
+              <w:jc w:val="center"/>
+              <w:rPr>
+                <w:rFonts w:cs="Arial"/>
+              </w:rPr>
+            </w:pPr>
+            <w:r>
+              <w:rPr>
+                <w:rFonts w:cs="Arial"/>
+              </w:rPr>
+              <w:t>TEMPLATE_PrivacyB1</w:t>
+            </w:r>
+          </w:p>
+        </w:tc>
+        <w:tc>
+          <w:tcPr>
+            <w:tcW w:w="0" w:type="auto"/>
+            <w:vAlign w:val="center"/>
+          </w:tcPr>
+          <w:p>
+            <w:pPr>
+              <w:jc w:val="center"/>
+              <w:rPr>
+                <w:rFonts w:cs="Arial"/>
+              </w:rPr>
+            </w:pPr>
+            <w:r>
+              <w:rPr>
+                <w:rFonts w:cs="Arial"/>
+              </w:rPr>
+              <w:t>TEMPLATE_PrivacyB2</w:t>
+            </w:r>
+          </w:p>
+        </w:tc>
+      </w:tr>
+      <w:tr>
+        <w:trPr>
+          <w:trHeight w:val="1493"/>
+        </w:trPr>
+        <w:tc>
+          <w:tcPr>
+            <w:tcW w:w="0" w:type="auto"/>
+            <w:vAlign w:val="center"/>
+          </w:tcPr>
+          <w:p>
+            <w:pPr>
+              <w:rPr>
+                <w:rFonts w:cs="Arial"/>
+              </w:rPr>
+            </w:pPr>
             <w:r>
               <w:rPr>
                 <w:rFonts w:cs="Arial"/>
                 <w:i/>
-              </w:rPr>
-              <w:t>Access to Information Act</w:t>
-            </w:r>
-            <w:r>
-              <w:rPr>
-                <w:rFonts w:cs="Arial"/>
-              </w:rPr>
-              <w:t xml:space="preserve">, R.S.C 1985 </w:t>
-            </w:r>
-            <w:r>
-              <w:rPr>
-                <w:rFonts w:ascii="AvantGarde Bk BT" w:hAnsi="AvantGarde Bk BT"/>
-                <w:b/>
-                <w:bCs/>
-              </w:rPr>
-              <w:t>as confirmed by the ATIP Secretariat</w:t>
-            </w:r>
-            <w:r>
-              <w:rPr>
-                <w:rFonts w:ascii="AvantGarde Bk BT" w:hAnsi="AvantGarde Bk BT"/>
-                <w:b/>
-                <w:bCs/>
-              </w:rPr>
-              <w:t>.</w:t>
-            </w:r>
-          </w:p>
-        </w:tc>
-        <w:tc>
-          <w:tcPr>
-            <w:tcW w:w="946" w:type="dxa"/>
-            <w:vAlign w:val="center"/>
-          </w:tcPr>
-          <w:p>
-            <w:pPr>
-              <w:jc w:val="center"/>
-              <w:rPr>
-                <w:rFonts w:cs="Arial"/>
-              </w:rPr>
-            </w:pPr>
-            <w:r>
-              <w:rPr>
-                <w:rFonts w:cs="Arial"/>
-              </w:rPr>
-              <w:t>TEMPLATE_Access1</w:t>
-            </w:r>
-          </w:p>
-        </w:tc>
-        <w:tc>
-          <w:tcPr>
-            <w:tcW w:w="942" w:type="dxa"/>
-            <w:vAlign w:val="center"/>
-          </w:tcPr>
-          <w:p>
-            <w:pPr>
-              <w:jc w:val="center"/>
-              <w:rPr>
-                <w:rFonts w:cs="Arial"/>
-              </w:rPr>
-            </w:pPr>
-            <w:r>
-              <w:rPr>
-                <w:rFonts w:cs="Arial"/>
-              </w:rPr>
-              <w:t>TEMPLATE_Access2</w:t>
-            </w:r>
+                <w:iCs/>
+              </w:rPr>
+              <w:t>If you are unsure whether the data or information is subject to any exemptions under the Access to Information Act and/or free of personal information in compliance with the Privacy Act, please contact the Access to Information and Privacy (ATIP) Directorate within your department.</w:t>
+            </w:r>
+          </w:p>
+        </w:tc>
+        <w:tc>
+          <w:tcPr>
+            <w:tcW w:w="0" w:type="auto"/>
+            <w:vAlign w:val="center"/>
+          </w:tcPr>
+          <w:p>
+            <w:pPr>
+              <w:jc w:val="center"/>
+              <w:rPr>
+                <w:rFonts w:cs="Arial"/>
+              </w:rPr>
+            </w:pPr>
+          </w:p>
+        </w:tc>
+        <w:tc>
+          <w:tcPr>
+            <w:tcW w:w="0" w:type="auto"/>
+            <w:vAlign w:val="center"/>
+          </w:tcPr>
+          <w:p>
+            <w:pPr>
+              <w:jc w:val="center"/>
+              <w:rPr>
+                <w:rFonts w:cs="Arial"/>
+              </w:rPr>
+            </w:pPr>
           </w:p>
         </w:tc>
       </w:tr>
@@ -1347,7 +1359,7 @@
         </w:tblPrEx>
         <w:tc>
           <w:tcPr>
-            <w:tcW w:w="7688" w:type="dxa"/>
+            <w:tcW w:w="0" w:type="auto"/>
             <w:shd w:val="clear" w:color="auto" w:fill="D9D9D9" w:themeFill="background1" w:themeFillShade="D9"/>
             <w:vAlign w:val="center"/>
           </w:tcPr>
@@ -1361,13 +1373,13 @@
               <w:rPr>
                 <w:b/>
               </w:rPr>
-              <w:t>Security</w:t>
-            </w:r>
-          </w:p>
-        </w:tc>
-        <w:tc>
-          <w:tcPr>
-            <w:tcW w:w="946" w:type="dxa"/>
+              <w:t>Formats</w:t>
+            </w:r>
+          </w:p>
+        </w:tc>
+        <w:tc>
+          <w:tcPr>
+            <w:tcW w:w="0" w:type="auto"/>
             <w:shd w:val="clear" w:color="auto" w:fill="D9D9D9" w:themeFill="background1" w:themeFillShade="D9"/>
             <w:vAlign w:val="center"/>
           </w:tcPr>
@@ -1388,7 +1400,7 @@
         </w:tc>
         <w:tc>
           <w:tcPr>
-            <w:tcW w:w="942" w:type="dxa"/>
+            <w:tcW w:w="0" w:type="auto"/>
             <w:shd w:val="clear" w:color="auto" w:fill="D9D9D9" w:themeFill="background1" w:themeFillShade="D9"/>
             <w:vAlign w:val="center"/>
           </w:tcPr>
@@ -1411,113 +1423,182 @@
       <w:tr>
         <w:tc>
           <w:tcPr>
-            <w:tcW w:w="7688" w:type="dxa"/>
-            <w:vAlign w:val="center"/>
-          </w:tcPr>
-          <w:p>
-            <w:pPr>
-              <w:pStyle w:val="ListParagraph"/>
-              <w:numPr>
-                <w:ilvl w:val="0"/>
-                <w:numId w:val="3"/>
-              </w:numPr>
-              <w:rPr>
-                <w:rFonts w:cs="Arial"/>
-              </w:rPr>
-            </w:pPr>
-            <w:r>
-              <w:rPr>
-                <w:rFonts w:cs="Arial"/>
-              </w:rPr>
-              <w:t xml:space="preserve">The data or information resource </w:t>
-            </w:r>
-            <w:r>
-              <w:rPr>
-                <w:rFonts w:cs="Arial"/>
-              </w:rPr>
-              <w:t xml:space="preserve">is not </w:t>
-            </w:r>
-            <w:r>
-              <w:rPr>
-                <w:rFonts w:cs="Arial"/>
-              </w:rPr>
-              <w:t>Classified</w:t>
-            </w:r>
-            <w:r>
-              <w:rPr>
-                <w:rFonts w:cs="Arial"/>
-              </w:rPr>
-              <w:t xml:space="preserve"> or Protected and its release complies </w:t>
-            </w:r>
-            <w:r>
-              <w:rPr>
-                <w:rFonts w:cs="Arial"/>
-              </w:rPr>
-              <w:t xml:space="preserve">with </w:t>
-            </w:r>
-            <w:r>
-              <w:rPr>
-                <w:rFonts w:cs="Arial"/>
-              </w:rPr>
-              <w:t xml:space="preserve">the </w:t>
-            </w:r>
-            <w:r>
-              <w:rPr>
-                <w:rFonts w:cs="Arial"/>
-              </w:rPr>
-              <w:t>Government of Canada Policy on Government Security</w:t>
-            </w:r>
-            <w:r>
-              <w:rPr>
-                <w:rFonts w:cs="Arial"/>
-              </w:rPr>
-              <w:t>.</w:t>
-            </w:r>
-            <w:r>
-              <w:rPr>
-                <w:rFonts w:cs="Arial"/>
-              </w:rPr>
-              <w:tab/>
-            </w:r>
-          </w:p>
-        </w:tc>
-        <w:tc>
-          <w:tcPr>
-            <w:tcW w:w="946" w:type="dxa"/>
-            <w:vAlign w:val="center"/>
-          </w:tcPr>
-          <w:p>
-            <w:pPr>
-              <w:jc w:val="center"/>
-              <w:rPr>
-                <w:rFonts w:cs="Arial"/>
-              </w:rPr>
-            </w:pPr>
-            <w:r>
-              <w:rPr>
-                <w:rFonts w:cs="Arial"/>
-              </w:rPr>
-              <w:t>TEMPLATE_Security1</w:t>
-            </w:r>
-          </w:p>
-        </w:tc>
-        <w:tc>
-          <w:tcPr>
-            <w:tcW w:w="942" w:type="dxa"/>
-            <w:vAlign w:val="center"/>
-          </w:tcPr>
-          <w:p>
-            <w:pPr>
-              <w:jc w:val="center"/>
-              <w:rPr>
-                <w:rFonts w:cs="Arial"/>
-              </w:rPr>
-            </w:pPr>
-            <w:r>
-              <w:rPr>
-                <w:rFonts w:cs="Arial"/>
-              </w:rPr>
-              <w:t>TEMPLATE_Security2</w:t>
+            <w:tcW w:w="0" w:type="auto"/>
+            <w:vAlign w:val="center"/>
+          </w:tcPr>
+          <w:p>
+            <w:pPr>
+              <w:rPr>
+                <w:rFonts w:cs="Arial"/>
+              </w:rPr>
+            </w:pPr>
+            <w:r>
+              <w:rPr>
+                <w:rFonts w:cs="Arial"/>
+              </w:rPr>
+              <w:t>The data or information resource is in an open and accessible format that complies with the Standard on Web Accessibility.</w:t>
+            </w:r>
+          </w:p>
+        </w:tc>
+        <w:tc>
+          <w:tcPr>
+            <w:tcW w:w="0" w:type="auto"/>
+            <w:vAlign w:val="center"/>
+          </w:tcPr>
+          <w:p>
+            <w:pPr>
+              <w:jc w:val="center"/>
+              <w:rPr>
+                <w:rFonts w:cs="Arial"/>
+              </w:rPr>
+            </w:pPr>
+            <w:r>
+              <w:rPr>
+                <w:rFonts w:cs="Arial"/>
+              </w:rPr>
+              <w:t>TEMPLATE_FormatA1</w:t>
+            </w:r>
+          </w:p>
+        </w:tc>
+        <w:tc>
+          <w:tcPr>
+            <w:tcW w:w="0" w:type="auto"/>
+            <w:vAlign w:val="center"/>
+          </w:tcPr>
+          <w:p>
+            <w:pPr>
+              <w:jc w:val="center"/>
+              <w:rPr>
+                <w:rFonts w:cs="Arial"/>
+              </w:rPr>
+            </w:pPr>
+            <w:r>
+              <w:rPr>
+                <w:rFonts w:cs="Arial"/>
+              </w:rPr>
+              <w:t>TEMPLATE_FormatA2</w:t>
+            </w:r>
+          </w:p>
+        </w:tc>
+      </w:tr>
+      <w:tr>
+        <w:tc>
+          <w:tcPr>
+            <w:tcW w:w="0" w:type="auto"/>
+            <w:vAlign w:val="center"/>
+          </w:tcPr>
+          <w:p>
+            <w:pPr>
+              <w:rPr>
+                <w:rFonts w:cs="Arial"/>
+              </w:rPr>
+            </w:pPr>
+            <w:r>
+              <w:rPr>
+                <w:rFonts w:cs="Arial"/>
+              </w:rPr>
+              <w:t>Datasets are provided in machine-readable / machine-processable format.</w:t>
+            </w:r>
+          </w:p>
+        </w:tc>
+        <w:tc>
+          <w:tcPr>
+            <w:tcW w:w="0" w:type="auto"/>
+            <w:vAlign w:val="center"/>
+          </w:tcPr>
+          <w:p>
+            <w:pPr>
+              <w:jc w:val="center"/>
+              <w:rPr>
+                <w:rFonts w:cs="Arial"/>
+              </w:rPr>
+            </w:pPr>
+            <w:r>
+              <w:rPr>
+                <w:rFonts w:cs="Arial"/>
+              </w:rPr>
+              <w:t>TEMPLATE_FormatB1</w:t>
+            </w:r>
+          </w:p>
+        </w:tc>
+        <w:tc>
+          <w:tcPr>
+            <w:tcW w:w="0" w:type="auto"/>
+            <w:vAlign w:val="center"/>
+          </w:tcPr>
+          <w:p>
+            <w:pPr>
+              <w:jc w:val="center"/>
+              <w:rPr>
+                <w:rFonts w:cs="Arial"/>
+              </w:rPr>
+            </w:pPr>
+            <w:r>
+              <w:rPr>
+                <w:rFonts w:cs="Arial"/>
+              </w:rPr>
+              <w:t>TEMPLATE_FormatB2</w:t>
+            </w:r>
+          </w:p>
+        </w:tc>
+      </w:tr>
+      <w:tr>
+        <w:tc>
+          <w:tcPr>
+            <w:tcW w:w="0" w:type="auto"/>
+            <w:vAlign w:val="center"/>
+          </w:tcPr>
+          <w:p>
+            <w:pPr>
+              <w:rPr>
+                <w:rFonts w:cs="Arial"/>
+              </w:rPr>
+            </w:pPr>
+            <w:r>
+              <w:rPr>
+                <w:rFonts w:cs="Arial"/>
+              </w:rPr>
+              <w:t>Information resources are provided in open, non-proprietary formats.</w:t>
+            </w:r>
+          </w:p>
+        </w:tc>
+        <w:tc>
+          <w:tcPr>
+            <w:tcW w:w="0" w:type="auto"/>
+            <w:vAlign w:val="center"/>
+          </w:tcPr>
+          <w:p>
+            <w:pPr>
+              <w:jc w:val="center"/>
+              <w:rPr>
+                <w:rFonts w:cs="Arial"/>
+              </w:rPr>
+            </w:pPr>
+            <w:r>
+              <w:rPr>
+                <w:rFonts w:cs="Arial"/>
+              </w:rPr>
+              <w:t>TEMPLATE_FormatC1</w:t>
+            </w:r>
+          </w:p>
+        </w:tc>
+        <w:tc>
+          <w:tcPr>
+            <w:tcW w:w="0" w:type="auto"/>
+            <w:vAlign w:val="center"/>
+          </w:tcPr>
+          <w:p>
+            <w:pPr>
+              <w:jc w:val="center"/>
+              <w:rPr>
+                <w:rFonts w:cs="Arial"/>
+              </w:rPr>
+            </w:pPr>
+            <w:r>
+              <w:rPr>
+                <w:rFonts w:cs="Arial"/>
+              </w:rPr>
+              <w:t>TEMPLATE_FormatC2</w:t>
             </w:r>
           </w:p>
         </w:tc>
@@ -1528,7 +1609,7 @@
         </w:tblPrEx>
         <w:tc>
           <w:tcPr>
-            <w:tcW w:w="7688" w:type="dxa"/>
+            <w:tcW w:w="0" w:type="auto"/>
             <w:shd w:val="clear" w:color="auto" w:fill="D9D9D9" w:themeFill="background1" w:themeFillShade="D9"/>
             <w:vAlign w:val="center"/>
           </w:tcPr>
@@ -1542,13 +1623,13 @@
               <w:rPr>
                 <w:b/>
               </w:rPr>
-              <w:t>Cost</w:t>
-            </w:r>
-          </w:p>
-        </w:tc>
-        <w:tc>
-          <w:tcPr>
-            <w:tcW w:w="946" w:type="dxa"/>
+              <w:t>Official Languages</w:t>
+            </w:r>
+          </w:p>
+        </w:tc>
+        <w:tc>
+          <w:tcPr>
+            <w:tcW w:w="0" w:type="auto"/>
             <w:shd w:val="clear" w:color="auto" w:fill="D9D9D9" w:themeFill="background1" w:themeFillShade="D9"/>
             <w:vAlign w:val="center"/>
           </w:tcPr>
@@ -1569,7 +1650,7 @@
         </w:tc>
         <w:tc>
           <w:tcPr>
-            <w:tcW w:w="942" w:type="dxa"/>
+            <w:tcW w:w="0" w:type="auto"/>
             <w:shd w:val="clear" w:color="auto" w:fill="D9D9D9" w:themeFill="background1" w:themeFillShade="D9"/>
             <w:vAlign w:val="center"/>
           </w:tcPr>
@@ -1592,71 +1673,60 @@
       <w:tr>
         <w:tc>
           <w:tcPr>
-            <w:tcW w:w="7688" w:type="dxa"/>
-            <w:vAlign w:val="center"/>
-          </w:tcPr>
-          <w:p>
-            <w:pPr>
-              <w:pStyle w:val="ListParagraph"/>
-              <w:numPr>
-                <w:ilvl w:val="0"/>
-                <w:numId w:val="3"/>
-              </w:numPr>
-              <w:rPr>
-                <w:rFonts w:cs="Arial"/>
-              </w:rPr>
-            </w:pPr>
-            <w:r>
-              <w:rPr>
-                <w:rFonts w:cs="Arial"/>
-              </w:rPr>
-              <w:t>The data or information resource can be released to the public without fee.</w:t>
-            </w:r>
-            <w:r>
-              <w:rPr>
-                <w:rFonts w:cs="Arial"/>
-              </w:rPr>
-              <w:t xml:space="preserve"> </w:t>
-            </w:r>
-          </w:p>
-        </w:tc>
-        <w:tc>
-          <w:tcPr>
-            <w:tcW w:w="946" w:type="dxa"/>
-            <w:vAlign w:val="center"/>
-          </w:tcPr>
-          <w:p>
-            <w:pPr>
-              <w:jc w:val="center"/>
-              <w:rPr>
-                <w:rFonts w:cs="Arial"/>
-              </w:rPr>
-            </w:pPr>
-            <w:r>
-              <w:rPr>
-                <w:rFonts w:cs="Arial"/>
-              </w:rPr>
-              <w:t>TEMPLATE_Cost1</w:t>
-            </w:r>
-          </w:p>
-        </w:tc>
-        <w:tc>
-          <w:tcPr>
-            <w:tcW w:w="942" w:type="dxa"/>
-            <w:vAlign w:val="center"/>
-          </w:tcPr>
-          <w:p>
-            <w:pPr>
-              <w:jc w:val="center"/>
-              <w:rPr>
-                <w:rFonts w:cs="Arial"/>
-              </w:rPr>
-            </w:pPr>
-            <w:r>
-              <w:rPr>
-                <w:rFonts w:cs="Arial"/>
-              </w:rPr>
-              <w:t>TEMPLATE_Cost2</w:t>
+            <w:tcW w:w="0" w:type="auto"/>
+            <w:vAlign w:val="center"/>
+          </w:tcPr>
+          <w:p>
+            <w:pPr>
+              <w:rPr>
+                <w:rFonts w:cs="Arial"/>
+              </w:rPr>
+            </w:pPr>
+            <w:r>
+              <w:rPr>
+                <w:rFonts w:cs="Arial"/>
+              </w:rPr>
+              <w:t>The data or information resource is available in both official languages and conforms to the requirements of the Official Languages Act.</w:t>
+            </w:r>
+          </w:p>
+        </w:tc>
+        <w:tc>
+          <w:tcPr>
+            <w:tcW w:w="0" w:type="auto"/>
+            <w:vAlign w:val="center"/>
+          </w:tcPr>
+          <w:p>
+            <w:pPr>
+              <w:jc w:val="center"/>
+              <w:rPr>
+                <w:rFonts w:cs="Arial"/>
+              </w:rPr>
+            </w:pPr>
+            <w:r>
+              <w:rPr>
+                <w:rFonts w:cs="Arial"/>
+              </w:rPr>
+              <w:t>TEMPLATE_Lang1</w:t>
+            </w:r>
+          </w:p>
+        </w:tc>
+        <w:tc>
+          <w:tcPr>
+            <w:tcW w:w="0" w:type="auto"/>
+            <w:vAlign w:val="center"/>
+          </w:tcPr>
+          <w:p>
+            <w:pPr>
+              <w:jc w:val="center"/>
+              <w:rPr>
+                <w:rFonts w:cs="Arial"/>
+              </w:rPr>
+            </w:pPr>
+            <w:r>
+              <w:rPr>
+                <w:rFonts w:cs="Arial"/>
+              </w:rPr>
+              <w:t>TEMPLATE_Lang2</w:t>
             </w:r>
           </w:p>
         </w:tc>
@@ -1664,7 +1734,7 @@
       <w:tr>
         <w:tc>
           <w:tcPr>
-            <w:tcW w:w="7688" w:type="dxa"/>
+            <w:tcW w:w="0" w:type="auto"/>
             <w:shd w:val="clear" w:color="auto" w:fill="D9D9D9" w:themeFill="background1" w:themeFillShade="D9"/>
           </w:tcPr>
           <w:p>
@@ -1677,13 +1747,13 @@
               <w:rPr>
                 <w:b/>
               </w:rPr>
-              <w:t>Format</w:t>
-            </w:r>
-          </w:p>
-        </w:tc>
-        <w:tc>
-          <w:tcPr>
-            <w:tcW w:w="946" w:type="dxa"/>
+              <w:t>Security</w:t>
+            </w:r>
+          </w:p>
+        </w:tc>
+        <w:tc>
+          <w:tcPr>
+            <w:tcW w:w="0" w:type="auto"/>
             <w:shd w:val="clear" w:color="auto" w:fill="D9D9D9" w:themeFill="background1" w:themeFillShade="D9"/>
           </w:tcPr>
           <w:p>
@@ -1703,7 +1773,7 @@
         </w:tc>
         <w:tc>
           <w:tcPr>
-            <w:tcW w:w="942" w:type="dxa"/>
+            <w:tcW w:w="0" w:type="auto"/>
             <w:shd w:val="clear" w:color="auto" w:fill="D9D9D9" w:themeFill="background1" w:themeFillShade="D9"/>
           </w:tcPr>
           <w:p>
@@ -1725,104 +1795,57 @@
       <w:tr>
         <w:tc>
           <w:tcPr>
-            <w:tcW w:w="7688" w:type="dxa"/>
-          </w:tcPr>
-          <w:p>
-            <w:pPr>
-              <w:pStyle w:val="ListParagraph"/>
-              <w:numPr>
-                <w:ilvl w:val="0"/>
-                <w:numId w:val="3"/>
-              </w:numPr>
-              <w:rPr>
-                <w:rFonts w:cs="Arial"/>
-              </w:rPr>
-            </w:pPr>
-            <w:r>
-              <w:rPr>
-                <w:rFonts w:cs="Arial"/>
-              </w:rPr>
-              <w:t xml:space="preserve">    A)   </w:t>
-            </w:r>
-            <w:r>
-              <w:rPr>
-                <w:rFonts w:cs="Arial"/>
-              </w:rPr>
-              <w:t>Data</w:t>
-            </w:r>
-            <w:r>
-              <w:rPr>
-                <w:rFonts w:cs="Arial"/>
-              </w:rPr>
-              <w:t>sets</w:t>
-            </w:r>
-            <w:r>
-              <w:rPr>
-                <w:rFonts w:cs="Arial"/>
-              </w:rPr>
-              <w:t xml:space="preserve"> are</w:t>
-            </w:r>
-            <w:r>
-              <w:rPr>
-                <w:rFonts w:cs="Arial"/>
-              </w:rPr>
-              <w:t xml:space="preserve"> provided</w:t>
-            </w:r>
-            <w:r>
-              <w:rPr>
-                <w:rFonts w:cs="Arial"/>
-              </w:rPr>
-              <w:t xml:space="preserve"> in machine-readable </w:t>
-            </w:r>
-            <w:r>
-              <w:rPr>
-                <w:rFonts w:cs="Arial"/>
-              </w:rPr>
-              <w:t xml:space="preserve">/ </w:t>
-            </w:r>
-            <w:r>
-              <w:rPr>
-                <w:rFonts w:cs="Arial"/>
-              </w:rPr>
-              <w:t xml:space="preserve">machine-processable format. </w:t>
-            </w:r>
-          </w:p>
-        </w:tc>
-        <w:tc>
-          <w:tcPr>
-            <w:tcW w:w="946" w:type="dxa"/>
-          </w:tcPr>
-          <w:p>
-            <w:pPr>
-              <w:jc w:val="center"/>
-              <w:rPr>
-                <w:rFonts w:cs="Arial"/>
-              </w:rPr>
-            </w:pPr>
-            <w:r>
-              <w:rPr>
-                <w:rFonts w:cs="Arial"/>
-              </w:rPr>
-              <w:t>TEMPLATE_FormatA1</w:t>
-            </w:r>
-          </w:p>
-        </w:tc>
-        <w:tc>
-          <w:tcPr>
-            <w:tcW w:w="942" w:type="dxa"/>
-          </w:tcPr>
-          <w:p>
-            <w:pPr>
-              <w:jc w:val="center"/>
-              <w:rPr>
-                <w:rFonts w:cs="Arial"/>
-              </w:rPr>
-            </w:pPr>
-            <w:r>
-              <w:rPr>
-                <w:rFonts w:cs="Arial"/>
-              </w:rPr>
-              <w:t>TEMPLATE_FormatA2</w:t>
+            <w:tcW w:w="0" w:type="auto"/>
+          </w:tcPr>
+          <w:p>
+            <w:pPr>
+              <w:rPr>
+                <w:rFonts w:cs="Arial"/>
+              </w:rPr>
+            </w:pPr>
+            <w:r>
+              <w:rPr>
+                <w:rFonts w:cs="Arial"/>
+              </w:rPr>
+              <w:t>The data or information resource does not increase security risks to the institution, to other institutions, or to the government as a whole and conforms to the requirements of the Policy on Government Security and its related instruments.</w:t>
+            </w:r>
+          </w:p>
+        </w:tc>
+        <w:tc>
+          <w:tcPr>
+            <w:tcW w:w="0" w:type="auto"/>
+          </w:tcPr>
+          <w:p>
+            <w:pPr>
+              <w:jc w:val="center"/>
+              <w:rPr>
+                <w:rFonts w:cs="Arial"/>
+              </w:rPr>
+            </w:pPr>
+            <w:r>
+              <w:rPr>
+                <w:rFonts w:cs="Arial"/>
+              </w:rPr>
+              <w:t>TEMPLATE_Security1</w:t>
+            </w:r>
+          </w:p>
+        </w:tc>
+        <w:tc>
+          <w:tcPr>
+            <w:tcW w:w="0" w:type="auto"/>
+          </w:tcPr>
+          <w:p>
+            <w:pPr>
+              <w:jc w:val="center"/>
+              <w:rPr>
+                <w:rFonts w:cs="Arial"/>
+              </w:rPr>
+            </w:pPr>
+            <w:r>
+              <w:rPr>
+                <w:rFonts w:cs="Arial"/>
+              </w:rPr>
+              <w:t>TEMPLATE_Security2</w:t>
             </w:r>
           </w:p>
         </w:tc>
@@ -1830,126 +1853,114 @@
       <w:tr>
         <w:tc>
           <w:tcPr>
-            <w:tcW w:w="7688" w:type="dxa"/>
-          </w:tcPr>
-          <w:p>
-            <w:pPr>
-              <w:rPr>
-                <w:rFonts w:cs="Arial"/>
-              </w:rPr>
-            </w:pPr>
-            <w:r>
-              <w:rPr>
-                <w:rFonts w:cs="Arial"/>
-              </w:rPr>
-              <w:t xml:space="preserve">           B)    </w:t>
-            </w:r>
-            <w:r>
-              <w:rPr>
-                <w:rFonts w:cs="Arial"/>
-              </w:rPr>
-              <w:t>Information resources are provided in open, non-proprietary formats.</w:t>
-            </w:r>
-          </w:p>
-        </w:tc>
-        <w:tc>
-          <w:tcPr>
-            <w:tcW w:w="946" w:type="dxa"/>
-          </w:tcPr>
-          <w:p>
-            <w:pPr>
-              <w:jc w:val="center"/>
-              <w:rPr>
-                <w:rFonts w:cs="Arial"/>
-              </w:rPr>
-            </w:pPr>
-            <w:r>
-              <w:rPr>
-                <w:rFonts w:cs="Arial"/>
-              </w:rPr>
-              <w:t>TEMPLATE_FormatB1</w:t>
-            </w:r>
-          </w:p>
-        </w:tc>
-        <w:tc>
-          <w:tcPr>
-            <w:tcW w:w="942" w:type="dxa"/>
-          </w:tcPr>
-          <w:p>
-            <w:pPr>
-              <w:jc w:val="center"/>
-              <w:rPr>
-                <w:rFonts w:cs="Arial"/>
-              </w:rPr>
-            </w:pPr>
-            <w:r>
-              <w:rPr>
-                <w:rFonts w:cs="Arial"/>
-              </w:rPr>
-              <w:t>TEMPLATE_FormatB2</w:t>
-            </w:r>
+            <w:tcW w:w="0" w:type="auto"/>
+          </w:tcPr>
+          <w:p>
+            <w:pPr>
+              <w:rPr>
+                <w:rFonts w:cs="Arial"/>
+                <w:i/>
+                <w:iCs/>
+              </w:rPr>
+            </w:pPr>
+            <w:r>
+              <w:rPr>
+                <w:rFonts w:cs="Arial"/>
+                <w:i/>
+                <w:iCs/>
+              </w:rPr>
+              <w:lastRenderedPageBreak/>
+              <w:t>For advice on declassification and other security matters concerning the release of data or information, contact your departmental security directorate.</w:t>
+            </w:r>
+          </w:p>
+        </w:tc>
+        <w:tc>
+          <w:tcPr>
+            <w:tcW w:w="0" w:type="auto"/>
+          </w:tcPr>
+          <w:p>
+            <w:pPr>
+              <w:jc w:val="center"/>
+              <w:rPr>
+                <w:rFonts w:cs="Arial"/>
+              </w:rPr>
+            </w:pPr>
+          </w:p>
+        </w:tc>
+        <w:tc>
+          <w:tcPr>
+            <w:tcW w:w="0" w:type="auto"/>
+          </w:tcPr>
+          <w:p>
+            <w:pPr>
+              <w:jc w:val="center"/>
+              <w:rPr>
+                <w:rFonts w:cs="Arial"/>
+              </w:rPr>
+            </w:pPr>
           </w:p>
         </w:tc>
       </w:tr>
       <w:tr>
         <w:tc>
           <w:tcPr>
-            <w:tcW w:w="7688" w:type="dxa"/>
-          </w:tcPr>
-          <w:p>
-            <w:pPr>
-              <w:pStyle w:val="ListParagraph"/>
-              <w:numPr>
-                <w:ilvl w:val="0"/>
-                <w:numId w:val="3"/>
-              </w:numPr>
-              <w:rPr>
-                <w:rFonts w:cs="Arial"/>
-              </w:rPr>
-            </w:pPr>
-            <w:r>
-              <w:rPr>
-                <w:rFonts w:cs="Arial"/>
-              </w:rPr>
-              <w:t>Metadata in both official languages conforming to the applicable Government of Canada metadata standard is provided for each dataset or information resource.</w:t>
-            </w:r>
-          </w:p>
-        </w:tc>
-        <w:tc>
-          <w:tcPr>
-            <w:tcW w:w="946" w:type="dxa"/>
-          </w:tcPr>
-          <w:p>
-            <w:pPr>
-              <w:jc w:val="center"/>
-              <w:rPr>
-                <w:rFonts w:cs="Arial"/>
-              </w:rPr>
-            </w:pPr>
-            <w:r>
-              <w:rPr>
-                <w:rFonts w:cs="Arial"/>
-              </w:rPr>
-              <w:t>TEMPLATE_FormatC1</w:t>
-            </w:r>
-          </w:p>
-        </w:tc>
-        <w:tc>
-          <w:tcPr>
-            <w:tcW w:w="942" w:type="dxa"/>
-          </w:tcPr>
-          <w:p>
-            <w:pPr>
-              <w:jc w:val="center"/>
-              <w:rPr>
-                <w:rFonts w:cs="Arial"/>
-              </w:rPr>
-            </w:pPr>
-            <w:r>
-              <w:rPr>
-                <w:rFonts w:cs="Arial"/>
-              </w:rPr>
-              <w:t>TEMPLATE_FormatC2</w:t>
+            <w:tcW w:w="0" w:type="auto"/>
+            <w:shd w:val="clear" w:color="auto" w:fill="D9D9D9" w:themeFill="background1" w:themeFillShade="D9"/>
+          </w:tcPr>
+          <w:p>
+            <w:pPr>
+              <w:rPr>
+                <w:rFonts w:cs="Arial"/>
+                <w:i/>
+                <w:iCs/>
+              </w:rPr>
+            </w:pPr>
+            <w:r>
+              <w:rPr>
+                <w:rFonts w:cs="Arial"/>
+                <w:b/>
+              </w:rPr>
+              <w:t>Other - Legal / Regulatory / Policy / Contractual</w:t>
+            </w:r>
+          </w:p>
+        </w:tc>
+        <w:tc>
+          <w:tcPr>
+            <w:tcW w:w="0" w:type="auto"/>
+            <w:shd w:val="clear" w:color="auto" w:fill="D9D9D9" w:themeFill="background1" w:themeFillShade="D9"/>
+          </w:tcPr>
+          <w:p>
+            <w:pPr>
+              <w:jc w:val="center"/>
+              <w:rPr>
+                <w:rFonts w:cs="Arial"/>
+              </w:rPr>
+            </w:pPr>
+            <w:r>
+              <w:rPr>
+                <w:b/>
+              </w:rPr>
+              <w:t>True</w:t>
+            </w:r>
+          </w:p>
+        </w:tc>
+        <w:tc>
+          <w:tcPr>
+            <w:tcW w:w="0" w:type="auto"/>
+            <w:shd w:val="clear" w:color="auto" w:fill="D9D9D9" w:themeFill="background1" w:themeFillShade="D9"/>
+          </w:tcPr>
+          <w:p>
+            <w:pPr>
+              <w:jc w:val="center"/>
+              <w:rPr>
+                <w:rFonts w:cs="Arial"/>
+              </w:rPr>
+            </w:pPr>
+            <w:r>
+              <w:rPr>
+                <w:b/>
+              </w:rPr>
+              <w:t>False</w:t>
             </w:r>
           </w:p>
         </w:tc>
@@ -1957,62 +1968,62 @@
       <w:tr>
         <w:tc>
           <w:tcPr>
-            <w:tcW w:w="7688" w:type="dxa"/>
-            <w:shd w:val="clear" w:color="auto" w:fill="D9D9D9" w:themeFill="background1" w:themeFillShade="D9"/>
-          </w:tcPr>
-          <w:p>
-            <w:pPr>
-              <w:rPr>
-                <w:rFonts w:cs="Arial"/>
-                <w:b/>
-              </w:rPr>
-            </w:pPr>
-            <w:r>
-              <w:rPr>
-                <w:rFonts w:cs="Arial"/>
-                <w:b/>
-              </w:rPr>
-              <w:t>Blanket Approval</w:t>
-            </w:r>
-          </w:p>
-        </w:tc>
-        <w:tc>
-          <w:tcPr>
-            <w:tcW w:w="946" w:type="dxa"/>
-            <w:shd w:val="clear" w:color="auto" w:fill="D9D9D9" w:themeFill="background1" w:themeFillShade="D9"/>
-          </w:tcPr>
-          <w:p>
-            <w:pPr>
-              <w:jc w:val="center"/>
-              <w:rPr>
-                <w:b/>
-              </w:rPr>
-            </w:pPr>
-            <w:r>
-              <w:rPr>
-                <w:b/>
-              </w:rPr>
-              <w:t>True</w:t>
-            </w:r>
-          </w:p>
-        </w:tc>
-        <w:tc>
-          <w:tcPr>
-            <w:tcW w:w="942" w:type="dxa"/>
-            <w:shd w:val="clear" w:color="auto" w:fill="D9D9D9" w:themeFill="background1" w:themeFillShade="D9"/>
-          </w:tcPr>
-          <w:p>
-            <w:pPr>
-              <w:jc w:val="center"/>
-              <w:rPr>
-                <w:b/>
-              </w:rPr>
-            </w:pPr>
-            <w:r>
-              <w:rPr>
-                <w:b/>
-              </w:rPr>
-              <w:t>False</w:t>
+            <w:tcW w:w="0" w:type="auto"/>
+            <w:shd w:val="clear" w:color="auto" w:fill="auto"/>
+          </w:tcPr>
+          <w:p>
+            <w:pPr>
+              <w:rPr>
+                <w:rFonts w:cs="Arial"/>
+                <w:bCs/>
+              </w:rPr>
+            </w:pPr>
+            <w:r>
+              <w:rPr>
+                <w:rFonts w:cs="Arial"/>
+                <w:bCs/>
+              </w:rPr>
+              <w:t>The release of data or other information resource complies with all other relevant legal, regulatory, contractual, and policy requirements, for example, it is confirmed that there are no relevant legal, contractual, or third party, policy restrictions or limitations.</w:t>
+            </w:r>
+          </w:p>
+        </w:tc>
+        <w:tc>
+          <w:tcPr>
+            <w:tcW w:w="0" w:type="auto"/>
+            <w:shd w:val="clear" w:color="auto" w:fill="auto"/>
+          </w:tcPr>
+          <w:p>
+            <w:pPr>
+              <w:jc w:val="center"/>
+              <w:rPr>
+                <w:b/>
+              </w:rPr>
+            </w:pPr>
+            <w:r>
+              <w:rPr>
+                <w:rFonts w:cs="Arial"/>
+              </w:rPr>
+              <w:t>TEMPLATE_Misc1</w:t>
+            </w:r>
+          </w:p>
+        </w:tc>
+        <w:tc>
+          <w:tcPr>
+            <w:tcW w:w="0" w:type="auto"/>
+            <w:shd w:val="clear" w:color="auto" w:fill="auto"/>
+          </w:tcPr>
+          <w:p>
+            <w:pPr>
+              <w:jc w:val="center"/>
+              <w:rPr>
+                <w:b/>
+              </w:rPr>
+            </w:pPr>
+            <w:r>
+              <w:rPr>
+                <w:rFonts w:cs="Arial"/>
+              </w:rPr>
+              <w:t>TEMPLATE_Misc2</w:t>
             </w:r>
           </w:p>
         </w:tc>
@@ -2020,15 +2031,75 @@
       <w:tr>
         <w:tc>
           <w:tcPr>
-            <w:tcW w:w="7688" w:type="dxa"/>
-          </w:tcPr>
-          <w:p>
-            <w:pPr>
-              <w:pStyle w:val="ListParagraph"/>
-              <w:numPr>
-                <w:ilvl w:val="0"/>
-                <w:numId w:val="3"/>
-              </w:numPr>
+            <w:tcW w:w="0" w:type="auto"/>
+            <w:shd w:val="clear" w:color="auto" w:fill="D9D9D9" w:themeFill="background1" w:themeFillShade="D9"/>
+          </w:tcPr>
+          <w:p>
+            <w:pPr>
+              <w:rPr>
+                <w:rFonts w:cs="Arial"/>
+                <w:b/>
+              </w:rPr>
+            </w:pPr>
+            <w:bookmarkStart w:id="0" w:name="_Hlk188369740"/>
+            <w:r>
+              <w:rPr>
+                <w:rFonts w:cs="Arial"/>
+                <w:b/>
+              </w:rPr>
+              <w:t>Blanket Approval</w:t>
+            </w:r>
+          </w:p>
+        </w:tc>
+        <w:tc>
+          <w:tcPr>
+            <w:tcW w:w="0" w:type="auto"/>
+            <w:shd w:val="clear" w:color="auto" w:fill="D9D9D9" w:themeFill="background1" w:themeFillShade="D9"/>
+          </w:tcPr>
+          <w:p>
+            <w:pPr>
+              <w:jc w:val="center"/>
+              <w:rPr>
+                <w:b/>
+              </w:rPr>
+            </w:pPr>
+            <w:r>
+              <w:rPr>
+                <w:b/>
+              </w:rPr>
+              <w:t>True</w:t>
+            </w:r>
+          </w:p>
+        </w:tc>
+        <w:tc>
+          <w:tcPr>
+            <w:tcW w:w="0" w:type="auto"/>
+            <w:shd w:val="clear" w:color="auto" w:fill="D9D9D9" w:themeFill="background1" w:themeFillShade="D9"/>
+          </w:tcPr>
+          <w:p>
+            <w:pPr>
+              <w:jc w:val="center"/>
+              <w:rPr>
+                <w:b/>
+              </w:rPr>
+            </w:pPr>
+            <w:r>
+              <w:rPr>
+                <w:b/>
+              </w:rPr>
+              <w:t>False</w:t>
+            </w:r>
+          </w:p>
+        </w:tc>
+      </w:tr>
+      <w:bookmarkEnd w:id="0"/>
+      <w:tr>
+        <w:tc>
+          <w:tcPr>
+            <w:tcW w:w="0" w:type="auto"/>
+          </w:tcPr>
+          <w:p>
+            <w:pPr>
               <w:rPr>
                 <w:iCs/>
               </w:rPr>
@@ -2051,7 +2122,7 @@
           </w:p>
           <w:p>
             <w:pPr>
-              <w:ind w:left="360"/>
+              <w:ind w:left="22"/>
               <w:rPr>
                 <w:iCs/>
               </w:rPr>
@@ -2066,24 +2137,26 @@
               <w:rPr>
                 <w:iCs/>
               </w:rPr>
-              <w:t> </w:t>
+              <w:t xml:space="preserve">   </w:t>
             </w:r>
             <w:r>
               <w:rPr>
                 <w:iCs/>
               </w:rPr>
-              <w:t xml:space="preserve">  </w:t>
-            </w:r>
+              <w:t xml:space="preserve">Existing dataset will be updated on an on-going </w:t>
+            </w:r>
+            <w:proofErr w:type="gramStart"/>
             <w:r>
               <w:rPr>
                 <w:iCs/>
               </w:rPr>
-              <w:t>Existing dataset will be updated on an on-going basis</w:t>
-            </w:r>
-          </w:p>
-          <w:p>
-            <w:pPr>
-              <w:ind w:left="360"/>
+              <w:t>basis</w:t>
+            </w:r>
+            <w:proofErr w:type="gramEnd"/>
+          </w:p>
+          <w:p>
+            <w:pPr>
+              <w:ind w:left="22"/>
               <w:rPr>
                 <w:rFonts w:eastAsia="Times New Roman"/>
               </w:rPr>
@@ -2098,34 +2171,23 @@
               <w:rPr>
                 <w:iCs/>
               </w:rPr>
-              <w:t> </w:t>
-            </w:r>
-            <w:r>
+              <w:t xml:space="preserve">   </w:t>
+            </w:r>
+            <w:r>
+              <w:rPr>
+                <w:rFonts w:eastAsia="Times New Roman"/>
+              </w:rPr>
+              <w:t xml:space="preserve">Other, please state: </w:t>
+            </w:r>
+          </w:p>
+          <w:p>
+            <w:pPr>
+              <w:ind w:left="22"/>
               <w:rPr>
                 <w:iCs/>
               </w:rPr>
-              <w:t xml:space="preserve">  </w:t>
-            </w:r>
-            <w:r>
-              <w:rPr>
-                <w:rFonts w:eastAsia="Times New Roman"/>
-              </w:rPr>
-              <w:t>Other, please state:</w:t>
-            </w:r>
-            <w:r>
-              <w:rPr>
-                <w:rFonts w:eastAsia="Times New Roman"/>
-              </w:rPr>
-              <w:t xml:space="preserve"> </w:t>
-            </w:r>
-          </w:p>
-          <w:p>
-            <w:pPr>
-              <w:ind w:left="360"/>
-              <w:rPr>
-                <w:iCs/>
-              </w:rPr>
-            </w:pPr>
+            </w:pPr>
+            <w:proofErr w:type="spellStart"/>
             <w:r>
               <w:rPr>
                 <w:rFonts w:eastAsia="Times New Roman"/>
@@ -2133,6 +2195,7 @@
               </w:rPr>
               <w:t>TEMPLATE_BlkApprovOther</w:t>
             </w:r>
+            <w:proofErr w:type="spellEnd"/>
           </w:p>
           <w:p>
             <w:pPr>
@@ -2146,7 +2209,7 @@
         </w:tc>
         <w:tc>
           <w:tcPr>
-            <w:tcW w:w="946" w:type="dxa"/>
+            <w:tcW w:w="0" w:type="auto"/>
           </w:tcPr>
           <w:p>
             <w:pPr>
@@ -2165,7 +2228,7 @@
         </w:tc>
         <w:tc>
           <w:tcPr>
-            <w:tcW w:w="942" w:type="dxa"/>
+            <w:tcW w:w="0" w:type="auto"/>
           </w:tcPr>
           <w:p>
             <w:pPr>
@@ -2340,7 +2403,6 @@
           <w:sz w:val="24"/>
           <w:u w:val="single"/>
         </w:rPr>
-        <w:lastRenderedPageBreak/>
         <w:t xml:space="preserve">Level 1: </w:t>
       </w:r>
       <w:r>
@@ -2436,6 +2498,7 @@
         <w:rPr>
           <w:b/>
         </w:rPr>
+        <w:lastRenderedPageBreak/>
         <w:t>Signature: ________________________</w:t>
       </w:r>
       <w:r>

</xml_diff>

<commit_message>
Updates to IMSO form in Open Government publication process (#1549)
* Added alert when updating publishing settings

* Updated display of blank publication names

* Added validation for either non-empty name or selected publication

* Added label to dataset selection dropdown

* Updated some wording and translations in timeline

* Made metadata and approval panels collapsible

* Enable and populate dropdown list for department in approval form

* Collapsible files and imso panes WIP

* Updated file upload, imso and publishing steps

* Removed unnecessary blanket approvals

* IMSO mandatory criteria updates

* IMSO form updates

* Minor template update

* Updated localization: French IMSO acronym and removed duplicates

* Updated workspace settings warning message.

---------

Co-authored-by: Alex Khavich <alex.khavich@ssc-spc.gc.ca>
</commit_message>
<xml_diff>
--- a/Portal/src/Datahub.Portal/Controllers/OpenDataApprovalForm.docx
+++ b/Portal/src/Datahub.Portal/Controllers/OpenDataApprovalForm.docx
@@ -1,9 +1,20 @@
 
 <file path=word/document.xml><?xml version="1.0" encoding="utf-8"?>
-<w:document xmlns:wpc="http://schemas.microsoft.com/office/word/2010/wordprocessingCanvas" xmlns:cx="http://schemas.microsoft.com/office/drawing/2014/chartex" xmlns:cx1="http://schemas.microsoft.com/office/drawing/2015/9/8/chartex" xmlns:cx2="http://schemas.microsoft.com/office/drawing/2015/10/21/chartex" xmlns:cx3="http://schemas.microsoft.com/office/drawing/2016/5/9/chartex" xmlns:cx4="http://schemas.microsoft.com/office/drawing/2016/5/10/chartex" xmlns:cx5="http://schemas.microsoft.com/office/drawing/2016/5/11/chartex" xmlns:cx6="http://schemas.microsoft.com/office/drawing/2016/5/12/chartex" xmlns:cx7="http://schemas.microsoft.com/office/drawing/2016/5/13/chartex" xmlns:cx8="http://schemas.microsoft.com/office/drawing/2016/5/14/chartex" xmlns:mc="http://schemas.openxmlformats.org/markup-compatibility/2006" xmlns:aink="http://schemas.microsoft.com/office/drawing/2016/ink" xmlns:am3d="http://schemas.microsoft.com/office/drawing/2017/model3d" xmlns:o="urn:schemas-microsoft-com:office:office" xmlns:oel="http://schemas.microsoft.com/office/2019/extlst" xmlns:r="http://schemas.openxmlformats.org/officeDocument/2006/relationships" xmlns:m="http://schemas.openxmlformats.org/officeDocument/2006/math" xmlns:v="urn:schemas-microsoft-com:vml" xmlns:wp14="http://schemas.microsoft.com/office/word/2010/wordprocessingDrawing" xmlns:wp="http://schemas.openxmlformats.org/drawingml/2006/wordprocessingDrawing" xmlns:w10="urn:schemas-microsoft-com:office:word" xmlns:w="http://schemas.openxmlformats.org/wordprocessingml/2006/main" xmlns:w14="http://schemas.microsoft.com/office/word/2010/wordml" xmlns:w15="http://schemas.microsoft.com/office/word/2012/wordml" xmlns:w16cex="http://schemas.microsoft.com/office/word/2018/wordml/cex" xmlns:w16cid="http://schemas.microsoft.com/office/word/2016/wordml/cid" xmlns:w16="http://schemas.microsoft.com/office/word/2018/wordml" xmlns:w16sdtdh="http://schemas.microsoft.com/office/word/2020/wordml/sdtdatahash" xmlns:w16se="http://schemas.microsoft.com/office/word/2015/wordml/symex" xmlns:wpg="http://schemas.microsoft.com/office/word/2010/wordprocessingGroup" xmlns:wpi="http://schemas.microsoft.com/office/word/2010/wordprocessingInk" xmlns:wne="http://schemas.microsoft.com/office/word/2006/wordml" xmlns:wps="http://schemas.microsoft.com/office/word/2010/wordprocessingShape" mc:Ignorable="w14 w15 w16se w16cid w16 w16cex w16sdtdh wp14">
+<w:document xmlns:wpc="http://schemas.microsoft.com/office/word/2010/wordprocessingCanvas" xmlns:cx="http://schemas.microsoft.com/office/drawing/2014/chartex" xmlns:cx1="http://schemas.microsoft.com/office/drawing/2015/9/8/chartex" xmlns:cx2="http://schemas.microsoft.com/office/drawing/2015/10/21/chartex" xmlns:cx3="http://schemas.microsoft.com/office/drawing/2016/5/9/chartex" xmlns:cx4="http://schemas.microsoft.com/office/drawing/2016/5/10/chartex" xmlns:cx5="http://schemas.microsoft.com/office/drawing/2016/5/11/chartex" xmlns:cx6="http://schemas.microsoft.com/office/drawing/2016/5/12/chartex" xmlns:cx7="http://schemas.microsoft.com/office/drawing/2016/5/13/chartex" xmlns:cx8="http://schemas.microsoft.com/office/drawing/2016/5/14/chartex" xmlns:mc="http://schemas.openxmlformats.org/markup-compatibility/2006" xmlns:aink="http://schemas.microsoft.com/office/drawing/2016/ink" xmlns:am3d="http://schemas.microsoft.com/office/drawing/2017/model3d" xmlns:o="urn:schemas-microsoft-com:office:office" xmlns:oel="http://schemas.microsoft.com/office/2019/extlst" xmlns:r="http://schemas.openxmlformats.org/officeDocument/2006/relationships" xmlns:m="http://schemas.openxmlformats.org/officeDocument/2006/math" xmlns:v="urn:schemas-microsoft-com:vml" xmlns:wp14="http://schemas.microsoft.com/office/word/2010/wordprocessingDrawing" xmlns:wp="http://schemas.openxmlformats.org/drawingml/2006/wordprocessingDrawing" xmlns:w10="urn:schemas-microsoft-com:office:word" xmlns:w="http://schemas.openxmlformats.org/wordprocessingml/2006/main" xmlns:w14="http://schemas.microsoft.com/office/word/2010/wordml" xmlns:w15="http://schemas.microsoft.com/office/word/2012/wordml" xmlns:w16cex="http://schemas.microsoft.com/office/word/2018/wordml/cex" xmlns:w16cid="http://schemas.microsoft.com/office/word/2016/wordml/cid" xmlns:w16="http://schemas.microsoft.com/office/word/2018/wordml" xmlns:w16du="http://schemas.microsoft.com/office/word/2023/wordml/word16du" xmlns:w16sdtdh="http://schemas.microsoft.com/office/word/2020/wordml/sdtdatahash" xmlns:w16se="http://schemas.microsoft.com/office/word/2015/wordml/symex" xmlns:wpg="http://schemas.microsoft.com/office/word/2010/wordprocessingGroup" xmlns:wpi="http://schemas.microsoft.com/office/word/2010/wordprocessingInk" xmlns:wne="http://schemas.microsoft.com/office/word/2006/wordml" xmlns:wps="http://schemas.microsoft.com/office/word/2010/wordprocessingShape" mc:Ignorable="w14 w15 w16se w16cid w16 w16cex w16sdtdh w16du wp14">
   <w:body>
     <w:p>
       <w:pPr>
+        <w:pStyle w:val="Heading1"/>
+      </w:pPr>
+      <w:r>
+        <w:t>Information Management Senior Official Author</w:t>
+      </w:r>
+      <w:r>
+        <w:t>ization Request Form</w:t>
+      </w:r>
+    </w:p>
+    <w:p>
+      <w:pPr>
         <w:rPr>
           <w:b/>
           <w:sz w:val="24"/>
@@ -74,27 +85,7 @@
         <w:t xml:space="preserve"> be released.</w:t>
       </w:r>
       <w:r>
-        <w:t xml:space="preserve"> Once signed by the Level 1: Business Owner, please send the checklist to </w:t>
-      </w:r>
-      <w:hyperlink r:id="rId8" w:history="1">
-        <w:r>
-          <w:rPr>
-            <w:rStyle w:val="Hyperlink"/>
-          </w:rPr>
-          <w:t>open_government-gouvernement_ouvert@nrcan-rncan.gc.ca</w:t>
-        </w:r>
-      </w:hyperlink>
-      <w:r>
         <w:t xml:space="preserve"> </w:t>
-      </w:r>
-      <w:r>
-        <w:t xml:space="preserve">for signature by the </w:t>
-      </w:r>
-      <w:r>
-        <w:t>Level 2: Information Management Senior Official</w:t>
-      </w:r>
-      <w:r>
-        <w:t xml:space="preserve"> (IMSO). </w:t>
       </w:r>
     </w:p>
     <w:p>
@@ -201,9 +192,11 @@
             <w:shd w:val="clear" w:color="auto" w:fill="DBE5F1" w:themeFill="accent1" w:themeFillTint="33"/>
           </w:tcPr>
           <w:p>
+            <w:proofErr w:type="spellStart"/>
             <w:r>
               <w:t>TEMPLATE_Department</w:t>
             </w:r>
+            <w:proofErr w:type="spellEnd"/>
           </w:p>
         </w:tc>
         <w:tc>
@@ -216,9 +209,11 @@
             <w:shd w:val="clear" w:color="auto" w:fill="DBE5F1" w:themeFill="accent1" w:themeFillTint="33"/>
           </w:tcPr>
           <w:p>
+            <w:proofErr w:type="spellStart"/>
             <w:r>
               <w:t>TEMPLATE_Sector</w:t>
             </w:r>
+            <w:proofErr w:type="spellEnd"/>
           </w:p>
         </w:tc>
       </w:tr>
@@ -287,9 +282,11 @@
             <w:shd w:val="clear" w:color="auto" w:fill="DBE5F1" w:themeFill="accent1" w:themeFillTint="33"/>
           </w:tcPr>
           <w:p>
+            <w:proofErr w:type="spellStart"/>
             <w:r>
               <w:t>TEMPLATE_Branch</w:t>
             </w:r>
+            <w:proofErr w:type="spellEnd"/>
           </w:p>
         </w:tc>
         <w:tc>
@@ -303,9 +300,11 @@
             <w:shd w:val="clear" w:color="auto" w:fill="DBE5F1" w:themeFill="accent1" w:themeFillTint="33"/>
           </w:tcPr>
           <w:p>
+            <w:proofErr w:type="spellStart"/>
             <w:r>
               <w:t>TEMPLATE_Division</w:t>
             </w:r>
+            <w:proofErr w:type="spellEnd"/>
           </w:p>
         </w:tc>
         <w:tc>
@@ -319,9 +318,11 @@
             <w:shd w:val="clear" w:color="auto" w:fill="DBE5F1" w:themeFill="accent1" w:themeFillTint="33"/>
           </w:tcPr>
           <w:p>
+            <w:proofErr w:type="spellStart"/>
             <w:r>
               <w:t>TEMPLATE_Section</w:t>
             </w:r>
+            <w:proofErr w:type="spellEnd"/>
           </w:p>
         </w:tc>
       </w:tr>
@@ -355,9 +356,11 @@
             <w:shd w:val="clear" w:color="auto" w:fill="DBE5F1" w:themeFill="accent1" w:themeFillTint="33"/>
           </w:tcPr>
           <w:p>
+            <w:proofErr w:type="spellStart"/>
             <w:r>
               <w:t>TEMPLATE_Name</w:t>
             </w:r>
+            <w:proofErr w:type="spellEnd"/>
           </w:p>
         </w:tc>
       </w:tr>
@@ -402,9 +405,11 @@
             <w:shd w:val="clear" w:color="auto" w:fill="DBE5F1" w:themeFill="accent1" w:themeFillTint="33"/>
           </w:tcPr>
           <w:p>
+            <w:proofErr w:type="spellStart"/>
             <w:r>
               <w:t>TEMPLATE_Phone</w:t>
             </w:r>
+            <w:proofErr w:type="spellEnd"/>
           </w:p>
         </w:tc>
         <w:tc>
@@ -417,9 +422,11 @@
             <w:shd w:val="clear" w:color="auto" w:fill="DBE5F1" w:themeFill="accent1" w:themeFillTint="33"/>
           </w:tcPr>
           <w:p>
+            <w:proofErr w:type="spellStart"/>
             <w:r>
               <w:t>TEMPLATE_Email</w:t>
             </w:r>
+            <w:proofErr w:type="spellEnd"/>
           </w:p>
         </w:tc>
       </w:tr>
@@ -475,7 +482,7 @@
               <w:jc w:val="center"/>
             </w:pPr>
             <w:r>
-              <w:t>Data</w:t>
+              <w:t>Dataset</w:t>
             </w:r>
           </w:p>
         </w:tc>
@@ -492,7 +499,7 @@
               <w:jc w:val="center"/>
             </w:pPr>
             <w:r>
-              <w:t>Info</w:t>
+              <w:t>Open Information</w:t>
             </w:r>
           </w:p>
         </w:tc>
@@ -527,9 +534,11 @@
             <w:shd w:val="clear" w:color="auto" w:fill="DBE5F1" w:themeFill="accent1" w:themeFillTint="33"/>
           </w:tcPr>
           <w:p>
+            <w:proofErr w:type="spellStart"/>
             <w:r>
               <w:t>TEMPLATE_Title</w:t>
             </w:r>
+            <w:proofErr w:type="spellEnd"/>
           </w:p>
         </w:tc>
         <w:tc>
@@ -546,9 +555,11 @@
             <w:pPr>
               <w:jc w:val="center"/>
             </w:pPr>
+            <w:proofErr w:type="spellStart"/>
             <w:r>
               <w:t>TEMPLATE_Data</w:t>
             </w:r>
+            <w:proofErr w:type="spellEnd"/>
           </w:p>
         </w:tc>
         <w:tc>
@@ -565,9 +576,11 @@
             <w:pPr>
               <w:jc w:val="center"/>
             </w:pPr>
+            <w:proofErr w:type="spellStart"/>
             <w:r>
               <w:t>TEMPLATE_Info</w:t>
             </w:r>
+            <w:proofErr w:type="spellEnd"/>
           </w:p>
         </w:tc>
       </w:tr>
@@ -587,13 +600,14 @@
       <w:tr>
         <w:tc>
           <w:tcPr>
-            <w:tcW w:w="9576" w:type="dxa"/>
+            <w:tcW w:w="0" w:type="auto"/>
             <w:gridSpan w:val="3"/>
             <w:shd w:val="clear" w:color="auto" w:fill="BFBFBF" w:themeFill="background1" w:themeFillShade="BF"/>
             <w:vAlign w:val="center"/>
           </w:tcPr>
           <w:p>
             <w:pPr>
+              <w:keepNext/>
               <w:rPr>
                 <w:rFonts w:cs="Arial"/>
                 <w:b/>
@@ -630,38 +644,34 @@
         </w:tblPrEx>
         <w:tc>
           <w:tcPr>
-            <w:tcW w:w="7688" w:type="dxa"/>
+            <w:tcW w:w="0" w:type="auto"/>
             <w:shd w:val="clear" w:color="auto" w:fill="D9D9D9" w:themeFill="background1" w:themeFillShade="D9"/>
             <w:vAlign w:val="center"/>
           </w:tcPr>
           <w:p>
             <w:pPr>
-              <w:rPr>
-                <w:b/>
-              </w:rPr>
-            </w:pPr>
-            <w:r>
-              <w:rPr>
-                <w:b/>
-              </w:rPr>
-              <w:t xml:space="preserve">Legal </w:t>
-            </w:r>
-            <w:r>
-              <w:rPr>
-                <w:b/>
-              </w:rPr>
-              <w:t>/ Licensing / Copyright</w:t>
-            </w:r>
-          </w:p>
-        </w:tc>
-        <w:tc>
-          <w:tcPr>
-            <w:tcW w:w="946" w:type="dxa"/>
+              <w:keepNext/>
+              <w:rPr>
+                <w:b/>
+              </w:rPr>
+            </w:pPr>
+            <w:r>
+              <w:rPr>
+                <w:b/>
+              </w:rPr>
+              <w:t>Confidentiality</w:t>
+            </w:r>
+          </w:p>
+        </w:tc>
+        <w:tc>
+          <w:tcPr>
+            <w:tcW w:w="0" w:type="auto"/>
             <w:shd w:val="clear" w:color="auto" w:fill="D9D9D9" w:themeFill="background1" w:themeFillShade="D9"/>
             <w:vAlign w:val="center"/>
           </w:tcPr>
           <w:p>
             <w:pPr>
+              <w:keepNext/>
               <w:jc w:val="center"/>
               <w:rPr>
                 <w:b/>
@@ -677,12 +687,13 @@
         </w:tc>
         <w:tc>
           <w:tcPr>
-            <w:tcW w:w="942" w:type="dxa"/>
+            <w:tcW w:w="0" w:type="auto"/>
             <w:shd w:val="clear" w:color="auto" w:fill="D9D9D9" w:themeFill="background1" w:themeFillShade="D9"/>
             <w:vAlign w:val="center"/>
           </w:tcPr>
           <w:p>
             <w:pPr>
+              <w:keepNext/>
               <w:jc w:val="center"/>
               <w:rPr>
                 <w:b/>
@@ -703,115 +714,26 @@
         </w:trPr>
         <w:tc>
           <w:tcPr>
-            <w:tcW w:w="7688" w:type="dxa"/>
-            <w:vAlign w:val="center"/>
-          </w:tcPr>
-          <w:p>
-            <w:pPr>
-              <w:pStyle w:val="ListParagraph"/>
-              <w:numPr>
-                <w:ilvl w:val="0"/>
-                <w:numId w:val="3"/>
-              </w:numPr>
-              <w:rPr>
-                <w:rFonts w:cs="Arial"/>
-              </w:rPr>
-            </w:pPr>
-            <w:r>
-              <w:rPr>
-                <w:rFonts w:cs="Arial"/>
-              </w:rPr>
-              <w:t>T</w:t>
-            </w:r>
-            <w:r>
-              <w:rPr>
-                <w:rFonts w:cs="Arial"/>
-              </w:rPr>
-              <w:t xml:space="preserve">here are no </w:t>
-            </w:r>
-            <w:r>
-              <w:rPr>
-                <w:rFonts w:cs="Arial"/>
-              </w:rPr>
-              <w:t xml:space="preserve">known </w:t>
-            </w:r>
-            <w:r>
-              <w:rPr>
-                <w:rFonts w:cs="Arial"/>
-              </w:rPr>
-              <w:t xml:space="preserve">legal, </w:t>
-            </w:r>
-            <w:r>
-              <w:rPr>
-                <w:rFonts w:cs="Arial"/>
-              </w:rPr>
-              <w:t xml:space="preserve">licensing, </w:t>
-            </w:r>
-            <w:r>
-              <w:rPr>
-                <w:rFonts w:cs="Arial"/>
-              </w:rPr>
-              <w:t>or copyright</w:t>
-            </w:r>
-            <w:r>
-              <w:rPr>
-                <w:rFonts w:cs="Arial"/>
-              </w:rPr>
-              <w:t xml:space="preserve"> restrictions </w:t>
-            </w:r>
-            <w:r>
-              <w:rPr>
-                <w:rFonts w:cs="Arial"/>
-              </w:rPr>
-              <w:t xml:space="preserve">to prevent the data or information </w:t>
-            </w:r>
-            <w:r>
-              <w:rPr>
-                <w:rFonts w:cs="Arial"/>
-              </w:rPr>
-              <w:t xml:space="preserve">from </w:t>
-            </w:r>
-            <w:r>
-              <w:rPr>
-                <w:rFonts w:cs="Arial"/>
-              </w:rPr>
-              <w:t>being released</w:t>
-            </w:r>
-            <w:r>
-              <w:rPr>
-                <w:rFonts w:cs="Arial"/>
-              </w:rPr>
-              <w:t xml:space="preserve"> by the </w:t>
-            </w:r>
-            <w:r>
-              <w:rPr>
-                <w:rFonts w:cs="Arial"/>
-              </w:rPr>
-              <w:t>department or agency</w:t>
-            </w:r>
-            <w:r>
-              <w:rPr>
-                <w:rFonts w:cs="Arial"/>
-              </w:rPr>
-              <w:t xml:space="preserve"> under the terms of the Open Government Licence</w:t>
-            </w:r>
-            <w:r>
-              <w:rPr>
-                <w:rFonts w:cs="Arial"/>
-              </w:rPr>
-              <w:t xml:space="preserve"> – Canada</w:t>
-            </w:r>
-            <w:r>
-              <w:rPr>
-                <w:rFonts w:cs="Arial"/>
-              </w:rPr>
-              <w:t>.</w:t>
-            </w:r>
-          </w:p>
-        </w:tc>
-        <w:tc>
-          <w:tcPr>
-            <w:tcW w:w="946" w:type="dxa"/>
+            <w:tcW w:w="0" w:type="auto"/>
+            <w:vAlign w:val="center"/>
+          </w:tcPr>
+          <w:p>
+            <w:pPr>
+              <w:rPr>
+                <w:rFonts w:cs="Arial"/>
+              </w:rPr>
+            </w:pPr>
+            <w:r>
+              <w:rPr>
+                <w:rFonts w:cs="Arial"/>
+              </w:rPr>
+              <w:t>The data or information resource is not subject to confidentiality restrictions, such as Cabinet confidences, solicitor-client privilege, classified or protected information, advice or recommendations, third party information, or information obtained in confidence.</w:t>
+            </w:r>
+          </w:p>
+        </w:tc>
+        <w:tc>
+          <w:tcPr>
+            <w:tcW w:w="0" w:type="auto"/>
             <w:vAlign w:val="center"/>
           </w:tcPr>
           <w:p>
@@ -825,13 +747,13 @@
               <w:rPr>
                 <w:rFonts w:cs="Arial"/>
               </w:rPr>
-              <w:t>TEMPLATE_Legal1</w:t>
-            </w:r>
-          </w:p>
-        </w:tc>
-        <w:tc>
-          <w:tcPr>
-            <w:tcW w:w="942" w:type="dxa"/>
+              <w:t>TEMPLATE_Conf1</w:t>
+            </w:r>
+          </w:p>
+        </w:tc>
+        <w:tc>
+          <w:tcPr>
+            <w:tcW w:w="0" w:type="auto"/>
             <w:vAlign w:val="center"/>
           </w:tcPr>
           <w:p>
@@ -845,7 +767,7 @@
               <w:rPr>
                 <w:rFonts w:cs="Arial"/>
               </w:rPr>
-              <w:t>TEMPLATE_Legal2</w:t>
+              <w:t>TEMPLATE_Conf2</w:t>
             </w:r>
           </w:p>
         </w:tc>
@@ -856,32 +778,34 @@
         </w:tblPrEx>
         <w:tc>
           <w:tcPr>
-            <w:tcW w:w="7688" w:type="dxa"/>
+            <w:tcW w:w="0" w:type="auto"/>
             <w:shd w:val="clear" w:color="auto" w:fill="D9D9D9" w:themeFill="background1" w:themeFillShade="D9"/>
             <w:vAlign w:val="center"/>
           </w:tcPr>
           <w:p>
             <w:pPr>
-              <w:rPr>
-                <w:b/>
-              </w:rPr>
-            </w:pPr>
-            <w:r>
-              <w:rPr>
-                <w:b/>
-              </w:rPr>
-              <w:t>Authority to Release</w:t>
-            </w:r>
-          </w:p>
-        </w:tc>
-        <w:tc>
-          <w:tcPr>
-            <w:tcW w:w="946" w:type="dxa"/>
+              <w:keepNext/>
+              <w:rPr>
+                <w:b/>
+              </w:rPr>
+            </w:pPr>
+            <w:r>
+              <w:rPr>
+                <w:b/>
+              </w:rPr>
+              <w:t>Access to Information</w:t>
+            </w:r>
+          </w:p>
+        </w:tc>
+        <w:tc>
+          <w:tcPr>
+            <w:tcW w:w="0" w:type="auto"/>
             <w:shd w:val="clear" w:color="auto" w:fill="D9D9D9" w:themeFill="background1" w:themeFillShade="D9"/>
             <w:vAlign w:val="center"/>
           </w:tcPr>
           <w:p>
             <w:pPr>
+              <w:keepNext/>
               <w:jc w:val="center"/>
               <w:rPr>
                 <w:b/>
@@ -897,12 +821,13 @@
         </w:tc>
         <w:tc>
           <w:tcPr>
-            <w:tcW w:w="942" w:type="dxa"/>
+            <w:tcW w:w="0" w:type="auto"/>
             <w:shd w:val="clear" w:color="auto" w:fill="D9D9D9" w:themeFill="background1" w:themeFillShade="D9"/>
             <w:vAlign w:val="center"/>
           </w:tcPr>
           <w:p>
             <w:pPr>
+              <w:keepNext/>
               <w:jc w:val="center"/>
               <w:rPr>
                 <w:b/>
@@ -920,37 +845,26 @@
       <w:tr>
         <w:tc>
           <w:tcPr>
-            <w:tcW w:w="7688" w:type="dxa"/>
-            <w:vAlign w:val="center"/>
-          </w:tcPr>
-          <w:p>
-            <w:pPr>
-              <w:pStyle w:val="ListParagraph"/>
-              <w:numPr>
-                <w:ilvl w:val="0"/>
-                <w:numId w:val="3"/>
-              </w:numPr>
-              <w:rPr>
-                <w:rFonts w:cs="Arial"/>
-              </w:rPr>
-            </w:pPr>
-            <w:r>
-              <w:rPr>
-                <w:rFonts w:cs="Arial"/>
-              </w:rPr>
-              <w:t xml:space="preserve">The department or agency </w:t>
-            </w:r>
-            <w:r>
-              <w:rPr>
-                <w:rFonts w:cs="Arial"/>
-              </w:rPr>
-              <w:t>has the departmental mandate, legislative authority or permission from a third party provider to publish the data or information resource under the Open Government Licence – Canada.</w:t>
-            </w:r>
-          </w:p>
-        </w:tc>
-        <w:tc>
-          <w:tcPr>
-            <w:tcW w:w="946" w:type="dxa"/>
+            <w:tcW w:w="0" w:type="auto"/>
+            <w:vAlign w:val="center"/>
+          </w:tcPr>
+          <w:p>
+            <w:pPr>
+              <w:rPr>
+                <w:rFonts w:cs="Arial"/>
+              </w:rPr>
+            </w:pPr>
+            <w:r>
+              <w:rPr>
+                <w:rFonts w:cs="Arial"/>
+              </w:rPr>
+              <w:t>The data or information resource is not subject to any exemptions or exclusions under the Access to Information Act, or redactions under appropriate sections of the Act have been applied in consultation with the Access to Information and Privacy (ATIP) Directorate.</w:t>
+            </w:r>
+          </w:p>
+        </w:tc>
+        <w:tc>
+          <w:tcPr>
+            <w:tcW w:w="0" w:type="auto"/>
             <w:vAlign w:val="center"/>
           </w:tcPr>
           <w:p>
@@ -964,13 +878,13 @@
               <w:rPr>
                 <w:rFonts w:cs="Arial"/>
               </w:rPr>
-              <w:t>TEMPLATE_Auth1</w:t>
-            </w:r>
-          </w:p>
-        </w:tc>
-        <w:tc>
-          <w:tcPr>
-            <w:tcW w:w="942" w:type="dxa"/>
+              <w:t>TEMPLATE_Access1</w:t>
+            </w:r>
+          </w:p>
+        </w:tc>
+        <w:tc>
+          <w:tcPr>
+            <w:tcW w:w="0" w:type="auto"/>
             <w:vAlign w:val="center"/>
           </w:tcPr>
           <w:p>
@@ -984,7 +898,7 @@
               <w:rPr>
                 <w:rFonts w:cs="Arial"/>
               </w:rPr>
-              <w:t>TEMPLATE_Auth2</w:t>
+              <w:t>TEMPLATE_Access2</w:t>
             </w:r>
           </w:p>
         </w:tc>
@@ -992,28 +906,37 @@
       <w:tr>
         <w:tc>
           <w:tcPr>
-            <w:tcW w:w="7688" w:type="dxa"/>
-            <w:shd w:val="clear" w:color="auto" w:fill="D9D9D9" w:themeFill="background1" w:themeFillShade="D9"/>
-            <w:vAlign w:val="center"/>
-          </w:tcPr>
-          <w:p>
-            <w:pPr>
-              <w:rPr>
-                <w:rFonts w:cs="Arial"/>
-              </w:rPr>
-            </w:pPr>
-            <w:r>
-              <w:rPr>
-                <w:b/>
-              </w:rPr>
-              <w:t>Privacy</w:t>
-            </w:r>
-          </w:p>
-        </w:tc>
-        <w:tc>
-          <w:tcPr>
-            <w:tcW w:w="946" w:type="dxa"/>
-            <w:shd w:val="clear" w:color="auto" w:fill="D9D9D9" w:themeFill="background1" w:themeFillShade="D9"/>
+            <w:tcW w:w="0" w:type="auto"/>
+            <w:vAlign w:val="center"/>
+          </w:tcPr>
+          <w:p>
+            <w:pPr>
+              <w:rPr>
+                <w:rFonts w:cs="Arial"/>
+              </w:rPr>
+            </w:pPr>
+            <w:r>
+              <w:rPr>
+                <w:rFonts w:cs="Arial"/>
+                <w:i/>
+                <w:iCs/>
+              </w:rPr>
+              <w:t xml:space="preserve">If you are unsure whether the data or information is subject to any exemptions under </w:t>
+            </w:r>
+            <w:r>
+              <w:rPr>
+                <w:rFonts w:cs="Arial"/>
+                <w:i/>
+                <w:iCs/>
+              </w:rPr>
+              <w:lastRenderedPageBreak/>
+              <w:t>the Access to Information Act and/or free of personal information in compliance with the Privacy Act, please contact the Access to Information and Privacy (ATIP) Directorate within your department.</w:t>
+            </w:r>
+          </w:p>
+        </w:tc>
+        <w:tc>
+          <w:tcPr>
+            <w:tcW w:w="0" w:type="auto"/>
             <w:vAlign w:val="center"/>
           </w:tcPr>
           <w:p>
@@ -1023,18 +946,11 @@
                 <w:rFonts w:cs="Arial"/>
               </w:rPr>
             </w:pPr>
-            <w:r>
-              <w:rPr>
-                <w:b/>
-              </w:rPr>
-              <w:t>True</w:t>
-            </w:r>
-          </w:p>
-        </w:tc>
-        <w:tc>
-          <w:tcPr>
-            <w:tcW w:w="942" w:type="dxa"/>
-            <w:shd w:val="clear" w:color="auto" w:fill="D9D9D9" w:themeFill="background1" w:themeFillShade="D9"/>
+          </w:p>
+        </w:tc>
+        <w:tc>
+          <w:tcPr>
+            <w:tcW w:w="0" w:type="auto"/>
             <w:vAlign w:val="center"/>
           </w:tcPr>
           <w:p>
@@ -1044,103 +960,40 @@
                 <w:rFonts w:cs="Arial"/>
               </w:rPr>
             </w:pPr>
-            <w:r>
-              <w:rPr>
-                <w:b/>
-              </w:rPr>
-              <w:t>False</w:t>
-            </w:r>
           </w:p>
         </w:tc>
       </w:tr>
       <w:tr>
         <w:tc>
           <w:tcPr>
-            <w:tcW w:w="7688" w:type="dxa"/>
-            <w:vAlign w:val="center"/>
-          </w:tcPr>
-          <w:p>
-            <w:pPr>
-              <w:pStyle w:val="ListParagraph"/>
-              <w:numPr>
-                <w:ilvl w:val="0"/>
-                <w:numId w:val="3"/>
-              </w:numPr>
-              <w:rPr>
-                <w:rFonts w:cs="Arial"/>
-              </w:rPr>
-            </w:pPr>
-            <w:r>
-              <w:rPr>
-                <w:rFonts w:cs="Arial"/>
-              </w:rPr>
-              <w:t xml:space="preserve">The data or information resource </w:t>
-            </w:r>
-            <w:r>
-              <w:rPr>
-                <w:rFonts w:cs="Arial"/>
-              </w:rPr>
-              <w:t>does not contain any personal information</w:t>
-            </w:r>
-            <w:r>
-              <w:rPr>
-                <w:rFonts w:cs="Arial"/>
-              </w:rPr>
-              <w:t xml:space="preserve"> </w:t>
-            </w:r>
-            <w:r>
-              <w:rPr>
-                <w:rFonts w:cs="Arial"/>
-              </w:rPr>
-              <w:t xml:space="preserve">as defined in </w:t>
-            </w:r>
-            <w:r>
-              <w:rPr>
-                <w:rStyle w:val="margin-left-xlarge"/>
-                <w:rFonts w:cs="Helvetica"/>
-                <w:lang w:val="en"/>
-              </w:rPr>
-              <w:t xml:space="preserve">section 3 of the </w:t>
-            </w:r>
-            <w:r>
-              <w:rPr>
-                <w:rStyle w:val="Emphasis"/>
-                <w:rFonts w:cs="Helvetica"/>
-                <w:lang w:val="en"/>
-              </w:rPr>
-              <w:t>Privacy Act</w:t>
-            </w:r>
-            <w:r>
-              <w:rPr>
-                <w:rStyle w:val="margin-left-xlarge"/>
-                <w:rFonts w:cs="Helvetica"/>
-                <w:lang w:val="en"/>
-              </w:rPr>
-              <w:t xml:space="preserve">, R.S.C. 1985, c. P-21 </w:t>
-            </w:r>
-            <w:r>
-              <w:rPr>
-                <w:rFonts w:ascii="AvantGarde Bk BT" w:hAnsi="AvantGarde Bk BT"/>
-                <w:b/>
-                <w:bCs/>
-              </w:rPr>
-              <w:t>as confirmed by the ATIP Secretariat</w:t>
-            </w:r>
-            <w:r>
-              <w:rPr>
-                <w:rFonts w:ascii="AvantGarde Bk BT" w:hAnsi="AvantGarde Bk BT"/>
-              </w:rPr>
-              <w:t>.</w:t>
-            </w:r>
-          </w:p>
-        </w:tc>
-        <w:tc>
-          <w:tcPr>
-            <w:tcW w:w="946" w:type="dxa"/>
-            <w:vAlign w:val="center"/>
-          </w:tcPr>
-          <w:p>
-            <w:pPr>
+            <w:tcW w:w="0" w:type="auto"/>
+            <w:shd w:val="clear" w:color="auto" w:fill="D9D9D9" w:themeFill="background1" w:themeFillShade="D9"/>
+            <w:vAlign w:val="center"/>
+          </w:tcPr>
+          <w:p>
+            <w:pPr>
+              <w:keepNext/>
+              <w:rPr>
+                <w:rFonts w:cs="Arial"/>
+              </w:rPr>
+            </w:pPr>
+            <w:r>
+              <w:rPr>
+                <w:b/>
+              </w:rPr>
+              <w:t>Authority to Release</w:t>
+            </w:r>
+          </w:p>
+        </w:tc>
+        <w:tc>
+          <w:tcPr>
+            <w:tcW w:w="0" w:type="auto"/>
+            <w:shd w:val="clear" w:color="auto" w:fill="D9D9D9" w:themeFill="background1" w:themeFillShade="D9"/>
+            <w:vAlign w:val="center"/>
+          </w:tcPr>
+          <w:p>
+            <w:pPr>
+              <w:keepNext/>
               <w:jc w:val="center"/>
               <w:rPr>
                 <w:rFonts w:cs="Arial"/>
@@ -1148,19 +1001,21 @@
             </w:pPr>
             <w:r>
               <w:rPr>
-                <w:rFonts w:cs="Arial"/>
-              </w:rPr>
-              <w:t>TEMPLATE_Privacy1</w:t>
-            </w:r>
-          </w:p>
-        </w:tc>
-        <w:tc>
-          <w:tcPr>
-            <w:tcW w:w="942" w:type="dxa"/>
-            <w:vAlign w:val="center"/>
-          </w:tcPr>
-          <w:p>
-            <w:pPr>
+                <w:b/>
+              </w:rPr>
+              <w:t>True</w:t>
+            </w:r>
+          </w:p>
+        </w:tc>
+        <w:tc>
+          <w:tcPr>
+            <w:tcW w:w="0" w:type="auto"/>
+            <w:shd w:val="clear" w:color="auto" w:fill="D9D9D9" w:themeFill="background1" w:themeFillShade="D9"/>
+            <w:vAlign w:val="center"/>
+          </w:tcPr>
+          <w:p>
+            <w:pPr>
+              <w:keepNext/>
               <w:jc w:val="center"/>
               <w:rPr>
                 <w:rFonts w:cs="Arial"/>
@@ -1168,9 +1023,84 @@
             </w:pPr>
             <w:r>
               <w:rPr>
-                <w:rFonts w:cs="Arial"/>
-              </w:rPr>
-              <w:t>TEMPLATE_Privacy2</w:t>
+                <w:b/>
+              </w:rPr>
+              <w:t>False</w:t>
+            </w:r>
+          </w:p>
+        </w:tc>
+      </w:tr>
+      <w:tr>
+        <w:tc>
+          <w:tcPr>
+            <w:tcW w:w="0" w:type="auto"/>
+            <w:vAlign w:val="center"/>
+          </w:tcPr>
+          <w:p>
+            <w:pPr>
+              <w:rPr>
+                <w:rFonts w:cs="Arial"/>
+              </w:rPr>
+            </w:pPr>
+            <w:r>
+              <w:rPr>
+                <w:rFonts w:cs="Arial"/>
+              </w:rPr>
+              <w:t xml:space="preserve">The institution has the mandate, legislative authority or permission from a </w:t>
+            </w:r>
+            <w:proofErr w:type="gramStart"/>
+            <w:r>
+              <w:rPr>
+                <w:rFonts w:cs="Arial"/>
+              </w:rPr>
+              <w:t>third party</w:t>
+            </w:r>
+            <w:proofErr w:type="gramEnd"/>
+            <w:r>
+              <w:rPr>
+                <w:rFonts w:cs="Arial"/>
+              </w:rPr>
+              <w:t xml:space="preserve"> provider to publish the data or information resource under the Open Government Licence - Canada.</w:t>
+            </w:r>
+          </w:p>
+        </w:tc>
+        <w:tc>
+          <w:tcPr>
+            <w:tcW w:w="0" w:type="auto"/>
+            <w:vAlign w:val="center"/>
+          </w:tcPr>
+          <w:p>
+            <w:pPr>
+              <w:jc w:val="center"/>
+              <w:rPr>
+                <w:rFonts w:cs="Arial"/>
+              </w:rPr>
+            </w:pPr>
+            <w:r>
+              <w:rPr>
+                <w:rFonts w:cs="Arial"/>
+              </w:rPr>
+              <w:t>TEMPLATE_Auth1</w:t>
+            </w:r>
+          </w:p>
+        </w:tc>
+        <w:tc>
+          <w:tcPr>
+            <w:tcW w:w="0" w:type="auto"/>
+            <w:vAlign w:val="center"/>
+          </w:tcPr>
+          <w:p>
+            <w:pPr>
+              <w:jc w:val="center"/>
+              <w:rPr>
+                <w:rFonts w:cs="Arial"/>
+              </w:rPr>
+            </w:pPr>
+            <w:r>
+              <w:rPr>
+                <w:rFonts w:cs="Arial"/>
+              </w:rPr>
+              <w:t>TEMPLATE_Auth2</w:t>
             </w:r>
           </w:p>
         </w:tc>
@@ -1181,33 +1111,34 @@
         </w:tblPrEx>
         <w:tc>
           <w:tcPr>
-            <w:tcW w:w="7688" w:type="dxa"/>
+            <w:tcW w:w="0" w:type="auto"/>
             <w:shd w:val="clear" w:color="auto" w:fill="D9D9D9" w:themeFill="background1" w:themeFillShade="D9"/>
             <w:vAlign w:val="center"/>
           </w:tcPr>
           <w:p>
             <w:pPr>
-              <w:rPr>
-                <w:b/>
-              </w:rPr>
-            </w:pPr>
-            <w:r>
-              <w:rPr>
-                <w:b/>
-              </w:rPr>
-              <w:lastRenderedPageBreak/>
-              <w:t>Access to Information</w:t>
-            </w:r>
-          </w:p>
-        </w:tc>
-        <w:tc>
-          <w:tcPr>
-            <w:tcW w:w="946" w:type="dxa"/>
+              <w:keepNext/>
+              <w:rPr>
+                <w:b/>
+              </w:rPr>
+            </w:pPr>
+            <w:r>
+              <w:rPr>
+                <w:b/>
+              </w:rPr>
+              <w:t>Privacy</w:t>
+            </w:r>
+          </w:p>
+        </w:tc>
+        <w:tc>
+          <w:tcPr>
+            <w:tcW w:w="0" w:type="auto"/>
             <w:shd w:val="clear" w:color="auto" w:fill="D9D9D9" w:themeFill="background1" w:themeFillShade="D9"/>
             <w:vAlign w:val="center"/>
           </w:tcPr>
           <w:p>
             <w:pPr>
+              <w:keepNext/>
               <w:jc w:val="center"/>
               <w:rPr>
                 <w:b/>
@@ -1223,12 +1154,13 @@
         </w:tc>
         <w:tc>
           <w:tcPr>
-            <w:tcW w:w="942" w:type="dxa"/>
+            <w:tcW w:w="0" w:type="auto"/>
             <w:shd w:val="clear" w:color="auto" w:fill="D9D9D9" w:themeFill="background1" w:themeFillShade="D9"/>
             <w:vAlign w:val="center"/>
           </w:tcPr>
           <w:p>
             <w:pPr>
+              <w:keepNext/>
               <w:jc w:val="center"/>
               <w:rPr>
                 <w:b/>
@@ -1249,16 +1181,11 @@
         </w:trPr>
         <w:tc>
           <w:tcPr>
-            <w:tcW w:w="7688" w:type="dxa"/>
-            <w:vAlign w:val="center"/>
-          </w:tcPr>
-          <w:p>
-            <w:pPr>
-              <w:pStyle w:val="ListParagraph"/>
-              <w:numPr>
-                <w:ilvl w:val="0"/>
-                <w:numId w:val="3"/>
-              </w:numPr>
+            <w:tcW w:w="0" w:type="auto"/>
+            <w:vAlign w:val="center"/>
+          </w:tcPr>
+          <w:p>
+            <w:pPr>
               <w:rPr>
                 <w:rFonts w:ascii="AvantGarde Bk BT" w:hAnsi="AvantGarde Bk BT"/>
               </w:rPr>
@@ -1267,42 +1194,143 @@
               <w:rPr>
                 <w:rFonts w:cs="Arial"/>
               </w:rPr>
-              <w:t xml:space="preserve">The data or information resource is not subject to any exemptions or exclusions under Section 13 “Exemptions” or Section 68 “Exclusions” of the </w:t>
-            </w:r>
+              <w:t>The data or information resource is not subject to any exemptions or exclusions under the Privacy Act, or redactions under appropriate sections of the Act have been applied in consultation with the Access to Information and Privacy (ATIP) Directorate.</w:t>
+            </w:r>
+          </w:p>
+        </w:tc>
+        <w:tc>
+          <w:tcPr>
+            <w:tcW w:w="0" w:type="auto"/>
+            <w:vAlign w:val="center"/>
+          </w:tcPr>
+          <w:p>
+            <w:pPr>
+              <w:jc w:val="center"/>
+              <w:rPr>
+                <w:rFonts w:cs="Arial"/>
+              </w:rPr>
+            </w:pPr>
+            <w:r>
+              <w:rPr>
+                <w:rFonts w:cs="Arial"/>
+              </w:rPr>
+              <w:t>TEMPLATE_PrivacyA1</w:t>
+            </w:r>
+          </w:p>
+        </w:tc>
+        <w:tc>
+          <w:tcPr>
+            <w:tcW w:w="0" w:type="auto"/>
+            <w:vAlign w:val="center"/>
+          </w:tcPr>
+          <w:p>
+            <w:pPr>
+              <w:jc w:val="center"/>
+              <w:rPr>
+                <w:rFonts w:cs="Arial"/>
+              </w:rPr>
+            </w:pPr>
+            <w:r>
+              <w:rPr>
+                <w:rFonts w:cs="Arial"/>
+              </w:rPr>
+              <w:t>TEMPLATE_PrivacyA2</w:t>
+            </w:r>
+          </w:p>
+        </w:tc>
+      </w:tr>
+      <w:tr>
+        <w:trPr>
+          <w:trHeight w:val="1493"/>
+        </w:trPr>
+        <w:tc>
+          <w:tcPr>
+            <w:tcW w:w="0" w:type="auto"/>
+            <w:vAlign w:val="center"/>
+          </w:tcPr>
+          <w:p>
+            <w:pPr>
+              <w:rPr>
+                <w:rFonts w:cs="Arial"/>
+              </w:rPr>
+            </w:pPr>
+            <w:r>
+              <w:rPr>
+                <w:rFonts w:cs="Arial"/>
+              </w:rPr>
+              <w:t>The data or information resource does not contain personal information, as defined in section 3 of the Privacy Act, unless the individual to whom it relates has consented to its release or unless it meets criteria outlined in section 8(2) of the Privacy Act.</w:t>
+            </w:r>
+          </w:p>
+        </w:tc>
+        <w:tc>
+          <w:tcPr>
+            <w:tcW w:w="0" w:type="auto"/>
+            <w:vAlign w:val="center"/>
+          </w:tcPr>
+          <w:p>
+            <w:pPr>
+              <w:jc w:val="center"/>
+              <w:rPr>
+                <w:rFonts w:cs="Arial"/>
+              </w:rPr>
+            </w:pPr>
+            <w:r>
+              <w:rPr>
+                <w:rFonts w:cs="Arial"/>
+              </w:rPr>
+              <w:t>TEMPLATE_PrivacyB1</w:t>
+            </w:r>
+          </w:p>
+        </w:tc>
+        <w:tc>
+          <w:tcPr>
+            <w:tcW w:w="0" w:type="auto"/>
+            <w:vAlign w:val="center"/>
+          </w:tcPr>
+          <w:p>
+            <w:pPr>
+              <w:jc w:val="center"/>
+              <w:rPr>
+                <w:rFonts w:cs="Arial"/>
+              </w:rPr>
+            </w:pPr>
+            <w:r>
+              <w:rPr>
+                <w:rFonts w:cs="Arial"/>
+              </w:rPr>
+              <w:t>TEMPLATE_PrivacyB2</w:t>
+            </w:r>
+          </w:p>
+        </w:tc>
+      </w:tr>
+      <w:tr>
+        <w:trPr>
+          <w:trHeight w:val="1493"/>
+        </w:trPr>
+        <w:tc>
+          <w:tcPr>
+            <w:tcW w:w="0" w:type="auto"/>
+            <w:vAlign w:val="center"/>
+          </w:tcPr>
+          <w:p>
+            <w:pPr>
+              <w:rPr>
+                <w:rFonts w:cs="Arial"/>
+              </w:rPr>
+            </w:pPr>
             <w:r>
               <w:rPr>
                 <w:rFonts w:cs="Arial"/>
                 <w:i/>
-              </w:rPr>
-              <w:t>Access to Information Act</w:t>
-            </w:r>
-            <w:r>
-              <w:rPr>
-                <w:rFonts w:cs="Arial"/>
-              </w:rPr>
-              <w:t xml:space="preserve">, R.S.C 1985 </w:t>
-            </w:r>
-            <w:r>
-              <w:rPr>
-                <w:rFonts w:ascii="AvantGarde Bk BT" w:hAnsi="AvantGarde Bk BT"/>
-                <w:b/>
-                <w:bCs/>
-              </w:rPr>
-              <w:t>as confirmed by the ATIP Secretariat</w:t>
-            </w:r>
-            <w:r>
-              <w:rPr>
-                <w:rFonts w:ascii="AvantGarde Bk BT" w:hAnsi="AvantGarde Bk BT"/>
-                <w:b/>
-                <w:bCs/>
-              </w:rPr>
-              <w:t>.</w:t>
-            </w:r>
-          </w:p>
-        </w:tc>
-        <w:tc>
-          <w:tcPr>
-            <w:tcW w:w="946" w:type="dxa"/>
+                <w:iCs/>
+              </w:rPr>
+              <w:t>If you are unsure whether the data or information is subject to any exemptions under the Access to Information Act and/or free of personal information in compliance with the Privacy Act, please contact the Access to Information and Privacy (ATIP) Directorate within your department.</w:t>
+            </w:r>
+          </w:p>
+        </w:tc>
+        <w:tc>
+          <w:tcPr>
+            <w:tcW w:w="0" w:type="auto"/>
             <w:vAlign w:val="center"/>
           </w:tcPr>
           <w:p>
@@ -1312,17 +1340,11 @@
                 <w:rFonts w:cs="Arial"/>
               </w:rPr>
             </w:pPr>
-            <w:r>
-              <w:rPr>
-                <w:rFonts w:cs="Arial"/>
-              </w:rPr>
-              <w:t>TEMPLATE_Access1</w:t>
-            </w:r>
-          </w:p>
-        </w:tc>
-        <w:tc>
-          <w:tcPr>
-            <w:tcW w:w="942" w:type="dxa"/>
+          </w:p>
+        </w:tc>
+        <w:tc>
+          <w:tcPr>
+            <w:tcW w:w="0" w:type="auto"/>
             <w:vAlign w:val="center"/>
           </w:tcPr>
           <w:p>
@@ -1332,12 +1354,6 @@
                 <w:rFonts w:cs="Arial"/>
               </w:rPr>
             </w:pPr>
-            <w:r>
-              <w:rPr>
-                <w:rFonts w:cs="Arial"/>
-              </w:rPr>
-              <w:t>TEMPLATE_Access2</w:t>
-            </w:r>
           </w:p>
         </w:tc>
       </w:tr>
@@ -1347,32 +1363,34 @@
         </w:tblPrEx>
         <w:tc>
           <w:tcPr>
-            <w:tcW w:w="7688" w:type="dxa"/>
+            <w:tcW w:w="0" w:type="auto"/>
             <w:shd w:val="clear" w:color="auto" w:fill="D9D9D9" w:themeFill="background1" w:themeFillShade="D9"/>
             <w:vAlign w:val="center"/>
           </w:tcPr>
           <w:p>
             <w:pPr>
-              <w:rPr>
-                <w:b/>
-              </w:rPr>
-            </w:pPr>
-            <w:r>
-              <w:rPr>
-                <w:b/>
-              </w:rPr>
-              <w:t>Security</w:t>
-            </w:r>
-          </w:p>
-        </w:tc>
-        <w:tc>
-          <w:tcPr>
-            <w:tcW w:w="946" w:type="dxa"/>
+              <w:keepNext/>
+              <w:rPr>
+                <w:b/>
+              </w:rPr>
+            </w:pPr>
+            <w:r>
+              <w:rPr>
+                <w:b/>
+              </w:rPr>
+              <w:t>Formats</w:t>
+            </w:r>
+          </w:p>
+        </w:tc>
+        <w:tc>
+          <w:tcPr>
+            <w:tcW w:w="0" w:type="auto"/>
             <w:shd w:val="clear" w:color="auto" w:fill="D9D9D9" w:themeFill="background1" w:themeFillShade="D9"/>
             <w:vAlign w:val="center"/>
           </w:tcPr>
           <w:p>
             <w:pPr>
+              <w:keepNext/>
               <w:jc w:val="center"/>
               <w:rPr>
                 <w:b/>
@@ -1388,12 +1406,13 @@
         </w:tc>
         <w:tc>
           <w:tcPr>
-            <w:tcW w:w="942" w:type="dxa"/>
+            <w:tcW w:w="0" w:type="auto"/>
             <w:shd w:val="clear" w:color="auto" w:fill="D9D9D9" w:themeFill="background1" w:themeFillShade="D9"/>
             <w:vAlign w:val="center"/>
           </w:tcPr>
           <w:p>
             <w:pPr>
+              <w:keepNext/>
               <w:jc w:val="center"/>
               <w:rPr>
                 <w:b/>
@@ -1411,79 +1430,26 @@
       <w:tr>
         <w:tc>
           <w:tcPr>
-            <w:tcW w:w="7688" w:type="dxa"/>
-            <w:vAlign w:val="center"/>
-          </w:tcPr>
-          <w:p>
-            <w:pPr>
-              <w:pStyle w:val="ListParagraph"/>
-              <w:numPr>
-                <w:ilvl w:val="0"/>
-                <w:numId w:val="3"/>
-              </w:numPr>
-              <w:rPr>
-                <w:rFonts w:cs="Arial"/>
-              </w:rPr>
-            </w:pPr>
-            <w:r>
-              <w:rPr>
-                <w:rFonts w:cs="Arial"/>
-              </w:rPr>
-              <w:t xml:space="preserve">The data or information resource </w:t>
-            </w:r>
-            <w:r>
-              <w:rPr>
-                <w:rFonts w:cs="Arial"/>
-              </w:rPr>
-              <w:t xml:space="preserve">is not </w:t>
-            </w:r>
-            <w:r>
-              <w:rPr>
-                <w:rFonts w:cs="Arial"/>
-              </w:rPr>
-              <w:t>Classified</w:t>
-            </w:r>
-            <w:r>
-              <w:rPr>
-                <w:rFonts w:cs="Arial"/>
-              </w:rPr>
-              <w:t xml:space="preserve"> or Protected and its release complies </w:t>
-            </w:r>
-            <w:r>
-              <w:rPr>
-                <w:rFonts w:cs="Arial"/>
-              </w:rPr>
-              <w:t xml:space="preserve">with </w:t>
-            </w:r>
-            <w:r>
-              <w:rPr>
-                <w:rFonts w:cs="Arial"/>
-              </w:rPr>
-              <w:t xml:space="preserve">the </w:t>
-            </w:r>
-            <w:r>
-              <w:rPr>
-                <w:rFonts w:cs="Arial"/>
-              </w:rPr>
-              <w:t>Government of Canada Policy on Government Security</w:t>
-            </w:r>
-            <w:r>
-              <w:rPr>
-                <w:rFonts w:cs="Arial"/>
-              </w:rPr>
-              <w:t>.</w:t>
-            </w:r>
-            <w:r>
-              <w:rPr>
-                <w:rFonts w:cs="Arial"/>
-              </w:rPr>
-              <w:tab/>
-            </w:r>
-          </w:p>
-        </w:tc>
-        <w:tc>
-          <w:tcPr>
-            <w:tcW w:w="946" w:type="dxa"/>
+            <w:tcW w:w="0" w:type="auto"/>
+            <w:vAlign w:val="center"/>
+          </w:tcPr>
+          <w:p>
+            <w:pPr>
+              <w:rPr>
+                <w:rFonts w:cs="Arial"/>
+              </w:rPr>
+            </w:pPr>
+            <w:r>
+              <w:rPr>
+                <w:rFonts w:cs="Arial"/>
+              </w:rPr>
+              <w:t>The data or information resource is in an open and accessible format that complies with the Standard on Web Accessibility.</w:t>
+            </w:r>
+          </w:p>
+        </w:tc>
+        <w:tc>
+          <w:tcPr>
+            <w:tcW w:w="0" w:type="auto"/>
             <w:vAlign w:val="center"/>
           </w:tcPr>
           <w:p>
@@ -1497,13 +1463,13 @@
               <w:rPr>
                 <w:rFonts w:cs="Arial"/>
               </w:rPr>
-              <w:t>TEMPLATE_Security1</w:t>
-            </w:r>
-          </w:p>
-        </w:tc>
-        <w:tc>
-          <w:tcPr>
-            <w:tcW w:w="942" w:type="dxa"/>
+              <w:t>TEMPLATE_FormatA1</w:t>
+            </w:r>
+          </w:p>
+        </w:tc>
+        <w:tc>
+          <w:tcPr>
+            <w:tcW w:w="0" w:type="auto"/>
             <w:vAlign w:val="center"/>
           </w:tcPr>
           <w:p>
@@ -1517,7 +1483,129 @@
               <w:rPr>
                 <w:rFonts w:cs="Arial"/>
               </w:rPr>
-              <w:t>TEMPLATE_Security2</w:t>
+              <w:t>TEMPLATE_FormatA2</w:t>
+            </w:r>
+          </w:p>
+        </w:tc>
+      </w:tr>
+      <w:tr>
+        <w:tc>
+          <w:tcPr>
+            <w:tcW w:w="0" w:type="auto"/>
+            <w:vAlign w:val="center"/>
+          </w:tcPr>
+          <w:p>
+            <w:pPr>
+              <w:rPr>
+                <w:rFonts w:cs="Arial"/>
+              </w:rPr>
+            </w:pPr>
+            <w:r>
+              <w:rPr>
+                <w:rFonts w:cs="Arial"/>
+              </w:rPr>
+              <w:t>Datasets are provided in machine-readable / machine-processable format.</w:t>
+            </w:r>
+          </w:p>
+        </w:tc>
+        <w:tc>
+          <w:tcPr>
+            <w:tcW w:w="0" w:type="auto"/>
+            <w:vAlign w:val="center"/>
+          </w:tcPr>
+          <w:p>
+            <w:pPr>
+              <w:jc w:val="center"/>
+              <w:rPr>
+                <w:rFonts w:cs="Arial"/>
+              </w:rPr>
+            </w:pPr>
+            <w:r>
+              <w:rPr>
+                <w:rFonts w:cs="Arial"/>
+              </w:rPr>
+              <w:t>TEMPLATE_FormatB1</w:t>
+            </w:r>
+          </w:p>
+        </w:tc>
+        <w:tc>
+          <w:tcPr>
+            <w:tcW w:w="0" w:type="auto"/>
+            <w:vAlign w:val="center"/>
+          </w:tcPr>
+          <w:p>
+            <w:pPr>
+              <w:jc w:val="center"/>
+              <w:rPr>
+                <w:rFonts w:cs="Arial"/>
+              </w:rPr>
+            </w:pPr>
+            <w:r>
+              <w:rPr>
+                <w:rFonts w:cs="Arial"/>
+              </w:rPr>
+              <w:t>TEMPLATE_FormatB2</w:t>
+            </w:r>
+          </w:p>
+        </w:tc>
+      </w:tr>
+      <w:tr>
+        <w:tc>
+          <w:tcPr>
+            <w:tcW w:w="0" w:type="auto"/>
+            <w:vAlign w:val="center"/>
+          </w:tcPr>
+          <w:p>
+            <w:pPr>
+              <w:rPr>
+                <w:rFonts w:cs="Arial"/>
+              </w:rPr>
+            </w:pPr>
+            <w:r>
+              <w:rPr>
+                <w:rFonts w:cs="Arial"/>
+              </w:rPr>
+              <w:t>Information resources are provided in open, non-proprietary formats.</w:t>
+            </w:r>
+          </w:p>
+        </w:tc>
+        <w:tc>
+          <w:tcPr>
+            <w:tcW w:w="0" w:type="auto"/>
+            <w:vAlign w:val="center"/>
+          </w:tcPr>
+          <w:p>
+            <w:pPr>
+              <w:jc w:val="center"/>
+              <w:rPr>
+                <w:rFonts w:cs="Arial"/>
+              </w:rPr>
+            </w:pPr>
+            <w:r>
+              <w:rPr>
+                <w:rFonts w:cs="Arial"/>
+              </w:rPr>
+              <w:t>TEMPLATE_FormatC1</w:t>
+            </w:r>
+          </w:p>
+        </w:tc>
+        <w:tc>
+          <w:tcPr>
+            <w:tcW w:w="0" w:type="auto"/>
+            <w:vAlign w:val="center"/>
+          </w:tcPr>
+          <w:p>
+            <w:pPr>
+              <w:jc w:val="center"/>
+              <w:rPr>
+                <w:rFonts w:cs="Arial"/>
+              </w:rPr>
+            </w:pPr>
+            <w:r>
+              <w:rPr>
+                <w:rFonts w:cs="Arial"/>
+              </w:rPr>
+              <w:t>TEMPLATE_FormatC2</w:t>
             </w:r>
           </w:p>
         </w:tc>
@@ -1528,32 +1616,34 @@
         </w:tblPrEx>
         <w:tc>
           <w:tcPr>
-            <w:tcW w:w="7688" w:type="dxa"/>
+            <w:tcW w:w="0" w:type="auto"/>
             <w:shd w:val="clear" w:color="auto" w:fill="D9D9D9" w:themeFill="background1" w:themeFillShade="D9"/>
             <w:vAlign w:val="center"/>
           </w:tcPr>
           <w:p>
             <w:pPr>
-              <w:rPr>
-                <w:b/>
-              </w:rPr>
-            </w:pPr>
-            <w:r>
-              <w:rPr>
-                <w:b/>
-              </w:rPr>
-              <w:t>Cost</w:t>
-            </w:r>
-          </w:p>
-        </w:tc>
-        <w:tc>
-          <w:tcPr>
-            <w:tcW w:w="946" w:type="dxa"/>
+              <w:keepNext/>
+              <w:rPr>
+                <w:b/>
+              </w:rPr>
+            </w:pPr>
+            <w:r>
+              <w:rPr>
+                <w:b/>
+              </w:rPr>
+              <w:t>Official Languages</w:t>
+            </w:r>
+          </w:p>
+        </w:tc>
+        <w:tc>
+          <w:tcPr>
+            <w:tcW w:w="0" w:type="auto"/>
             <w:shd w:val="clear" w:color="auto" w:fill="D9D9D9" w:themeFill="background1" w:themeFillShade="D9"/>
             <w:vAlign w:val="center"/>
           </w:tcPr>
           <w:p>
             <w:pPr>
+              <w:keepNext/>
               <w:jc w:val="center"/>
               <w:rPr>
                 <w:b/>
@@ -1569,12 +1659,13 @@
         </w:tc>
         <w:tc>
           <w:tcPr>
-            <w:tcW w:w="942" w:type="dxa"/>
+            <w:tcW w:w="0" w:type="auto"/>
             <w:shd w:val="clear" w:color="auto" w:fill="D9D9D9" w:themeFill="background1" w:themeFillShade="D9"/>
             <w:vAlign w:val="center"/>
           </w:tcPr>
           <w:p>
             <w:pPr>
+              <w:keepNext/>
               <w:jc w:val="center"/>
               <w:rPr>
                 <w:b/>
@@ -1592,37 +1683,26 @@
       <w:tr>
         <w:tc>
           <w:tcPr>
-            <w:tcW w:w="7688" w:type="dxa"/>
-            <w:vAlign w:val="center"/>
-          </w:tcPr>
-          <w:p>
-            <w:pPr>
-              <w:pStyle w:val="ListParagraph"/>
-              <w:numPr>
-                <w:ilvl w:val="0"/>
-                <w:numId w:val="3"/>
-              </w:numPr>
-              <w:rPr>
-                <w:rFonts w:cs="Arial"/>
-              </w:rPr>
-            </w:pPr>
-            <w:r>
-              <w:rPr>
-                <w:rFonts w:cs="Arial"/>
-              </w:rPr>
-              <w:t>The data or information resource can be released to the public without fee.</w:t>
-            </w:r>
-            <w:r>
-              <w:rPr>
-                <w:rFonts w:cs="Arial"/>
-              </w:rPr>
-              <w:t xml:space="preserve"> </w:t>
-            </w:r>
-          </w:p>
-        </w:tc>
-        <w:tc>
-          <w:tcPr>
-            <w:tcW w:w="946" w:type="dxa"/>
+            <w:tcW w:w="0" w:type="auto"/>
+            <w:vAlign w:val="center"/>
+          </w:tcPr>
+          <w:p>
+            <w:pPr>
+              <w:rPr>
+                <w:rFonts w:cs="Arial"/>
+              </w:rPr>
+            </w:pPr>
+            <w:r>
+              <w:rPr>
+                <w:rFonts w:cs="Arial"/>
+              </w:rPr>
+              <w:t>The data or information resource is available in both official languages and conforms to the requirements of the Official Languages Act.</w:t>
+            </w:r>
+          </w:p>
+        </w:tc>
+        <w:tc>
+          <w:tcPr>
+            <w:tcW w:w="0" w:type="auto"/>
             <w:vAlign w:val="center"/>
           </w:tcPr>
           <w:p>
@@ -1636,13 +1716,13 @@
               <w:rPr>
                 <w:rFonts w:cs="Arial"/>
               </w:rPr>
-              <w:t>TEMPLATE_Cost1</w:t>
-            </w:r>
-          </w:p>
-        </w:tc>
-        <w:tc>
-          <w:tcPr>
-            <w:tcW w:w="942" w:type="dxa"/>
+              <w:t>TEMPLATE_Lang1</w:t>
+            </w:r>
+          </w:p>
+        </w:tc>
+        <w:tc>
+          <w:tcPr>
+            <w:tcW w:w="0" w:type="auto"/>
             <w:vAlign w:val="center"/>
           </w:tcPr>
           <w:p>
@@ -1656,7 +1736,7 @@
               <w:rPr>
                 <w:rFonts w:cs="Arial"/>
               </w:rPr>
-              <w:t>TEMPLATE_Cost2</w:t>
+              <w:t>TEMPLATE_Lang2</w:t>
             </w:r>
           </w:p>
         </w:tc>
@@ -1664,30 +1744,32 @@
       <w:tr>
         <w:tc>
           <w:tcPr>
-            <w:tcW w:w="7688" w:type="dxa"/>
+            <w:tcW w:w="0" w:type="auto"/>
             <w:shd w:val="clear" w:color="auto" w:fill="D9D9D9" w:themeFill="background1" w:themeFillShade="D9"/>
           </w:tcPr>
           <w:p>
             <w:pPr>
-              <w:rPr>
-                <w:b/>
-              </w:rPr>
-            </w:pPr>
-            <w:r>
-              <w:rPr>
-                <w:b/>
-              </w:rPr>
-              <w:t>Format</w:t>
-            </w:r>
-          </w:p>
-        </w:tc>
-        <w:tc>
-          <w:tcPr>
-            <w:tcW w:w="946" w:type="dxa"/>
+              <w:keepNext/>
+              <w:rPr>
+                <w:b/>
+              </w:rPr>
+            </w:pPr>
+            <w:r>
+              <w:rPr>
+                <w:b/>
+              </w:rPr>
+              <w:t>Security</w:t>
+            </w:r>
+          </w:p>
+        </w:tc>
+        <w:tc>
+          <w:tcPr>
+            <w:tcW w:w="0" w:type="auto"/>
             <w:shd w:val="clear" w:color="auto" w:fill="D9D9D9" w:themeFill="background1" w:themeFillShade="D9"/>
           </w:tcPr>
           <w:p>
             <w:pPr>
+              <w:keepNext/>
               <w:jc w:val="center"/>
               <w:rPr>
                 <w:b/>
@@ -1703,11 +1785,12 @@
         </w:tc>
         <w:tc>
           <w:tcPr>
-            <w:tcW w:w="942" w:type="dxa"/>
+            <w:tcW w:w="0" w:type="auto"/>
             <w:shd w:val="clear" w:color="auto" w:fill="D9D9D9" w:themeFill="background1" w:themeFillShade="D9"/>
           </w:tcPr>
           <w:p>
             <w:pPr>
+              <w:keepNext/>
               <w:jc w:val="center"/>
               <w:rPr>
                 <w:b/>
@@ -1725,72 +1808,32 @@
       <w:tr>
         <w:tc>
           <w:tcPr>
-            <w:tcW w:w="7688" w:type="dxa"/>
-          </w:tcPr>
-          <w:p>
-            <w:pPr>
-              <w:pStyle w:val="ListParagraph"/>
-              <w:numPr>
-                <w:ilvl w:val="0"/>
-                <w:numId w:val="3"/>
-              </w:numPr>
-              <w:rPr>
-                <w:rFonts w:cs="Arial"/>
-              </w:rPr>
-            </w:pPr>
-            <w:r>
-              <w:rPr>
-                <w:rFonts w:cs="Arial"/>
-              </w:rPr>
-              <w:t xml:space="preserve">    A)   </w:t>
-            </w:r>
-            <w:r>
-              <w:rPr>
-                <w:rFonts w:cs="Arial"/>
-              </w:rPr>
-              <w:t>Data</w:t>
-            </w:r>
-            <w:r>
-              <w:rPr>
-                <w:rFonts w:cs="Arial"/>
-              </w:rPr>
-              <w:t>sets</w:t>
-            </w:r>
-            <w:r>
-              <w:rPr>
-                <w:rFonts w:cs="Arial"/>
-              </w:rPr>
-              <w:t xml:space="preserve"> are</w:t>
-            </w:r>
-            <w:r>
-              <w:rPr>
-                <w:rFonts w:cs="Arial"/>
-              </w:rPr>
-              <w:t xml:space="preserve"> provided</w:t>
-            </w:r>
-            <w:r>
-              <w:rPr>
-                <w:rFonts w:cs="Arial"/>
-              </w:rPr>
-              <w:t xml:space="preserve"> in machine-readable </w:t>
-            </w:r>
-            <w:r>
-              <w:rPr>
-                <w:rFonts w:cs="Arial"/>
-              </w:rPr>
-              <w:t xml:space="preserve">/ </w:t>
-            </w:r>
-            <w:r>
-              <w:rPr>
-                <w:rFonts w:cs="Arial"/>
-              </w:rPr>
-              <w:t xml:space="preserve">machine-processable format. </w:t>
-            </w:r>
-          </w:p>
-        </w:tc>
-        <w:tc>
-          <w:tcPr>
-            <w:tcW w:w="946" w:type="dxa"/>
+            <w:tcW w:w="0" w:type="auto"/>
+          </w:tcPr>
+          <w:p>
+            <w:pPr>
+              <w:rPr>
+                <w:rFonts w:cs="Arial"/>
+              </w:rPr>
+            </w:pPr>
+            <w:r>
+              <w:rPr>
+                <w:rFonts w:cs="Arial"/>
+              </w:rPr>
+              <w:t xml:space="preserve">The data or information resource does not increase security risks to the institution, to other institutions, or to the government as a </w:t>
+            </w:r>
+            <w:r>
+              <w:rPr>
+                <w:rFonts w:cs="Arial"/>
+              </w:rPr>
+              <w:lastRenderedPageBreak/>
+              <w:t>whole and conforms to the requirements of the Policy on Government Security and its related instruments.</w:t>
+            </w:r>
+          </w:p>
+        </w:tc>
+        <w:tc>
+          <w:tcPr>
+            <w:tcW w:w="0" w:type="auto"/>
           </w:tcPr>
           <w:p>
             <w:pPr>
@@ -1803,13 +1846,14 @@
               <w:rPr>
                 <w:rFonts w:cs="Arial"/>
               </w:rPr>
-              <w:t>TEMPLATE_FormatA1</w:t>
-            </w:r>
-          </w:p>
-        </w:tc>
-        <w:tc>
-          <w:tcPr>
-            <w:tcW w:w="942" w:type="dxa"/>
+              <w:lastRenderedPageBreak/>
+              <w:t>TEMPLATE_Security1</w:t>
+            </w:r>
+          </w:p>
+        </w:tc>
+        <w:tc>
+          <w:tcPr>
+            <w:tcW w:w="0" w:type="auto"/>
           </w:tcPr>
           <w:p>
             <w:pPr>
@@ -1822,7 +1866,7 @@
               <w:rPr>
                 <w:rFonts w:cs="Arial"/>
               </w:rPr>
-              <w:t>TEMPLATE_FormatA2</w:t>
+              <w:t>TEMPLATE_Security2</w:t>
             </w:r>
           </w:p>
         </w:tc>
@@ -1830,31 +1874,29 @@
       <w:tr>
         <w:tc>
           <w:tcPr>
-            <w:tcW w:w="7688" w:type="dxa"/>
-          </w:tcPr>
-          <w:p>
-            <w:pPr>
-              <w:rPr>
-                <w:rFonts w:cs="Arial"/>
-              </w:rPr>
-            </w:pPr>
-            <w:r>
-              <w:rPr>
-                <w:rFonts w:cs="Arial"/>
-              </w:rPr>
-              <w:t xml:space="preserve">           B)    </w:t>
-            </w:r>
-            <w:r>
-              <w:rPr>
-                <w:rFonts w:cs="Arial"/>
-              </w:rPr>
-              <w:t>Information resources are provided in open, non-proprietary formats.</w:t>
-            </w:r>
-          </w:p>
-        </w:tc>
-        <w:tc>
-          <w:tcPr>
-            <w:tcW w:w="946" w:type="dxa"/>
+            <w:tcW w:w="0" w:type="auto"/>
+          </w:tcPr>
+          <w:p>
+            <w:pPr>
+              <w:rPr>
+                <w:rFonts w:cs="Arial"/>
+                <w:i/>
+                <w:iCs/>
+              </w:rPr>
+            </w:pPr>
+            <w:r>
+              <w:rPr>
+                <w:rFonts w:cs="Arial"/>
+                <w:i/>
+                <w:iCs/>
+              </w:rPr>
+              <w:t>For advice on declassification and other security matters concerning the release of data or information, contact your departmental security directorate.</w:t>
+            </w:r>
+          </w:p>
+        </w:tc>
+        <w:tc>
+          <w:tcPr>
+            <w:tcW w:w="0" w:type="auto"/>
           </w:tcPr>
           <w:p>
             <w:pPr>
@@ -1863,17 +1905,11 @@
                 <w:rFonts w:cs="Arial"/>
               </w:rPr>
             </w:pPr>
-            <w:r>
-              <w:rPr>
-                <w:rFonts w:cs="Arial"/>
-              </w:rPr>
-              <w:t>TEMPLATE_FormatB1</w:t>
-            </w:r>
-          </w:p>
-        </w:tc>
-        <w:tc>
-          <w:tcPr>
-            <w:tcW w:w="942" w:type="dxa"/>
+          </w:p>
+        </w:tc>
+        <w:tc>
+          <w:tcPr>
+            <w:tcW w:w="0" w:type="auto"/>
           </w:tcPr>
           <w:p>
             <w:pPr>
@@ -1882,45 +1918,41 @@
                 <w:rFonts w:cs="Arial"/>
               </w:rPr>
             </w:pPr>
-            <w:r>
-              <w:rPr>
-                <w:rFonts w:cs="Arial"/>
-              </w:rPr>
-              <w:t>TEMPLATE_FormatB2</w:t>
-            </w:r>
           </w:p>
         </w:tc>
       </w:tr>
       <w:tr>
         <w:tc>
           <w:tcPr>
-            <w:tcW w:w="7688" w:type="dxa"/>
-          </w:tcPr>
-          <w:p>
-            <w:pPr>
-              <w:pStyle w:val="ListParagraph"/>
-              <w:numPr>
-                <w:ilvl w:val="0"/>
-                <w:numId w:val="3"/>
-              </w:numPr>
-              <w:rPr>
-                <w:rFonts w:cs="Arial"/>
-              </w:rPr>
-            </w:pPr>
-            <w:r>
-              <w:rPr>
-                <w:rFonts w:cs="Arial"/>
-              </w:rPr>
-              <w:t>Metadata in both official languages conforming to the applicable Government of Canada metadata standard is provided for each dataset or information resource.</w:t>
-            </w:r>
-          </w:p>
-        </w:tc>
-        <w:tc>
-          <w:tcPr>
-            <w:tcW w:w="946" w:type="dxa"/>
-          </w:tcPr>
-          <w:p>
-            <w:pPr>
+            <w:tcW w:w="0" w:type="auto"/>
+            <w:shd w:val="clear" w:color="auto" w:fill="D9D9D9" w:themeFill="background1" w:themeFillShade="D9"/>
+          </w:tcPr>
+          <w:p>
+            <w:pPr>
+              <w:keepNext/>
+              <w:rPr>
+                <w:rFonts w:cs="Arial"/>
+                <w:i/>
+                <w:iCs/>
+              </w:rPr>
+            </w:pPr>
+            <w:r>
+              <w:rPr>
+                <w:rFonts w:cs="Arial"/>
+                <w:b/>
+              </w:rPr>
+              <w:t>Other - Legal / Regulatory / Policy / Contractual</w:t>
+            </w:r>
+          </w:p>
+        </w:tc>
+        <w:tc>
+          <w:tcPr>
+            <w:tcW w:w="0" w:type="auto"/>
+            <w:shd w:val="clear" w:color="auto" w:fill="D9D9D9" w:themeFill="background1" w:themeFillShade="D9"/>
+          </w:tcPr>
+          <w:p>
+            <w:pPr>
+              <w:keepNext/>
               <w:jc w:val="center"/>
               <w:rPr>
                 <w:rFonts w:cs="Arial"/>
@@ -1928,18 +1960,20 @@
             </w:pPr>
             <w:r>
               <w:rPr>
-                <w:rFonts w:cs="Arial"/>
-              </w:rPr>
-              <w:t>TEMPLATE_FormatC1</w:t>
-            </w:r>
-          </w:p>
-        </w:tc>
-        <w:tc>
-          <w:tcPr>
-            <w:tcW w:w="942" w:type="dxa"/>
-          </w:tcPr>
-          <w:p>
-            <w:pPr>
+                <w:b/>
+              </w:rPr>
+              <w:t>True</w:t>
+            </w:r>
+          </w:p>
+        </w:tc>
+        <w:tc>
+          <w:tcPr>
+            <w:tcW w:w="0" w:type="auto"/>
+            <w:shd w:val="clear" w:color="auto" w:fill="D9D9D9" w:themeFill="background1" w:themeFillShade="D9"/>
+          </w:tcPr>
+          <w:p>
+            <w:pPr>
+              <w:keepNext/>
               <w:jc w:val="center"/>
               <w:rPr>
                 <w:rFonts w:cs="Arial"/>
@@ -1947,9 +1981,9 @@
             </w:pPr>
             <w:r>
               <w:rPr>
-                <w:rFonts w:cs="Arial"/>
-              </w:rPr>
-              <w:t>TEMPLATE_FormatC2</w:t>
+                <w:b/>
+              </w:rPr>
+              <w:t>False</w:t>
             </w:r>
           </w:p>
         </w:tc>
@@ -1957,29 +1991,29 @@
       <w:tr>
         <w:tc>
           <w:tcPr>
-            <w:tcW w:w="7688" w:type="dxa"/>
-            <w:shd w:val="clear" w:color="auto" w:fill="D9D9D9" w:themeFill="background1" w:themeFillShade="D9"/>
-          </w:tcPr>
-          <w:p>
-            <w:pPr>
-              <w:rPr>
-                <w:rFonts w:cs="Arial"/>
-                <w:b/>
-              </w:rPr>
-            </w:pPr>
-            <w:r>
-              <w:rPr>
-                <w:rFonts w:cs="Arial"/>
-                <w:b/>
-              </w:rPr>
-              <w:t>Blanket Approval</w:t>
-            </w:r>
-          </w:p>
-        </w:tc>
-        <w:tc>
-          <w:tcPr>
-            <w:tcW w:w="946" w:type="dxa"/>
-            <w:shd w:val="clear" w:color="auto" w:fill="D9D9D9" w:themeFill="background1" w:themeFillShade="D9"/>
+            <w:tcW w:w="0" w:type="auto"/>
+            <w:shd w:val="clear" w:color="auto" w:fill="auto"/>
+          </w:tcPr>
+          <w:p>
+            <w:pPr>
+              <w:rPr>
+                <w:rFonts w:cs="Arial"/>
+                <w:bCs/>
+              </w:rPr>
+            </w:pPr>
+            <w:r>
+              <w:rPr>
+                <w:rFonts w:cs="Arial"/>
+                <w:bCs/>
+              </w:rPr>
+              <w:t>The release of data or other information resource complies with all other relevant legal, regulatory, contractual, and policy requirements, for example, it is confirmed that there are no relevant legal, contractual, or third party, policy restrictions or limitations.</w:t>
+            </w:r>
+          </w:p>
+        </w:tc>
+        <w:tc>
+          <w:tcPr>
+            <w:tcW w:w="0" w:type="auto"/>
+            <w:shd w:val="clear" w:color="auto" w:fill="auto"/>
           </w:tcPr>
           <w:p>
             <w:pPr>
@@ -1990,16 +2024,16 @@
             </w:pPr>
             <w:r>
               <w:rPr>
-                <w:b/>
-              </w:rPr>
-              <w:t>True</w:t>
-            </w:r>
-          </w:p>
-        </w:tc>
-        <w:tc>
-          <w:tcPr>
-            <w:tcW w:w="942" w:type="dxa"/>
-            <w:shd w:val="clear" w:color="auto" w:fill="D9D9D9" w:themeFill="background1" w:themeFillShade="D9"/>
+                <w:rFonts w:cs="Arial"/>
+              </w:rPr>
+              <w:t>TEMPLATE_Misc1</w:t>
+            </w:r>
+          </w:p>
+        </w:tc>
+        <w:tc>
+          <w:tcPr>
+            <w:tcW w:w="0" w:type="auto"/>
+            <w:shd w:val="clear" w:color="auto" w:fill="auto"/>
           </w:tcPr>
           <w:p>
             <w:pPr>
@@ -2010,9 +2044,9 @@
             </w:pPr>
             <w:r>
               <w:rPr>
-                <w:b/>
-              </w:rPr>
-              <w:t>False</w:t>
+                <w:rFonts w:cs="Arial"/>
+              </w:rPr>
+              <w:t>TEMPLATE_Misc2</w:t>
             </w:r>
           </w:p>
         </w:tc>
@@ -2020,15 +2054,78 @@
       <w:tr>
         <w:tc>
           <w:tcPr>
-            <w:tcW w:w="7688" w:type="dxa"/>
-          </w:tcPr>
-          <w:p>
-            <w:pPr>
-              <w:pStyle w:val="ListParagraph"/>
-              <w:numPr>
-                <w:ilvl w:val="0"/>
-                <w:numId w:val="3"/>
-              </w:numPr>
+            <w:tcW w:w="0" w:type="auto"/>
+            <w:shd w:val="clear" w:color="auto" w:fill="D9D9D9" w:themeFill="background1" w:themeFillShade="D9"/>
+          </w:tcPr>
+          <w:p>
+            <w:pPr>
+              <w:keepNext/>
+              <w:rPr>
+                <w:rFonts w:cs="Arial"/>
+                <w:b/>
+              </w:rPr>
+            </w:pPr>
+            <w:bookmarkStart w:id="0" w:name="_Hlk188369740"/>
+            <w:r>
+              <w:rPr>
+                <w:rFonts w:cs="Arial"/>
+                <w:b/>
+              </w:rPr>
+              <w:t>Blanket Approval</w:t>
+            </w:r>
+          </w:p>
+        </w:tc>
+        <w:tc>
+          <w:tcPr>
+            <w:tcW w:w="0" w:type="auto"/>
+            <w:shd w:val="clear" w:color="auto" w:fill="D9D9D9" w:themeFill="background1" w:themeFillShade="D9"/>
+          </w:tcPr>
+          <w:p>
+            <w:pPr>
+              <w:keepNext/>
+              <w:jc w:val="center"/>
+              <w:rPr>
+                <w:b/>
+              </w:rPr>
+            </w:pPr>
+            <w:r>
+              <w:rPr>
+                <w:b/>
+              </w:rPr>
+              <w:t>True</w:t>
+            </w:r>
+          </w:p>
+        </w:tc>
+        <w:tc>
+          <w:tcPr>
+            <w:tcW w:w="0" w:type="auto"/>
+            <w:shd w:val="clear" w:color="auto" w:fill="D9D9D9" w:themeFill="background1" w:themeFillShade="D9"/>
+          </w:tcPr>
+          <w:p>
+            <w:pPr>
+              <w:keepNext/>
+              <w:jc w:val="center"/>
+              <w:rPr>
+                <w:b/>
+              </w:rPr>
+            </w:pPr>
+            <w:r>
+              <w:rPr>
+                <w:b/>
+              </w:rPr>
+              <w:t>False</w:t>
+            </w:r>
+          </w:p>
+        </w:tc>
+      </w:tr>
+      <w:bookmarkEnd w:id="0"/>
+      <w:tr>
+        <w:tc>
+          <w:tcPr>
+            <w:tcW w:w="0" w:type="auto"/>
+          </w:tcPr>
+          <w:p>
+            <w:pPr>
               <w:rPr>
                 <w:iCs/>
               </w:rPr>
@@ -2051,7 +2148,7 @@
           </w:p>
           <w:p>
             <w:pPr>
-              <w:ind w:left="360"/>
+              <w:ind w:left="22"/>
               <w:rPr>
                 <w:iCs/>
               </w:rPr>
@@ -2066,142 +2163,57 @@
               <w:rPr>
                 <w:iCs/>
               </w:rPr>
-              <w:t> </w:t>
+              <w:t xml:space="preserve">   </w:t>
             </w:r>
             <w:r>
               <w:rPr>
                 <w:iCs/>
               </w:rPr>
-              <w:t xml:space="preserve">  </w:t>
-            </w:r>
+              <w:t xml:space="preserve">Existing dataset will be updated on an on-going </w:t>
+            </w:r>
+            <w:proofErr w:type="gramStart"/>
             <w:r>
               <w:rPr>
                 <w:iCs/>
               </w:rPr>
-              <w:t>Existing dataset will be updated on an on-going basis</w:t>
-            </w:r>
-          </w:p>
-          <w:p>
-            <w:pPr>
-              <w:ind w:left="360"/>
+              <w:t>basis</w:t>
+            </w:r>
+            <w:proofErr w:type="gramEnd"/>
+          </w:p>
+          <w:p>
+            <w:pPr>
+              <w:ind w:left="22"/>
+              <w:rPr>
+                <w:rFonts w:eastAsia="Times New Roman"/>
+              </w:rPr>
+            </w:pPr>
+            <w:r>
               <w:rPr>
                 <w:iCs/>
               </w:rPr>
-            </w:pPr>
+              <w:t>TEMPLATE_BlkApprov4</w:t>
+            </w:r>
             <w:r>
               <w:rPr>
                 <w:iCs/>
               </w:rPr>
-              <w:t>TEMPLATE_BlkApprov2</w:t>
-            </w:r>
-            <w:r>
+              <w:t xml:space="preserve">   </w:t>
+            </w:r>
+            <w:r>
+              <w:rPr>
+                <w:rFonts w:eastAsia="Times New Roman"/>
+              </w:rPr>
+              <w:t xml:space="preserve">Other, please state: </w:t>
+            </w:r>
+          </w:p>
+          <w:p>
+            <w:pPr>
+              <w:ind w:left="22"/>
               <w:rPr>
                 <w:iCs/>
               </w:rPr>
-              <w:t> </w:t>
-            </w:r>
-            <w:r>
-              <w:rPr>
-                <w:iCs/>
-              </w:rPr>
-              <w:t xml:space="preserve">  </w:t>
-            </w:r>
-            <w:r>
-              <w:rPr>
-                <w:iCs/>
-              </w:rPr>
-              <w:t>Represents a collection of datasets or data products with a consistently applied specification or model</w:t>
-            </w:r>
-          </w:p>
-          <w:p>
-            <w:pPr>
-              <w:ind w:left="360"/>
-              <w:rPr>
-                <w:iCs/>
-              </w:rPr>
-            </w:pPr>
-            <w:r>
-              <w:rPr>
-                <w:iCs/>
-              </w:rPr>
-              <w:t>TEMPLATE_BlkApprov3</w:t>
-            </w:r>
-            <w:r>
-              <w:rPr>
-                <w:iCs/>
-              </w:rPr>
-              <w:t> </w:t>
-            </w:r>
-            <w:r>
-              <w:rPr>
-                <w:iCs/>
-              </w:rPr>
-              <w:t xml:space="preserve">  </w:t>
-            </w:r>
-            <w:r>
-              <w:rPr>
-                <w:iCs/>
-              </w:rPr>
-              <w:t>Represents a series of observation data</w:t>
-            </w:r>
-            <w:r>
-              <w:rPr>
-                <w:iCs/>
-              </w:rPr>
-              <w:t xml:space="preserve">, </w:t>
-            </w:r>
-            <w:r>
-              <w:rPr>
-                <w:rFonts w:eastAsia="Times New Roman"/>
-              </w:rPr>
-              <w:t>such as data collected from in-situ sensors.</w:t>
-            </w:r>
-          </w:p>
-          <w:p>
-            <w:pPr>
-              <w:ind w:left="360"/>
-              <w:rPr>
-                <w:rFonts w:eastAsia="Times New Roman"/>
-              </w:rPr>
-            </w:pPr>
-            <w:r>
-              <w:rPr>
-                <w:iCs/>
-              </w:rPr>
-              <w:t>TEMPLATE_BlkApprov4</w:t>
-            </w:r>
-            <w:r>
-              <w:rPr>
-                <w:iCs/>
-              </w:rPr>
-              <w:t> </w:t>
-            </w:r>
-            <w:r>
-              <w:rPr>
-                <w:iCs/>
-              </w:rPr>
-              <w:t xml:space="preserve">  </w:t>
-            </w:r>
-            <w:r>
-              <w:rPr>
-                <w:rFonts w:eastAsia="Times New Roman"/>
-              </w:rPr>
-              <w:t>Other, please state:</w:t>
-            </w:r>
-            <w:r>
-              <w:rPr>
-                <w:rFonts w:eastAsia="Times New Roman"/>
-              </w:rPr>
-              <w:t xml:space="preserve"> </w:t>
-            </w:r>
-          </w:p>
-          <w:p>
-            <w:pPr>
-              <w:ind w:left="360"/>
-              <w:rPr>
-                <w:iCs/>
-              </w:rPr>
-            </w:pPr>
+            </w:pPr>
+            <w:proofErr w:type="spellStart"/>
             <w:r>
               <w:rPr>
                 <w:rFonts w:eastAsia="Times New Roman"/>
@@ -2209,6 +2221,7 @@
               </w:rPr>
               <w:t>TEMPLATE_BlkApprovOther</w:t>
             </w:r>
+            <w:proofErr w:type="spellEnd"/>
           </w:p>
           <w:p>
             <w:pPr>
@@ -2222,7 +2235,7 @@
         </w:tc>
         <w:tc>
           <w:tcPr>
-            <w:tcW w:w="946" w:type="dxa"/>
+            <w:tcW w:w="0" w:type="auto"/>
           </w:tcPr>
           <w:p>
             <w:pPr>
@@ -2241,7 +2254,7 @@
         </w:tc>
         <w:tc>
           <w:tcPr>
-            <w:tcW w:w="942" w:type="dxa"/>
+            <w:tcW w:w="0" w:type="auto"/>
           </w:tcPr>
           <w:p>
             <w:pPr>
@@ -2262,6 +2275,7 @@
     </w:tbl>
     <w:p>
       <w:pPr>
+        <w:keepNext/>
         <w:rPr>
           <w:b/>
           <w:sz w:val="24"/>
@@ -2274,409 +2288,537 @@
           <w:sz w:val="24"/>
           <w:u w:val="single"/>
         </w:rPr>
-        <w:t xml:space="preserve">PART </w:t>
-      </w:r>
-      <w:r>
-        <w:rPr>
-          <w:b/>
-          <w:sz w:val="24"/>
-          <w:u w:val="single"/>
-        </w:rPr>
-        <w:t>C</w:t>
-      </w:r>
-      <w:r>
-        <w:rPr>
-          <w:b/>
-          <w:sz w:val="24"/>
-          <w:u w:val="single"/>
-        </w:rPr>
-        <w:t>: Service Standard</w:t>
+        <w:t>PART C: Dataset Information</w:t>
       </w:r>
     </w:p>
     <w:p>
-      <w:r>
-        <w:t xml:space="preserve">By completing this Open Government Approval Form, the business owner agrees to uphold the Open Canada Service Standard on behalf of Natural Resources Canada and respond to </w:t>
-      </w:r>
-      <w:r>
-        <w:t>most</w:t>
-      </w:r>
-      <w:r>
-        <w:t xml:space="preserve"> inquiries by a member of the public within 48 hours (two business days).</w:t>
+      <w:pPr>
+        <w:rPr>
+          <w:noProof/>
+        </w:rPr>
+      </w:pPr>
+      <w:r>
+        <w:rPr>
+          <w:noProof/>
+        </w:rPr>
+        <w:t xml:space="preserve">Dataset ID: </w:t>
+      </w:r>
+      <w:r>
+        <w:rPr>
+          <w:noProof/>
+        </w:rPr>
+        <w:t>TEMPLATE_DatasetId</w:t>
+      </w:r>
+      <w:r>
+        <w:rPr>
+          <w:noProof/>
+        </w:rPr>
+        <w:br/>
+        <w:t xml:space="preserve">English Dataset Name: </w:t>
+      </w:r>
+      <w:r>
+        <w:rPr>
+          <w:noProof/>
+        </w:rPr>
+        <w:t>TEMPLATE_DatasetNameEn</w:t>
+      </w:r>
+      <w:r>
+        <w:rPr>
+          <w:noProof/>
+        </w:rPr>
+        <w:br/>
+        <w:t xml:space="preserve">French Dataset Name: </w:t>
+      </w:r>
+      <w:r>
+        <w:rPr>
+          <w:noProof/>
+        </w:rPr>
+        <w:t>TEMPLATE_DatasetNameFr</w:t>
       </w:r>
     </w:p>
     <w:p>
       <w:pPr>
-        <w:rPr>
-          <w:b/>
-          <w:sz w:val="24"/>
+        <w:keepNext/>
+        <w:rPr>
           <w:u w:val="single"/>
         </w:rPr>
       </w:pPr>
       <w:r>
         <w:rPr>
-          <w:b/>
-          <w:sz w:val="24"/>
           <w:u w:val="single"/>
         </w:rPr>
-        <w:t xml:space="preserve">PART </w:t>
-      </w:r>
-      <w:r>
-        <w:rPr>
-          <w:b/>
-          <w:sz w:val="24"/>
-          <w:u w:val="single"/>
-        </w:rPr>
-        <w:t>D</w:t>
-      </w:r>
-      <w:r>
-        <w:rPr>
-          <w:b/>
-          <w:sz w:val="24"/>
-          <w:u w:val="single"/>
-        </w:rPr>
-        <w:t xml:space="preserve">: </w:t>
-      </w:r>
-      <w:r>
-        <w:rPr>
-          <w:b/>
-          <w:sz w:val="24"/>
-          <w:u w:val="single"/>
-        </w:rPr>
-        <w:t xml:space="preserve">Release </w:t>
-      </w:r>
-      <w:r>
-        <w:rPr>
-          <w:b/>
-          <w:sz w:val="24"/>
-          <w:u w:val="single"/>
-        </w:rPr>
-        <w:t>Authorization</w:t>
+        <w:t>Dataset Resources</w:t>
       </w:r>
     </w:p>
     <w:p>
-      <w:r>
-        <w:lastRenderedPageBreak/>
-        <w:t xml:space="preserve">I hereby authorize the publication </w:t>
-      </w:r>
-      <w:r>
-        <w:t>of the above dataset(s) and/or information resource(s)</w:t>
-      </w:r>
-      <w:r>
-        <w:t xml:space="preserve"> and related metadata on the Government of Canada</w:t>
-      </w:r>
-      <w:r>
-        <w:t>’s Open Government Portal, to be freely available under the terms and conditions of the Open Government Licence - Canada</w:t>
-      </w:r>
-      <w:r>
-        <w:t xml:space="preserve">. </w:t>
-      </w:r>
-    </w:p>
-    <w:p>
-      <w:r>
-        <w:t>With this authorization, I am confirming that the dataset</w:t>
-      </w:r>
-      <w:r>
-        <w:t>(</w:t>
-      </w:r>
-      <w:r>
-        <w:t>s</w:t>
-      </w:r>
-      <w:r>
-        <w:t>) and/or information resource(s)</w:t>
-      </w:r>
-      <w:r>
+      <w:pPr>
+        <w:rPr>
+          <w:noProof/>
+        </w:rPr>
+      </w:pPr>
+      <w:r>
+        <w:rPr>
+          <w:noProof/>
+        </w:rPr>
+        <w:t xml:space="preserve">Filename: </w:t>
+      </w:r>
+      <w:r>
+        <w:rPr>
+          <w:noProof/>
+        </w:rPr>
+        <w:t>TEMPLATE_FileFilename</w:t>
+      </w:r>
+      <w:r>
+        <w:rPr>
+          <w:noProof/>
+        </w:rPr>
+        <w:br/>
+      </w:r>
+      <w:r>
+        <w:rPr>
+          <w:noProof/>
+        </w:rPr>
+        <w:t xml:space="preserve">English Name: </w:t>
+      </w:r>
+      <w:r>
+        <w:rPr>
+          <w:noProof/>
+        </w:rPr>
+        <w:t>TEMPLATE_FileNameEn</w:t>
+      </w:r>
+      <w:r>
+        <w:rPr>
+          <w:noProof/>
+        </w:rPr>
+        <w:br/>
+        <w:t xml:space="preserve">French Name: </w:t>
+      </w:r>
+      <w:r>
+        <w:rPr>
+          <w:noProof/>
+        </w:rPr>
+        <w:t>TEMPLATE_FileNameFr</w:t>
+      </w:r>
+      <w:r>
+        <w:rPr>
+          <w:noProof/>
+        </w:rPr>
+        <w:br/>
+        <w:t xml:space="preserve">Language Format: </w:t>
+      </w:r>
+      <w:r>
+        <w:rPr>
+          <w:noProof/>
+        </w:rPr>
+        <w:t>TEMPLATE_FileLangEn</w:t>
+      </w:r>
+      <w:r>
+        <w:rPr>
+          <w:noProof/>
+        </w:rPr>
         <w:t xml:space="preserve"> </w:t>
       </w:r>
       <w:r>
-        <w:t xml:space="preserve">and any future updates </w:t>
-      </w:r>
-      <w:r>
-        <w:t xml:space="preserve">meet the </w:t>
-      </w:r>
-      <w:r>
-        <w:t xml:space="preserve">mandatory release </w:t>
-      </w:r>
-      <w:r>
-        <w:t>criteria</w:t>
-      </w:r>
-      <w:r>
-        <w:t xml:space="preserve"> listed above (Part B – Release Checklist).</w:t>
-      </w:r>
-    </w:p>
-    <w:p>
-      <w:pPr>
-        <w:rPr>
-          <w:b/>
-          <w:sz w:val="28"/>
-          <w:u w:val="single"/>
-        </w:rPr>
-      </w:pPr>
-      <w:r>
-        <w:rPr>
-          <w:b/>
-          <w:sz w:val="24"/>
-          <w:u w:val="single"/>
-        </w:rPr>
-        <w:t xml:space="preserve">Level 1: </w:t>
-      </w:r>
-      <w:r>
-        <w:rPr>
-          <w:b/>
-          <w:sz w:val="24"/>
-          <w:u w:val="single"/>
-        </w:rPr>
-        <w:t>Business Owner:</w:t>
-      </w:r>
-    </w:p>
-    <w:p>
-      <w:r>
-        <w:rPr>
-          <w:b/>
-        </w:rPr>
-        <w:t>Name</w:t>
-      </w:r>
-      <w:r>
-        <w:rPr>
-          <w:b/>
-        </w:rPr>
-        <w:t>:</w:t>
-      </w:r>
-      <w:r>
+        <w:rPr>
+          <w:noProof/>
+        </w:rPr>
+        <w:t xml:space="preserve">English / </w:t>
+      </w:r>
+      <w:r>
+        <w:rPr>
+          <w:noProof/>
+        </w:rPr>
+        <w:t>TEMPLATE_FileLangFr</w:t>
+      </w:r>
+      <w:r>
+        <w:rPr>
+          <w:noProof/>
+        </w:rPr>
         <w:t xml:space="preserve"> </w:t>
       </w:r>
-    </w:p>
-    <w:p>
-      <w:pPr>
-        <w:rPr>
-          <w:b/>
-        </w:rPr>
-      </w:pPr>
-      <w:r>
-        <w:rPr>
-          <w:b/>
-        </w:rPr>
-        <w:t xml:space="preserve">Title: </w:t>
-      </w:r>
-    </w:p>
-    <w:p>
-      <w:r>
-        <w:rPr>
-          <w:b/>
-        </w:rPr>
-        <w:t>Organization:</w:t>
-      </w:r>
-      <w:r>
-        <w:t xml:space="preserve"> </w:t>
-      </w:r>
-    </w:p>
-    <w:p>
-      <w:r>
-        <w:rPr>
-          <w:b/>
-        </w:rPr>
-        <w:t>Address:</w:t>
-      </w:r>
-      <w:r>
-        <w:t xml:space="preserve"> </w:t>
-      </w:r>
-    </w:p>
-    <w:p>
-      <w:r>
-        <w:rPr>
-          <w:b/>
-        </w:rPr>
-        <w:t>Telephone:</w:t>
-      </w:r>
-      <w:r>
-        <w:t xml:space="preserve"> </w:t>
-      </w:r>
-    </w:p>
-    <w:p>
-      <w:r>
-        <w:rPr>
-          <w:b/>
-        </w:rPr>
-        <w:t>Email:</w:t>
-      </w:r>
-      <w:r>
-        <w:t xml:space="preserve"> </w:t>
-      </w:r>
-    </w:p>
-    <w:p>
-      <w:pPr>
-        <w:rPr>
-          <w:b/>
-        </w:rPr>
-      </w:pPr>
-      <w:r>
-        <w:rPr>
-          <w:b/>
-        </w:rPr>
-        <w:t>Signature: ________________________</w:t>
-      </w:r>
-      <w:r>
-        <w:rPr>
-          <w:b/>
-        </w:rPr>
-        <w:t>______</w:t>
-      </w:r>
-      <w:r>
-        <w:rPr>
-          <w:b/>
-        </w:rPr>
-        <w:tab/>
-      </w:r>
-      <w:r>
-        <w:rPr>
-          <w:b/>
-        </w:rPr>
-        <w:tab/>
-      </w:r>
-      <w:r>
-        <w:rPr>
-          <w:b/>
-        </w:rPr>
-        <w:t xml:space="preserve">Date: </w:t>
-      </w:r>
-      <w:r>
-        <w:rPr>
-          <w:b/>
-          <w:u w:val="single"/>
-        </w:rPr>
-        <w:t xml:space="preserve">    ________________</w:t>
-      </w:r>
-      <w:r>
-        <w:rPr>
-          <w:b/>
-          <w:u w:val="single"/>
-        </w:rPr>
-        <w:t>_______________</w:t>
-      </w:r>
-    </w:p>
-    <w:p>
-      <w:pPr>
-        <w:rPr>
-          <w:b/>
-          <w:sz w:val="24"/>
-          <w:u w:val="single"/>
-        </w:rPr>
-      </w:pPr>
-    </w:p>
-    <w:p>
-      <w:pPr>
-        <w:rPr>
-          <w:b/>
-          <w:sz w:val="28"/>
-          <w:u w:val="single"/>
-        </w:rPr>
-      </w:pPr>
-      <w:r>
-        <w:rPr>
-          <w:b/>
-          <w:sz w:val="24"/>
-          <w:u w:val="single"/>
-        </w:rPr>
-        <w:t xml:space="preserve">Level 2: </w:t>
-      </w:r>
-      <w:r>
-        <w:rPr>
-          <w:b/>
-          <w:sz w:val="24"/>
-          <w:u w:val="single"/>
-        </w:rPr>
-        <w:t>Information Management Senior Official</w:t>
-      </w:r>
-      <w:r>
-        <w:rPr>
-          <w:b/>
-          <w:sz w:val="24"/>
-          <w:u w:val="single"/>
-        </w:rPr>
-        <w:t>:</w:t>
-      </w:r>
-    </w:p>
-    <w:p>
-      <w:pPr>
-        <w:rPr>
-          <w:b/>
-        </w:rPr>
-      </w:pPr>
-      <w:r>
-        <w:rPr>
-          <w:b/>
-        </w:rPr>
-        <w:t xml:space="preserve">Name: </w:t>
-      </w:r>
-    </w:p>
-    <w:p>
-      <w:pPr>
-        <w:rPr>
-          <w:b/>
-        </w:rPr>
-      </w:pPr>
-      <w:r>
-        <w:rPr>
-          <w:b/>
-        </w:rPr>
-        <w:t xml:space="preserve">Title: </w:t>
-      </w:r>
-    </w:p>
-    <w:p>
-      <w:pPr>
-        <w:rPr>
-          <w:b/>
-        </w:rPr>
-      </w:pPr>
-      <w:r>
-        <w:rPr>
-          <w:b/>
-        </w:rPr>
-        <w:t xml:space="preserve">Organization: </w:t>
-      </w:r>
-    </w:p>
-    <w:p>
-      <w:pPr>
-        <w:rPr>
-          <w:b/>
-        </w:rPr>
-      </w:pPr>
-      <w:r>
-        <w:rPr>
-          <w:b/>
-        </w:rPr>
-        <w:t>Address:</w:t>
-      </w:r>
-      <w:r>
-        <w:rPr>
-          <w:b/>
-        </w:rPr>
-        <w:t xml:space="preserve"> </w:t>
-      </w:r>
-    </w:p>
-    <w:p>
-      <w:pPr>
-        <w:rPr>
-          <w:b/>
-        </w:rPr>
-      </w:pPr>
-      <w:r>
-        <w:rPr>
-          <w:b/>
-        </w:rPr>
-        <w:t xml:space="preserve">Telephone: </w:t>
-      </w:r>
-    </w:p>
-    <w:p>
-      <w:r>
-        <w:rPr>
-          <w:b/>
-        </w:rPr>
-        <w:t xml:space="preserve">Email: </w:t>
+      <w:r>
+        <w:rPr>
+          <w:noProof/>
+        </w:rPr>
+        <w:t>French</w:t>
       </w:r>
     </w:p>
     <w:p/>
     <w:p>
       <w:pPr>
+        <w:keepNext/>
+        <w:rPr>
+          <w:b/>
+          <w:sz w:val="24"/>
+          <w:u w:val="single"/>
+        </w:rPr>
+      </w:pPr>
+      <w:r>
+        <w:rPr>
+          <w:b/>
+          <w:sz w:val="24"/>
+          <w:u w:val="single"/>
+        </w:rPr>
+        <w:t xml:space="preserve">PART </w:t>
+      </w:r>
+      <w:r>
+        <w:rPr>
+          <w:b/>
+          <w:sz w:val="24"/>
+          <w:u w:val="single"/>
+        </w:rPr>
+        <w:t>D</w:t>
+      </w:r>
+      <w:r>
+        <w:rPr>
+          <w:b/>
+          <w:sz w:val="24"/>
+          <w:u w:val="single"/>
+        </w:rPr>
+        <w:t xml:space="preserve">: </w:t>
+      </w:r>
+      <w:r>
+        <w:rPr>
+          <w:b/>
+          <w:sz w:val="24"/>
+          <w:u w:val="single"/>
+        </w:rPr>
+        <w:t xml:space="preserve">Release </w:t>
+      </w:r>
+      <w:r>
+        <w:rPr>
+          <w:b/>
+          <w:sz w:val="24"/>
+          <w:u w:val="single"/>
+        </w:rPr>
+        <w:t>Authorization</w:t>
+      </w:r>
+    </w:p>
+    <w:p>
+      <w:r>
+        <w:t xml:space="preserve">I hereby authorize the publication </w:t>
+      </w:r>
+      <w:r>
+        <w:t>of the above dataset(s) and/or information resource(s)</w:t>
+      </w:r>
+      <w:r>
+        <w:t xml:space="preserve"> and related metadata on the Government of Canada</w:t>
+      </w:r>
+      <w:r>
+        <w:t>’s Open Government Portal, to be freely available under the terms and conditions of the Open Government Licence - Canada</w:t>
+      </w:r>
+      <w:r>
+        <w:t xml:space="preserve">. </w:t>
+      </w:r>
+    </w:p>
+    <w:p>
+      <w:r>
+        <w:t>With this authorization, I am confirming that the dataset</w:t>
+      </w:r>
+      <w:r>
+        <w:t>(</w:t>
+      </w:r>
+      <w:r>
+        <w:t>s</w:t>
+      </w:r>
+      <w:r>
+        <w:t>) and/or information resource(s)</w:t>
+      </w:r>
+      <w:r>
+        <w:t xml:space="preserve"> </w:t>
+      </w:r>
+      <w:r>
+        <w:t xml:space="preserve">and any future updates </w:t>
+      </w:r>
+      <w:r>
+        <w:t xml:space="preserve">meet the </w:t>
+      </w:r>
+      <w:r>
+        <w:t xml:space="preserve">mandatory release </w:t>
+      </w:r>
+      <w:r>
+        <w:t>criteria</w:t>
+      </w:r>
+      <w:r>
+        <w:t xml:space="preserve"> listed above (Part B – Release Checklist).</w:t>
+      </w:r>
+    </w:p>
+    <w:p>
+      <w:pPr>
+        <w:pageBreakBefore/>
+        <w:rPr>
+          <w:b/>
+          <w:sz w:val="28"/>
+          <w:u w:val="single"/>
+        </w:rPr>
+      </w:pPr>
+      <w:r>
+        <w:rPr>
+          <w:b/>
+          <w:sz w:val="24"/>
+          <w:u w:val="single"/>
+        </w:rPr>
+        <w:lastRenderedPageBreak/>
+        <w:t xml:space="preserve">Level 1: </w:t>
+      </w:r>
+      <w:r>
+        <w:rPr>
+          <w:b/>
+          <w:sz w:val="24"/>
+          <w:u w:val="single"/>
+        </w:rPr>
+        <w:t>Business Owner:</w:t>
+      </w:r>
+    </w:p>
+    <w:p>
+      <w:r>
+        <w:rPr>
+          <w:b/>
+        </w:rPr>
+        <w:t>Name</w:t>
+      </w:r>
+      <w:r>
+        <w:rPr>
+          <w:b/>
+        </w:rPr>
+        <w:t>:</w:t>
+      </w:r>
+      <w:r>
+        <w:t xml:space="preserve"> </w:t>
+      </w:r>
+    </w:p>
+    <w:p>
+      <w:pPr>
+        <w:rPr>
+          <w:b/>
+        </w:rPr>
+      </w:pPr>
+      <w:r>
+        <w:rPr>
+          <w:b/>
+        </w:rPr>
+        <w:t xml:space="preserve">Title: </w:t>
+      </w:r>
+    </w:p>
+    <w:p>
+      <w:r>
+        <w:rPr>
+          <w:b/>
+        </w:rPr>
+        <w:t>Organization:</w:t>
+      </w:r>
+      <w:r>
+        <w:t xml:space="preserve"> </w:t>
+      </w:r>
+    </w:p>
+    <w:p>
+      <w:r>
+        <w:rPr>
+          <w:b/>
+        </w:rPr>
+        <w:t>Address:</w:t>
+      </w:r>
+      <w:r>
+        <w:t xml:space="preserve"> </w:t>
+      </w:r>
+    </w:p>
+    <w:p>
+      <w:r>
+        <w:rPr>
+          <w:b/>
+        </w:rPr>
+        <w:t>Telephone:</w:t>
+      </w:r>
+      <w:r>
+        <w:t xml:space="preserve"> </w:t>
+      </w:r>
+    </w:p>
+    <w:p>
+      <w:r>
+        <w:rPr>
+          <w:b/>
+        </w:rPr>
+        <w:t>Email:</w:t>
+      </w:r>
+      <w:r>
+        <w:t xml:space="preserve"> </w:t>
+      </w:r>
+    </w:p>
+    <w:p>
+      <w:pPr>
+        <w:rPr>
+          <w:b/>
+        </w:rPr>
+      </w:pPr>
+      <w:r>
+        <w:rPr>
+          <w:b/>
+        </w:rPr>
+        <w:t>Signature: ________________________</w:t>
+      </w:r>
+      <w:r>
+        <w:rPr>
+          <w:b/>
+        </w:rPr>
+        <w:t>______</w:t>
+      </w:r>
+      <w:r>
+        <w:rPr>
+          <w:b/>
+        </w:rPr>
+        <w:tab/>
+      </w:r>
+      <w:r>
+        <w:rPr>
+          <w:b/>
+        </w:rPr>
+        <w:tab/>
+      </w:r>
+      <w:r>
+        <w:rPr>
+          <w:b/>
+        </w:rPr>
+        <w:t xml:space="preserve">Date: </w:t>
+      </w:r>
+      <w:r>
+        <w:rPr>
+          <w:b/>
+          <w:u w:val="single"/>
+        </w:rPr>
+        <w:t xml:space="preserve">    ________________</w:t>
+      </w:r>
+      <w:r>
+        <w:rPr>
+          <w:b/>
+          <w:u w:val="single"/>
+        </w:rPr>
+        <w:t>_______________</w:t>
+      </w:r>
+    </w:p>
+    <w:p>
+      <w:pPr>
+        <w:rPr>
+          <w:b/>
+          <w:sz w:val="24"/>
+          <w:u w:val="single"/>
+        </w:rPr>
+      </w:pPr>
+    </w:p>
+    <w:p>
+      <w:pPr>
+        <w:rPr>
+          <w:b/>
+          <w:sz w:val="28"/>
+          <w:u w:val="single"/>
+        </w:rPr>
+      </w:pPr>
+      <w:r>
+        <w:rPr>
+          <w:b/>
+          <w:sz w:val="24"/>
+          <w:u w:val="single"/>
+        </w:rPr>
+        <w:t xml:space="preserve">Level 2: </w:t>
+      </w:r>
+      <w:r>
+        <w:rPr>
+          <w:b/>
+          <w:sz w:val="24"/>
+          <w:u w:val="single"/>
+        </w:rPr>
+        <w:t>Information Management Senior Official</w:t>
+      </w:r>
+      <w:r>
+        <w:rPr>
+          <w:b/>
+          <w:sz w:val="24"/>
+          <w:u w:val="single"/>
+        </w:rPr>
+        <w:t>:</w:t>
+      </w:r>
+    </w:p>
+    <w:p>
+      <w:pPr>
+        <w:rPr>
+          <w:b/>
+        </w:rPr>
+      </w:pPr>
+      <w:r>
+        <w:rPr>
+          <w:b/>
+        </w:rPr>
+        <w:t xml:space="preserve">Name: </w:t>
+      </w:r>
+    </w:p>
+    <w:p>
+      <w:pPr>
+        <w:rPr>
+          <w:b/>
+        </w:rPr>
+      </w:pPr>
+      <w:r>
+        <w:rPr>
+          <w:b/>
+        </w:rPr>
+        <w:t xml:space="preserve">Title: </w:t>
+      </w:r>
+    </w:p>
+    <w:p>
+      <w:pPr>
+        <w:rPr>
+          <w:b/>
+        </w:rPr>
+      </w:pPr>
+      <w:r>
+        <w:rPr>
+          <w:b/>
+        </w:rPr>
+        <w:t xml:space="preserve">Organization: </w:t>
+      </w:r>
+    </w:p>
+    <w:p>
+      <w:pPr>
+        <w:rPr>
+          <w:b/>
+        </w:rPr>
+      </w:pPr>
+      <w:r>
+        <w:rPr>
+          <w:b/>
+        </w:rPr>
+        <w:t>Address:</w:t>
+      </w:r>
+      <w:r>
+        <w:rPr>
+          <w:b/>
+        </w:rPr>
+        <w:t xml:space="preserve"> </w:t>
+      </w:r>
+    </w:p>
+    <w:p>
+      <w:pPr>
+        <w:rPr>
+          <w:b/>
+        </w:rPr>
+      </w:pPr>
+      <w:r>
+        <w:rPr>
+          <w:b/>
+        </w:rPr>
+        <w:t xml:space="preserve">Telephone: </w:t>
+      </w:r>
+    </w:p>
+    <w:p>
+      <w:r>
+        <w:rPr>
+          <w:b/>
+        </w:rPr>
+        <w:t xml:space="preserve">Email: </w:t>
+      </w:r>
+    </w:p>
+    <w:p/>
+    <w:p>
+      <w:pPr>
         <w:pBdr>
           <w:bottom w:val="single" w:sz="12" w:space="0" w:color="auto"/>
         </w:pBdr>
@@ -2733,13 +2875,20 @@
     </w:p>
     <w:p>
       <w:pPr>
+        <w:keepNext/>
         <w:pBdr>
           <w:bottom w:val="single" w:sz="12" w:space="0" w:color="auto"/>
         </w:pBdr>
         <w:rPr>
-          <w:b/>
-        </w:rPr>
-      </w:pPr>
+          <w:bCs/>
+        </w:rPr>
+      </w:pPr>
+      <w:r>
+        <w:rPr>
+          <w:bCs/>
+        </w:rPr>
+        <w:t>I have reviewed the dataset and all related resources (data dictionary, supporting documentation) and I approve its content.</w:t>
+      </w:r>
     </w:p>
     <w:p>
       <w:pPr>
@@ -2747,15 +2896,237 @@
           <w:bottom w:val="single" w:sz="12" w:space="0" w:color="auto"/>
         </w:pBdr>
         <w:rPr>
-          <w:b/>
+          <w:noProof/>
+        </w:rPr>
+      </w:pPr>
+      <w:r>
+        <w:rPr>
+          <w:bCs/>
+        </w:rPr>
+        <w:tab/>
+      </w:r>
+      <w:r>
+        <w:rPr>
+          <w:noProof/>
+        </w:rPr>
+        <w:t>☐</w:t>
+      </w:r>
+      <w:r>
+        <w:rPr>
+          <w:noProof/>
+        </w:rPr>
+        <w:t xml:space="preserve"> Yes / </w:t>
+      </w:r>
+      <w:r>
+        <w:rPr>
+          <w:noProof/>
+        </w:rPr>
+        <w:t>☐</w:t>
+      </w:r>
+      <w:r>
+        <w:rPr>
+          <w:noProof/>
+        </w:rPr>
+        <w:t xml:space="preserve"> No</w:t>
+      </w:r>
+    </w:p>
+    <w:p>
+      <w:pPr>
+        <w:keepNext/>
+        <w:pBdr>
+          <w:bottom w:val="single" w:sz="12" w:space="0" w:color="auto"/>
+        </w:pBdr>
+        <w:rPr>
+          <w:bCs/>
+        </w:rPr>
+      </w:pPr>
+      <w:r>
+        <w:rPr>
+          <w:bCs/>
+        </w:rPr>
+        <w:t>I agree to release this dataset under the Open Government License – Canada, in an accessible format as specified in the Standard on Web Accessibility, and in both official languages in compliance with the Official Languages Act.</w:t>
+      </w:r>
+    </w:p>
+    <w:p>
+      <w:pPr>
+        <w:pBdr>
+          <w:bottom w:val="single" w:sz="12" w:space="0" w:color="auto"/>
+        </w:pBdr>
+        <w:rPr>
+          <w:noProof/>
+        </w:rPr>
+      </w:pPr>
+      <w:r>
+        <w:rPr>
+          <w:bCs/>
+        </w:rPr>
+        <w:tab/>
+      </w:r>
+      <w:r>
+        <w:rPr>
+          <w:noProof/>
+        </w:rPr>
+        <w:t>☐</w:t>
+      </w:r>
+      <w:r>
+        <w:rPr>
+          <w:noProof/>
+        </w:rPr>
+        <w:t xml:space="preserve"> Yes / </w:t>
+      </w:r>
+      <w:r>
+        <w:rPr>
+          <w:noProof/>
+        </w:rPr>
+        <w:t>☐</w:t>
+      </w:r>
+      <w:r>
+        <w:rPr>
+          <w:noProof/>
+        </w:rPr>
+        <w:t xml:space="preserve"> No</w:t>
+      </w:r>
+    </w:p>
+    <w:p>
+      <w:pPr>
+        <w:keepNext/>
+        <w:pBdr>
+          <w:bottom w:val="single" w:sz="12" w:space="0" w:color="auto"/>
+        </w:pBdr>
+        <w:rPr>
+          <w:bCs/>
+        </w:rPr>
+      </w:pPr>
+      <w:r>
+        <w:rPr>
+          <w:bCs/>
+        </w:rPr>
+        <w:lastRenderedPageBreak/>
+        <w:t>I want to request the IMSO approval.</w:t>
+      </w:r>
+    </w:p>
+    <w:p>
+      <w:pPr>
+        <w:pBdr>
+          <w:bottom w:val="single" w:sz="12" w:space="0" w:color="auto"/>
+        </w:pBdr>
+        <w:rPr>
+          <w:noProof/>
+        </w:rPr>
+      </w:pPr>
+      <w:r>
+        <w:rPr>
+          <w:bCs/>
+        </w:rPr>
+        <w:tab/>
+      </w:r>
+      <w:r>
+        <w:rPr>
+          <w:noProof/>
+        </w:rPr>
+        <w:t>☐</w:t>
+      </w:r>
+      <w:r>
+        <w:rPr>
+          <w:noProof/>
+        </w:rPr>
+        <w:t xml:space="preserve"> Yes / </w:t>
+      </w:r>
+      <w:r>
+        <w:rPr>
+          <w:noProof/>
+        </w:rPr>
+        <w:t>☐</w:t>
+      </w:r>
+      <w:r>
+        <w:rPr>
+          <w:noProof/>
+        </w:rPr>
+        <w:t xml:space="preserve"> No</w:t>
+      </w:r>
+    </w:p>
+    <w:p>
+      <w:pPr>
+        <w:keepNext/>
+        <w:pBdr>
+          <w:bottom w:val="single" w:sz="12" w:space="0" w:color="auto"/>
+        </w:pBdr>
+        <w:rPr>
+          <w:bCs/>
+        </w:rPr>
+      </w:pPr>
+      <w:r>
+        <w:rPr>
+          <w:bCs/>
+        </w:rPr>
+        <w:t>Is this dataset part of a series?</w:t>
+      </w:r>
+    </w:p>
+    <w:p>
+      <w:pPr>
+        <w:pBdr>
+          <w:bottom w:val="single" w:sz="12" w:space="0" w:color="auto"/>
+        </w:pBdr>
+        <w:rPr>
+          <w:noProof/>
+        </w:rPr>
+      </w:pPr>
+      <w:r>
+        <w:rPr>
+          <w:bCs/>
+        </w:rPr>
+        <w:tab/>
+      </w:r>
+      <w:r>
+        <w:rPr>
+          <w:noProof/>
+        </w:rPr>
+        <w:t>☐</w:t>
+      </w:r>
+      <w:r>
+        <w:rPr>
+          <w:noProof/>
+        </w:rPr>
+        <w:t xml:space="preserve"> Yes / </w:t>
+      </w:r>
+      <w:r>
+        <w:rPr>
+          <w:noProof/>
+        </w:rPr>
+        <w:t>☐</w:t>
+      </w:r>
+      <w:r>
+        <w:rPr>
+          <w:noProof/>
+        </w:rPr>
+        <w:t xml:space="preserve"> No</w:t>
+      </w:r>
+    </w:p>
+    <w:p>
+      <w:pPr>
+        <w:pBdr>
+          <w:bottom w:val="single" w:sz="12" w:space="0" w:color="auto"/>
+        </w:pBdr>
+        <w:rPr>
+          <w:noProof/>
+        </w:rPr>
+      </w:pPr>
+    </w:p>
+    <w:p>
+      <w:pPr>
+        <w:pBdr>
+          <w:bottom w:val="single" w:sz="12" w:space="0" w:color="auto"/>
+        </w:pBdr>
+        <w:rPr>
+          <w:bCs/>
         </w:rPr>
       </w:pPr>
     </w:p>
     <w:sectPr>
-      <w:headerReference w:type="even" r:id="rId9"/>
-      <w:headerReference w:type="default" r:id="rId10"/>
-      <w:footerReference w:type="default" r:id="rId11"/>
-      <w:headerReference w:type="first" r:id="rId12"/>
+      <w:headerReference w:type="even" r:id="rId8"/>
+      <w:headerReference w:type="default" r:id="rId9"/>
+      <w:footerReference w:type="default" r:id="rId10"/>
+      <w:headerReference w:type="first" r:id="rId11"/>
       <w:pgSz w:w="12240" w:h="15840"/>
       <w:pgMar w:top="1440" w:right="1440" w:bottom="1440" w:left="1440" w:header="708" w:footer="708" w:gutter="0"/>
       <w:cols w:space="708"/>
@@ -2766,7 +3137,7 @@
 </file>
 
 <file path=word/endnotes.xml><?xml version="1.0" encoding="utf-8"?>
-<w:endnotes xmlns:wpc="http://schemas.microsoft.com/office/word/2010/wordprocessingCanvas" xmlns:cx="http://schemas.microsoft.com/office/drawing/2014/chartex" xmlns:cx1="http://schemas.microsoft.com/office/drawing/2015/9/8/chartex" xmlns:cx2="http://schemas.microsoft.com/office/drawing/2015/10/21/chartex" xmlns:cx3="http://schemas.microsoft.com/office/drawing/2016/5/9/chartex" xmlns:cx4="http://schemas.microsoft.com/office/drawing/2016/5/10/chartex" xmlns:cx5="http://schemas.microsoft.com/office/drawing/2016/5/11/chartex" xmlns:cx6="http://schemas.microsoft.com/office/drawing/2016/5/12/chartex" xmlns:cx7="http://schemas.microsoft.com/office/drawing/2016/5/13/chartex" xmlns:cx8="http://schemas.microsoft.com/office/drawing/2016/5/14/chartex" xmlns:mc="http://schemas.openxmlformats.org/markup-compatibility/2006" xmlns:aink="http://schemas.microsoft.com/office/drawing/2016/ink" xmlns:am3d="http://schemas.microsoft.com/office/drawing/2017/model3d" xmlns:o="urn:schemas-microsoft-com:office:office" xmlns:oel="http://schemas.microsoft.com/office/2019/extlst" xmlns:r="http://schemas.openxmlformats.org/officeDocument/2006/relationships" xmlns:m="http://schemas.openxmlformats.org/officeDocument/2006/math" xmlns:v="urn:schemas-microsoft-com:vml" xmlns:wp14="http://schemas.microsoft.com/office/word/2010/wordprocessingDrawing" xmlns:wp="http://schemas.openxmlformats.org/drawingml/2006/wordprocessingDrawing" xmlns:w10="urn:schemas-microsoft-com:office:word" xmlns:w="http://schemas.openxmlformats.org/wordprocessingml/2006/main" xmlns:w14="http://schemas.microsoft.com/office/word/2010/wordml" xmlns:w15="http://schemas.microsoft.com/office/word/2012/wordml" xmlns:w16cex="http://schemas.microsoft.com/office/word/2018/wordml/cex" xmlns:w16cid="http://schemas.microsoft.com/office/word/2016/wordml/cid" xmlns:w16="http://schemas.microsoft.com/office/word/2018/wordml" xmlns:w16sdtdh="http://schemas.microsoft.com/office/word/2020/wordml/sdtdatahash" xmlns:w16se="http://schemas.microsoft.com/office/word/2015/wordml/symex" xmlns:wpg="http://schemas.microsoft.com/office/word/2010/wordprocessingGroup" xmlns:wpi="http://schemas.microsoft.com/office/word/2010/wordprocessingInk" xmlns:wne="http://schemas.microsoft.com/office/word/2006/wordml" xmlns:wps="http://schemas.microsoft.com/office/word/2010/wordprocessingShape" mc:Ignorable="w14 w15 w16se w16cid w16 w16cex w16sdtdh wp14">
+<w:endnotes xmlns:wpc="http://schemas.microsoft.com/office/word/2010/wordprocessingCanvas" xmlns:cx="http://schemas.microsoft.com/office/drawing/2014/chartex" xmlns:cx1="http://schemas.microsoft.com/office/drawing/2015/9/8/chartex" xmlns:cx2="http://schemas.microsoft.com/office/drawing/2015/10/21/chartex" xmlns:cx3="http://schemas.microsoft.com/office/drawing/2016/5/9/chartex" xmlns:cx4="http://schemas.microsoft.com/office/drawing/2016/5/10/chartex" xmlns:cx5="http://schemas.microsoft.com/office/drawing/2016/5/11/chartex" xmlns:cx6="http://schemas.microsoft.com/office/drawing/2016/5/12/chartex" xmlns:cx7="http://schemas.microsoft.com/office/drawing/2016/5/13/chartex" xmlns:cx8="http://schemas.microsoft.com/office/drawing/2016/5/14/chartex" xmlns:mc="http://schemas.openxmlformats.org/markup-compatibility/2006" xmlns:aink="http://schemas.microsoft.com/office/drawing/2016/ink" xmlns:am3d="http://schemas.microsoft.com/office/drawing/2017/model3d" xmlns:o="urn:schemas-microsoft-com:office:office" xmlns:oel="http://schemas.microsoft.com/office/2019/extlst" xmlns:r="http://schemas.openxmlformats.org/officeDocument/2006/relationships" xmlns:m="http://schemas.openxmlformats.org/officeDocument/2006/math" xmlns:v="urn:schemas-microsoft-com:vml" xmlns:wp14="http://schemas.microsoft.com/office/word/2010/wordprocessingDrawing" xmlns:wp="http://schemas.openxmlformats.org/drawingml/2006/wordprocessingDrawing" xmlns:w10="urn:schemas-microsoft-com:office:word" xmlns:w="http://schemas.openxmlformats.org/wordprocessingml/2006/main" xmlns:w14="http://schemas.microsoft.com/office/word/2010/wordml" xmlns:w15="http://schemas.microsoft.com/office/word/2012/wordml" xmlns:w16cex="http://schemas.microsoft.com/office/word/2018/wordml/cex" xmlns:w16cid="http://schemas.microsoft.com/office/word/2016/wordml/cid" xmlns:w16="http://schemas.microsoft.com/office/word/2018/wordml" xmlns:w16du="http://schemas.microsoft.com/office/word/2023/wordml/word16du" xmlns:w16sdtdh="http://schemas.microsoft.com/office/word/2020/wordml/sdtdatahash" xmlns:w16se="http://schemas.microsoft.com/office/word/2015/wordml/symex" xmlns:wpg="http://schemas.microsoft.com/office/word/2010/wordprocessingGroup" xmlns:wpi="http://schemas.microsoft.com/office/word/2010/wordprocessingInk" xmlns:wne="http://schemas.microsoft.com/office/word/2006/wordml" xmlns:wps="http://schemas.microsoft.com/office/word/2010/wordprocessingShape" mc:Ignorable="w14 w15 w16se w16cid w16 w16cex w16sdtdh w16du wp14">
   <w:endnote w:type="separator" w:id="-1">
     <w:p>
       <w:pPr>
@@ -2791,7 +3162,7 @@
 </file>
 
 <file path=word/footer1.xml><?xml version="1.0" encoding="utf-8"?>
-<w:ftr xmlns:wpc="http://schemas.microsoft.com/office/word/2010/wordprocessingCanvas" xmlns:cx="http://schemas.microsoft.com/office/drawing/2014/chartex" xmlns:cx1="http://schemas.microsoft.com/office/drawing/2015/9/8/chartex" xmlns:cx2="http://schemas.microsoft.com/office/drawing/2015/10/21/chartex" xmlns:cx3="http://schemas.microsoft.com/office/drawing/2016/5/9/chartex" xmlns:cx4="http://schemas.microsoft.com/office/drawing/2016/5/10/chartex" xmlns:cx5="http://schemas.microsoft.com/office/drawing/2016/5/11/chartex" xmlns:cx6="http://schemas.microsoft.com/office/drawing/2016/5/12/chartex" xmlns:cx7="http://schemas.microsoft.com/office/drawing/2016/5/13/chartex" xmlns:cx8="http://schemas.microsoft.com/office/drawing/2016/5/14/chartex" xmlns:mc="http://schemas.openxmlformats.org/markup-compatibility/2006" xmlns:aink="http://schemas.microsoft.com/office/drawing/2016/ink" xmlns:am3d="http://schemas.microsoft.com/office/drawing/2017/model3d" xmlns:o="urn:schemas-microsoft-com:office:office" xmlns:oel="http://schemas.microsoft.com/office/2019/extlst" xmlns:r="http://schemas.openxmlformats.org/officeDocument/2006/relationships" xmlns:m="http://schemas.openxmlformats.org/officeDocument/2006/math" xmlns:v="urn:schemas-microsoft-com:vml" xmlns:wp14="http://schemas.microsoft.com/office/word/2010/wordprocessingDrawing" xmlns:wp="http://schemas.openxmlformats.org/drawingml/2006/wordprocessingDrawing" xmlns:w10="urn:schemas-microsoft-com:office:word" xmlns:w="http://schemas.openxmlformats.org/wordprocessingml/2006/main" xmlns:w14="http://schemas.microsoft.com/office/word/2010/wordml" xmlns:w15="http://schemas.microsoft.com/office/word/2012/wordml" xmlns:w16cex="http://schemas.microsoft.com/office/word/2018/wordml/cex" xmlns:w16cid="http://schemas.microsoft.com/office/word/2016/wordml/cid" xmlns:w16="http://schemas.microsoft.com/office/word/2018/wordml" xmlns:w16sdtdh="http://schemas.microsoft.com/office/word/2020/wordml/sdtdatahash" xmlns:w16se="http://schemas.microsoft.com/office/word/2015/wordml/symex" xmlns:wpg="http://schemas.microsoft.com/office/word/2010/wordprocessingGroup" xmlns:wpi="http://schemas.microsoft.com/office/word/2010/wordprocessingInk" xmlns:wne="http://schemas.microsoft.com/office/word/2006/wordml" xmlns:wps="http://schemas.microsoft.com/office/word/2010/wordprocessingShape" mc:Ignorable="w14 w15 w16se w16cid w16 w16cex w16sdtdh wp14">
+<w:ftr xmlns:wpc="http://schemas.microsoft.com/office/word/2010/wordprocessingCanvas" xmlns:cx="http://schemas.microsoft.com/office/drawing/2014/chartex" xmlns:cx1="http://schemas.microsoft.com/office/drawing/2015/9/8/chartex" xmlns:cx2="http://schemas.microsoft.com/office/drawing/2015/10/21/chartex" xmlns:cx3="http://schemas.microsoft.com/office/drawing/2016/5/9/chartex" xmlns:cx4="http://schemas.microsoft.com/office/drawing/2016/5/10/chartex" xmlns:cx5="http://schemas.microsoft.com/office/drawing/2016/5/11/chartex" xmlns:cx6="http://schemas.microsoft.com/office/drawing/2016/5/12/chartex" xmlns:cx7="http://schemas.microsoft.com/office/drawing/2016/5/13/chartex" xmlns:cx8="http://schemas.microsoft.com/office/drawing/2016/5/14/chartex" xmlns:mc="http://schemas.openxmlformats.org/markup-compatibility/2006" xmlns:aink="http://schemas.microsoft.com/office/drawing/2016/ink" xmlns:am3d="http://schemas.microsoft.com/office/drawing/2017/model3d" xmlns:o="urn:schemas-microsoft-com:office:office" xmlns:oel="http://schemas.microsoft.com/office/2019/extlst" xmlns:r="http://schemas.openxmlformats.org/officeDocument/2006/relationships" xmlns:m="http://schemas.openxmlformats.org/officeDocument/2006/math" xmlns:v="urn:schemas-microsoft-com:vml" xmlns:wp14="http://schemas.microsoft.com/office/word/2010/wordprocessingDrawing" xmlns:wp="http://schemas.openxmlformats.org/drawingml/2006/wordprocessingDrawing" xmlns:w10="urn:schemas-microsoft-com:office:word" xmlns:w="http://schemas.openxmlformats.org/wordprocessingml/2006/main" xmlns:w14="http://schemas.microsoft.com/office/word/2010/wordml" xmlns:w15="http://schemas.microsoft.com/office/word/2012/wordml" xmlns:w16cex="http://schemas.microsoft.com/office/word/2018/wordml/cex" xmlns:w16cid="http://schemas.microsoft.com/office/word/2016/wordml/cid" xmlns:w16="http://schemas.microsoft.com/office/word/2018/wordml" xmlns:w16du="http://schemas.microsoft.com/office/word/2023/wordml/word16du" xmlns:w16sdtdh="http://schemas.microsoft.com/office/word/2020/wordml/sdtdatahash" xmlns:w16se="http://schemas.microsoft.com/office/word/2015/wordml/symex" xmlns:wpg="http://schemas.microsoft.com/office/word/2010/wordprocessingGroup" xmlns:wpi="http://schemas.microsoft.com/office/word/2010/wordprocessingInk" xmlns:wne="http://schemas.microsoft.com/office/word/2006/wordml" xmlns:wps="http://schemas.microsoft.com/office/word/2010/wordprocessingShape" mc:Ignorable="w14 w15 w16se w16cid w16 w16cex w16sdtdh w16du wp14">
   <w:sdt>
     <w:sdtPr>
       <w:id w:val="-1743780762"/>
@@ -2853,7 +3224,7 @@
 </file>
 
 <file path=word/footnotes.xml><?xml version="1.0" encoding="utf-8"?>
-<w:footnotes xmlns:wpc="http://schemas.microsoft.com/office/word/2010/wordprocessingCanvas" xmlns:cx="http://schemas.microsoft.com/office/drawing/2014/chartex" xmlns:cx1="http://schemas.microsoft.com/office/drawing/2015/9/8/chartex" xmlns:cx2="http://schemas.microsoft.com/office/drawing/2015/10/21/chartex" xmlns:cx3="http://schemas.microsoft.com/office/drawing/2016/5/9/chartex" xmlns:cx4="http://schemas.microsoft.com/office/drawing/2016/5/10/chartex" xmlns:cx5="http://schemas.microsoft.com/office/drawing/2016/5/11/chartex" xmlns:cx6="http://schemas.microsoft.com/office/drawing/2016/5/12/chartex" xmlns:cx7="http://schemas.microsoft.com/office/drawing/2016/5/13/chartex" xmlns:cx8="http://schemas.microsoft.com/office/drawing/2016/5/14/chartex" xmlns:mc="http://schemas.openxmlformats.org/markup-compatibility/2006" xmlns:aink="http://schemas.microsoft.com/office/drawing/2016/ink" xmlns:am3d="http://schemas.microsoft.com/office/drawing/2017/model3d" xmlns:o="urn:schemas-microsoft-com:office:office" xmlns:oel="http://schemas.microsoft.com/office/2019/extlst" xmlns:r="http://schemas.openxmlformats.org/officeDocument/2006/relationships" xmlns:m="http://schemas.openxmlformats.org/officeDocument/2006/math" xmlns:v="urn:schemas-microsoft-com:vml" xmlns:wp14="http://schemas.microsoft.com/office/word/2010/wordprocessingDrawing" xmlns:wp="http://schemas.openxmlformats.org/drawingml/2006/wordprocessingDrawing" xmlns:w10="urn:schemas-microsoft-com:office:word" xmlns:w="http://schemas.openxmlformats.org/wordprocessingml/2006/main" xmlns:w14="http://schemas.microsoft.com/office/word/2010/wordml" xmlns:w15="http://schemas.microsoft.com/office/word/2012/wordml" xmlns:w16cex="http://schemas.microsoft.com/office/word/2018/wordml/cex" xmlns:w16cid="http://schemas.microsoft.com/office/word/2016/wordml/cid" xmlns:w16="http://schemas.microsoft.com/office/word/2018/wordml" xmlns:w16sdtdh="http://schemas.microsoft.com/office/word/2020/wordml/sdtdatahash" xmlns:w16se="http://schemas.microsoft.com/office/word/2015/wordml/symex" xmlns:wpg="http://schemas.microsoft.com/office/word/2010/wordprocessingGroup" xmlns:wpi="http://schemas.microsoft.com/office/word/2010/wordprocessingInk" xmlns:wne="http://schemas.microsoft.com/office/word/2006/wordml" xmlns:wps="http://schemas.microsoft.com/office/word/2010/wordprocessingShape" mc:Ignorable="w14 w15 w16se w16cid w16 w16cex w16sdtdh wp14">
+<w:footnotes xmlns:wpc="http://schemas.microsoft.com/office/word/2010/wordprocessingCanvas" xmlns:cx="http://schemas.microsoft.com/office/drawing/2014/chartex" xmlns:cx1="http://schemas.microsoft.com/office/drawing/2015/9/8/chartex" xmlns:cx2="http://schemas.microsoft.com/office/drawing/2015/10/21/chartex" xmlns:cx3="http://schemas.microsoft.com/office/drawing/2016/5/9/chartex" xmlns:cx4="http://schemas.microsoft.com/office/drawing/2016/5/10/chartex" xmlns:cx5="http://schemas.microsoft.com/office/drawing/2016/5/11/chartex" xmlns:cx6="http://schemas.microsoft.com/office/drawing/2016/5/12/chartex" xmlns:cx7="http://schemas.microsoft.com/office/drawing/2016/5/13/chartex" xmlns:cx8="http://schemas.microsoft.com/office/drawing/2016/5/14/chartex" xmlns:mc="http://schemas.openxmlformats.org/markup-compatibility/2006" xmlns:aink="http://schemas.microsoft.com/office/drawing/2016/ink" xmlns:am3d="http://schemas.microsoft.com/office/drawing/2017/model3d" xmlns:o="urn:schemas-microsoft-com:office:office" xmlns:oel="http://schemas.microsoft.com/office/2019/extlst" xmlns:r="http://schemas.openxmlformats.org/officeDocument/2006/relationships" xmlns:m="http://schemas.openxmlformats.org/officeDocument/2006/math" xmlns:v="urn:schemas-microsoft-com:vml" xmlns:wp14="http://schemas.microsoft.com/office/word/2010/wordprocessingDrawing" xmlns:wp="http://schemas.openxmlformats.org/drawingml/2006/wordprocessingDrawing" xmlns:w10="urn:schemas-microsoft-com:office:word" xmlns:w="http://schemas.openxmlformats.org/wordprocessingml/2006/main" xmlns:w14="http://schemas.microsoft.com/office/word/2010/wordml" xmlns:w15="http://schemas.microsoft.com/office/word/2012/wordml" xmlns:w16cex="http://schemas.microsoft.com/office/word/2018/wordml/cex" xmlns:w16cid="http://schemas.microsoft.com/office/word/2016/wordml/cid" xmlns:w16="http://schemas.microsoft.com/office/word/2018/wordml" xmlns:w16du="http://schemas.microsoft.com/office/word/2023/wordml/word16du" xmlns:w16sdtdh="http://schemas.microsoft.com/office/word/2020/wordml/sdtdatahash" xmlns:w16se="http://schemas.microsoft.com/office/word/2015/wordml/symex" xmlns:wpg="http://schemas.microsoft.com/office/word/2010/wordprocessingGroup" xmlns:wpi="http://schemas.microsoft.com/office/word/2010/wordprocessingInk" xmlns:wne="http://schemas.microsoft.com/office/word/2006/wordml" xmlns:wps="http://schemas.microsoft.com/office/word/2010/wordprocessingShape" mc:Ignorable="w14 w15 w16se w16cid w16 w16cex w16sdtdh w16du wp14">
   <w:footnote w:type="separator" w:id="-1">
     <w:p>
       <w:pPr>
@@ -2878,7 +3249,7 @@
 </file>
 
 <file path=word/header1.xml><?xml version="1.0" encoding="utf-8"?>
-<w:hdr xmlns:wpc="http://schemas.microsoft.com/office/word/2010/wordprocessingCanvas" xmlns:cx="http://schemas.microsoft.com/office/drawing/2014/chartex" xmlns:cx1="http://schemas.microsoft.com/office/drawing/2015/9/8/chartex" xmlns:cx2="http://schemas.microsoft.com/office/drawing/2015/10/21/chartex" xmlns:cx3="http://schemas.microsoft.com/office/drawing/2016/5/9/chartex" xmlns:cx4="http://schemas.microsoft.com/office/drawing/2016/5/10/chartex" xmlns:cx5="http://schemas.microsoft.com/office/drawing/2016/5/11/chartex" xmlns:cx6="http://schemas.microsoft.com/office/drawing/2016/5/12/chartex" xmlns:cx7="http://schemas.microsoft.com/office/drawing/2016/5/13/chartex" xmlns:cx8="http://schemas.microsoft.com/office/drawing/2016/5/14/chartex" xmlns:mc="http://schemas.openxmlformats.org/markup-compatibility/2006" xmlns:aink="http://schemas.microsoft.com/office/drawing/2016/ink" xmlns:am3d="http://schemas.microsoft.com/office/drawing/2017/model3d" xmlns:o="urn:schemas-microsoft-com:office:office" xmlns:oel="http://schemas.microsoft.com/office/2019/extlst" xmlns:r="http://schemas.openxmlformats.org/officeDocument/2006/relationships" xmlns:m="http://schemas.openxmlformats.org/officeDocument/2006/math" xmlns:v="urn:schemas-microsoft-com:vml" xmlns:wp14="http://schemas.microsoft.com/office/word/2010/wordprocessingDrawing" xmlns:wp="http://schemas.openxmlformats.org/drawingml/2006/wordprocessingDrawing" xmlns:w10="urn:schemas-microsoft-com:office:word" xmlns:w="http://schemas.openxmlformats.org/wordprocessingml/2006/main" xmlns:w14="http://schemas.microsoft.com/office/word/2010/wordml" xmlns:w15="http://schemas.microsoft.com/office/word/2012/wordml" xmlns:w16cex="http://schemas.microsoft.com/office/word/2018/wordml/cex" xmlns:w16cid="http://schemas.microsoft.com/office/word/2016/wordml/cid" xmlns:w16="http://schemas.microsoft.com/office/word/2018/wordml" xmlns:w16sdtdh="http://schemas.microsoft.com/office/word/2020/wordml/sdtdatahash" xmlns:w16se="http://schemas.microsoft.com/office/word/2015/wordml/symex" xmlns:wpg="http://schemas.microsoft.com/office/word/2010/wordprocessingGroup" xmlns:wpi="http://schemas.microsoft.com/office/word/2010/wordprocessingInk" xmlns:wne="http://schemas.microsoft.com/office/word/2006/wordml" xmlns:wps="http://schemas.microsoft.com/office/word/2010/wordprocessingShape" mc:Ignorable="w14 w15 w16se w16cid w16 w16cex w16sdtdh wp14">
+<w:hdr xmlns:wpc="http://schemas.microsoft.com/office/word/2010/wordprocessingCanvas" xmlns:cx="http://schemas.microsoft.com/office/drawing/2014/chartex" xmlns:cx1="http://schemas.microsoft.com/office/drawing/2015/9/8/chartex" xmlns:cx2="http://schemas.microsoft.com/office/drawing/2015/10/21/chartex" xmlns:cx3="http://schemas.microsoft.com/office/drawing/2016/5/9/chartex" xmlns:cx4="http://schemas.microsoft.com/office/drawing/2016/5/10/chartex" xmlns:cx5="http://schemas.microsoft.com/office/drawing/2016/5/11/chartex" xmlns:cx6="http://schemas.microsoft.com/office/drawing/2016/5/12/chartex" xmlns:cx7="http://schemas.microsoft.com/office/drawing/2016/5/13/chartex" xmlns:cx8="http://schemas.microsoft.com/office/drawing/2016/5/14/chartex" xmlns:mc="http://schemas.openxmlformats.org/markup-compatibility/2006" xmlns:aink="http://schemas.microsoft.com/office/drawing/2016/ink" xmlns:am3d="http://schemas.microsoft.com/office/drawing/2017/model3d" xmlns:o="urn:schemas-microsoft-com:office:office" xmlns:oel="http://schemas.microsoft.com/office/2019/extlst" xmlns:r="http://schemas.openxmlformats.org/officeDocument/2006/relationships" xmlns:m="http://schemas.openxmlformats.org/officeDocument/2006/math" xmlns:v="urn:schemas-microsoft-com:vml" xmlns:wp14="http://schemas.microsoft.com/office/word/2010/wordprocessingDrawing" xmlns:wp="http://schemas.openxmlformats.org/drawingml/2006/wordprocessingDrawing" xmlns:w10="urn:schemas-microsoft-com:office:word" xmlns:w="http://schemas.openxmlformats.org/wordprocessingml/2006/main" xmlns:w14="http://schemas.microsoft.com/office/word/2010/wordml" xmlns:w15="http://schemas.microsoft.com/office/word/2012/wordml" xmlns:w16cex="http://schemas.microsoft.com/office/word/2018/wordml/cex" xmlns:w16cid="http://schemas.microsoft.com/office/word/2016/wordml/cid" xmlns:w16="http://schemas.microsoft.com/office/word/2018/wordml" xmlns:w16du="http://schemas.microsoft.com/office/word/2023/wordml/word16du" xmlns:w16sdtdh="http://schemas.microsoft.com/office/word/2020/wordml/sdtdatahash" xmlns:w16se="http://schemas.microsoft.com/office/word/2015/wordml/symex" xmlns:wpg="http://schemas.microsoft.com/office/word/2010/wordprocessingGroup" xmlns:wpi="http://schemas.microsoft.com/office/word/2010/wordprocessingInk" xmlns:wne="http://schemas.microsoft.com/office/word/2006/wordml" xmlns:wps="http://schemas.microsoft.com/office/word/2010/wordprocessingShape" mc:Ignorable="w14 w15 w16se w16cid w16 w16cex w16sdtdh w16du wp14">
   <w:p>
     <w:pPr>
       <w:pStyle w:val="Header"/>
@@ -2971,7 +3342,6 @@
               <v:path gradientshapeok="t" o:connecttype="rect"/>
             </v:shapetype>
             <v:shape id="Text Box 3" o:spid="_x0000_s1026" type="#_x0000_t202" alt="Unclassified | Non classifié" style="position:absolute;margin-left:-16.25pt;margin-top:0;width:34.95pt;height:34.95pt;z-index:251660288;visibility:visible;mso-wrap-style:none;mso-wrap-distance-left:0;mso-wrap-distance-top:0;mso-wrap-distance-right:0;mso-wrap-distance-bottom:0;mso-position-horizontal:right;mso-position-horizontal-relative:page;mso-position-vertical:top;mso-position-vertical-relative:page;v-text-anchor:top" o:gfxdata="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" filled="f" stroked="f">
-              <v:fill o:detectmouseclick="t"/>
               <v:textbox style="mso-fit-shape-to-text:t" inset="0,15pt,20pt,0">
                 <w:txbxContent>
                   <w:p>
@@ -3009,7 +3379,7 @@
 </file>
 
 <file path=word/header2.xml><?xml version="1.0" encoding="utf-8"?>
-<w:hdr xmlns:wpc="http://schemas.microsoft.com/office/word/2010/wordprocessingCanvas" xmlns:cx="http://schemas.microsoft.com/office/drawing/2014/chartex" xmlns:cx1="http://schemas.microsoft.com/office/drawing/2015/9/8/chartex" xmlns:cx2="http://schemas.microsoft.com/office/drawing/2015/10/21/chartex" xmlns:cx3="http://schemas.microsoft.com/office/drawing/2016/5/9/chartex" xmlns:cx4="http://schemas.microsoft.com/office/drawing/2016/5/10/chartex" xmlns:cx5="http://schemas.microsoft.com/office/drawing/2016/5/11/chartex" xmlns:cx6="http://schemas.microsoft.com/office/drawing/2016/5/12/chartex" xmlns:cx7="http://schemas.microsoft.com/office/drawing/2016/5/13/chartex" xmlns:cx8="http://schemas.microsoft.com/office/drawing/2016/5/14/chartex" xmlns:mc="http://schemas.openxmlformats.org/markup-compatibility/2006" xmlns:aink="http://schemas.microsoft.com/office/drawing/2016/ink" xmlns:am3d="http://schemas.microsoft.com/office/drawing/2017/model3d" xmlns:o="urn:schemas-microsoft-com:office:office" xmlns:oel="http://schemas.microsoft.com/office/2019/extlst" xmlns:r="http://schemas.openxmlformats.org/officeDocument/2006/relationships" xmlns:m="http://schemas.openxmlformats.org/officeDocument/2006/math" xmlns:v="urn:schemas-microsoft-com:vml" xmlns:wp14="http://schemas.microsoft.com/office/word/2010/wordprocessingDrawing" xmlns:wp="http://schemas.openxmlformats.org/drawingml/2006/wordprocessingDrawing" xmlns:w10="urn:schemas-microsoft-com:office:word" xmlns:w="http://schemas.openxmlformats.org/wordprocessingml/2006/main" xmlns:w14="http://schemas.microsoft.com/office/word/2010/wordml" xmlns:w15="http://schemas.microsoft.com/office/word/2012/wordml" xmlns:w16cex="http://schemas.microsoft.com/office/word/2018/wordml/cex" xmlns:w16cid="http://schemas.microsoft.com/office/word/2016/wordml/cid" xmlns:w16="http://schemas.microsoft.com/office/word/2018/wordml" xmlns:w16sdtdh="http://schemas.microsoft.com/office/word/2020/wordml/sdtdatahash" xmlns:w16se="http://schemas.microsoft.com/office/word/2015/wordml/symex" xmlns:wpg="http://schemas.microsoft.com/office/word/2010/wordprocessingGroup" xmlns:wpi="http://schemas.microsoft.com/office/word/2010/wordprocessingInk" xmlns:wne="http://schemas.microsoft.com/office/word/2006/wordml" xmlns:wps="http://schemas.microsoft.com/office/word/2010/wordprocessingShape" mc:Ignorable="w14 w15 w16se w16cid w16 w16cex w16sdtdh wp14">
+<w:hdr xmlns:wpc="http://schemas.microsoft.com/office/word/2010/wordprocessingCanvas" xmlns:cx="http://schemas.microsoft.com/office/drawing/2014/chartex" xmlns:cx1="http://schemas.microsoft.com/office/drawing/2015/9/8/chartex" xmlns:cx2="http://schemas.microsoft.com/office/drawing/2015/10/21/chartex" xmlns:cx3="http://schemas.microsoft.com/office/drawing/2016/5/9/chartex" xmlns:cx4="http://schemas.microsoft.com/office/drawing/2016/5/10/chartex" xmlns:cx5="http://schemas.microsoft.com/office/drawing/2016/5/11/chartex" xmlns:cx6="http://schemas.microsoft.com/office/drawing/2016/5/12/chartex" xmlns:cx7="http://schemas.microsoft.com/office/drawing/2016/5/13/chartex" xmlns:cx8="http://schemas.microsoft.com/office/drawing/2016/5/14/chartex" xmlns:mc="http://schemas.openxmlformats.org/markup-compatibility/2006" xmlns:aink="http://schemas.microsoft.com/office/drawing/2016/ink" xmlns:am3d="http://schemas.microsoft.com/office/drawing/2017/model3d" xmlns:o="urn:schemas-microsoft-com:office:office" xmlns:oel="http://schemas.microsoft.com/office/2019/extlst" xmlns:r="http://schemas.openxmlformats.org/officeDocument/2006/relationships" xmlns:m="http://schemas.openxmlformats.org/officeDocument/2006/math" xmlns:v="urn:schemas-microsoft-com:vml" xmlns:wp14="http://schemas.microsoft.com/office/word/2010/wordprocessingDrawing" xmlns:wp="http://schemas.openxmlformats.org/drawingml/2006/wordprocessingDrawing" xmlns:w10="urn:schemas-microsoft-com:office:word" xmlns:w="http://schemas.openxmlformats.org/wordprocessingml/2006/main" xmlns:w14="http://schemas.microsoft.com/office/word/2010/wordml" xmlns:w15="http://schemas.microsoft.com/office/word/2012/wordml" xmlns:w16cex="http://schemas.microsoft.com/office/word/2018/wordml/cex" xmlns:w16cid="http://schemas.microsoft.com/office/word/2016/wordml/cid" xmlns:w16="http://schemas.microsoft.com/office/word/2018/wordml" xmlns:w16du="http://schemas.microsoft.com/office/word/2023/wordml/word16du" xmlns:w16sdtdh="http://schemas.microsoft.com/office/word/2020/wordml/sdtdatahash" xmlns:w16se="http://schemas.microsoft.com/office/word/2015/wordml/symex" xmlns:wpg="http://schemas.microsoft.com/office/word/2010/wordprocessingGroup" xmlns:wpi="http://schemas.microsoft.com/office/word/2010/wordprocessingInk" xmlns:wne="http://schemas.microsoft.com/office/word/2006/wordml" xmlns:wps="http://schemas.microsoft.com/office/word/2010/wordprocessingShape" mc:Ignorable="w14 w15 w16se w16cid w16 w16cex w16sdtdh w16du wp14">
   <w:p>
     <w:pPr>
       <w:pStyle w:val="Header"/>
@@ -3103,7 +3473,6 @@
               <v:path gradientshapeok="t" o:connecttype="rect"/>
             </v:shapetype>
             <v:shape id="Text Box 4" o:spid="_x0000_s1027" type="#_x0000_t202" alt="Unclassified | Non classifié" style="position:absolute;margin-left:-16.25pt;margin-top:0;width:34.95pt;height:34.95pt;z-index:251661312;visibility:visible;mso-wrap-style:none;mso-wrap-distance-left:0;mso-wrap-distance-top:0;mso-wrap-distance-right:0;mso-wrap-distance-bottom:0;mso-position-horizontal:right;mso-position-horizontal-relative:page;mso-position-vertical:top;mso-position-vertical-relative:page;v-text-anchor:top" o:gfxdata="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" filled="f" stroked="f">
-              <v:fill o:detectmouseclick="t"/>
               <v:textbox style="mso-fit-shape-to-text:t" inset="0,15pt,20pt,0">
                 <w:txbxContent>
                   <w:p>
@@ -3226,7 +3595,7 @@
 </file>
 
 <file path=word/header3.xml><?xml version="1.0" encoding="utf-8"?>
-<w:hdr xmlns:wpc="http://schemas.microsoft.com/office/word/2010/wordprocessingCanvas" xmlns:cx="http://schemas.microsoft.com/office/drawing/2014/chartex" xmlns:cx1="http://schemas.microsoft.com/office/drawing/2015/9/8/chartex" xmlns:cx2="http://schemas.microsoft.com/office/drawing/2015/10/21/chartex" xmlns:cx3="http://schemas.microsoft.com/office/drawing/2016/5/9/chartex" xmlns:cx4="http://schemas.microsoft.com/office/drawing/2016/5/10/chartex" xmlns:cx5="http://schemas.microsoft.com/office/drawing/2016/5/11/chartex" xmlns:cx6="http://schemas.microsoft.com/office/drawing/2016/5/12/chartex" xmlns:cx7="http://schemas.microsoft.com/office/drawing/2016/5/13/chartex" xmlns:cx8="http://schemas.microsoft.com/office/drawing/2016/5/14/chartex" xmlns:mc="http://schemas.openxmlformats.org/markup-compatibility/2006" xmlns:aink="http://schemas.microsoft.com/office/drawing/2016/ink" xmlns:am3d="http://schemas.microsoft.com/office/drawing/2017/model3d" xmlns:o="urn:schemas-microsoft-com:office:office" xmlns:oel="http://schemas.microsoft.com/office/2019/extlst" xmlns:r="http://schemas.openxmlformats.org/officeDocument/2006/relationships" xmlns:m="http://schemas.openxmlformats.org/officeDocument/2006/math" xmlns:v="urn:schemas-microsoft-com:vml" xmlns:wp14="http://schemas.microsoft.com/office/word/2010/wordprocessingDrawing" xmlns:wp="http://schemas.openxmlformats.org/drawingml/2006/wordprocessingDrawing" xmlns:w10="urn:schemas-microsoft-com:office:word" xmlns:w="http://schemas.openxmlformats.org/wordprocessingml/2006/main" xmlns:w14="http://schemas.microsoft.com/office/word/2010/wordml" xmlns:w15="http://schemas.microsoft.com/office/word/2012/wordml" xmlns:w16cex="http://schemas.microsoft.com/office/word/2018/wordml/cex" xmlns:w16cid="http://schemas.microsoft.com/office/word/2016/wordml/cid" xmlns:w16="http://schemas.microsoft.com/office/word/2018/wordml" xmlns:w16sdtdh="http://schemas.microsoft.com/office/word/2020/wordml/sdtdatahash" xmlns:w16se="http://schemas.microsoft.com/office/word/2015/wordml/symex" xmlns:wpg="http://schemas.microsoft.com/office/word/2010/wordprocessingGroup" xmlns:wpi="http://schemas.microsoft.com/office/word/2010/wordprocessingInk" xmlns:wne="http://schemas.microsoft.com/office/word/2006/wordml" xmlns:wps="http://schemas.microsoft.com/office/word/2010/wordprocessingShape" mc:Ignorable="w14 w15 w16se w16cid w16 w16cex w16sdtdh wp14">
+<w:hdr xmlns:wpc="http://schemas.microsoft.com/office/word/2010/wordprocessingCanvas" xmlns:cx="http://schemas.microsoft.com/office/drawing/2014/chartex" xmlns:cx1="http://schemas.microsoft.com/office/drawing/2015/9/8/chartex" xmlns:cx2="http://schemas.microsoft.com/office/drawing/2015/10/21/chartex" xmlns:cx3="http://schemas.microsoft.com/office/drawing/2016/5/9/chartex" xmlns:cx4="http://schemas.microsoft.com/office/drawing/2016/5/10/chartex" xmlns:cx5="http://schemas.microsoft.com/office/drawing/2016/5/11/chartex" xmlns:cx6="http://schemas.microsoft.com/office/drawing/2016/5/12/chartex" xmlns:cx7="http://schemas.microsoft.com/office/drawing/2016/5/13/chartex" xmlns:cx8="http://schemas.microsoft.com/office/drawing/2016/5/14/chartex" xmlns:mc="http://schemas.openxmlformats.org/markup-compatibility/2006" xmlns:aink="http://schemas.microsoft.com/office/drawing/2016/ink" xmlns:am3d="http://schemas.microsoft.com/office/drawing/2017/model3d" xmlns:o="urn:schemas-microsoft-com:office:office" xmlns:oel="http://schemas.microsoft.com/office/2019/extlst" xmlns:r="http://schemas.openxmlformats.org/officeDocument/2006/relationships" xmlns:m="http://schemas.openxmlformats.org/officeDocument/2006/math" xmlns:v="urn:schemas-microsoft-com:vml" xmlns:wp14="http://schemas.microsoft.com/office/word/2010/wordprocessingDrawing" xmlns:wp="http://schemas.openxmlformats.org/drawingml/2006/wordprocessingDrawing" xmlns:w10="urn:schemas-microsoft-com:office:word" xmlns:w="http://schemas.openxmlformats.org/wordprocessingml/2006/main" xmlns:w14="http://schemas.microsoft.com/office/word/2010/wordml" xmlns:w15="http://schemas.microsoft.com/office/word/2012/wordml" xmlns:w16cex="http://schemas.microsoft.com/office/word/2018/wordml/cex" xmlns:w16cid="http://schemas.microsoft.com/office/word/2016/wordml/cid" xmlns:w16="http://schemas.microsoft.com/office/word/2018/wordml" xmlns:w16du="http://schemas.microsoft.com/office/word/2023/wordml/word16du" xmlns:w16sdtdh="http://schemas.microsoft.com/office/word/2020/wordml/sdtdatahash" xmlns:w16se="http://schemas.microsoft.com/office/word/2015/wordml/symex" xmlns:wpg="http://schemas.microsoft.com/office/word/2010/wordprocessingGroup" xmlns:wpi="http://schemas.microsoft.com/office/word/2010/wordprocessingInk" xmlns:wne="http://schemas.microsoft.com/office/word/2006/wordml" xmlns:wps="http://schemas.microsoft.com/office/word/2010/wordprocessingShape" mc:Ignorable="w14 w15 w16se w16cid w16 w16cex w16sdtdh w16du wp14">
   <w:p>
     <w:pPr>
       <w:pStyle w:val="Header"/>
@@ -3319,7 +3688,6 @@
               <v:path gradientshapeok="t" o:connecttype="rect"/>
             </v:shapetype>
             <v:shape id="Text Box 1" o:spid="_x0000_s1028" type="#_x0000_t202" alt="Unclassified | Non classifié" style="position:absolute;margin-left:-16.25pt;margin-top:0;width:34.95pt;height:34.95pt;z-index:251659264;visibility:visible;mso-wrap-style:none;mso-wrap-distance-left:0;mso-wrap-distance-top:0;mso-wrap-distance-right:0;mso-wrap-distance-bottom:0;mso-position-horizontal:right;mso-position-horizontal-relative:page;mso-position-vertical:top;mso-position-vertical-relative:page;v-text-anchor:top" o:gfxdata="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" filled="f" stroked="f">
-              <v:fill o:detectmouseclick="t"/>
               <v:textbox style="mso-fit-shape-to-text:t" inset="0,15pt,20pt,0">
                 <w:txbxContent>
                   <w:p>
@@ -3357,7 +3725,7 @@
 </file>
 
 <file path=word/numbering.xml><?xml version="1.0" encoding="utf-8"?>
-<w:numbering xmlns:wpc="http://schemas.microsoft.com/office/word/2010/wordprocessingCanvas" xmlns:cx="http://schemas.microsoft.com/office/drawing/2014/chartex" xmlns:cx1="http://schemas.microsoft.com/office/drawing/2015/9/8/chartex" xmlns:cx2="http://schemas.microsoft.com/office/drawing/2015/10/21/chartex" xmlns:cx3="http://schemas.microsoft.com/office/drawing/2016/5/9/chartex" xmlns:cx4="http://schemas.microsoft.com/office/drawing/2016/5/10/chartex" xmlns:cx5="http://schemas.microsoft.com/office/drawing/2016/5/11/chartex" xmlns:cx6="http://schemas.microsoft.com/office/drawing/2016/5/12/chartex" xmlns:cx7="http://schemas.microsoft.com/office/drawing/2016/5/13/chartex" xmlns:cx8="http://schemas.microsoft.com/office/drawing/2016/5/14/chartex" xmlns:mc="http://schemas.openxmlformats.org/markup-compatibility/2006" xmlns:aink="http://schemas.microsoft.com/office/drawing/2016/ink" xmlns:am3d="http://schemas.microsoft.com/office/drawing/2017/model3d" xmlns:o="urn:schemas-microsoft-com:office:office" xmlns:oel="http://schemas.microsoft.com/office/2019/extlst" xmlns:r="http://schemas.openxmlformats.org/officeDocument/2006/relationships" xmlns:m="http://schemas.openxmlformats.org/officeDocument/2006/math" xmlns:v="urn:schemas-microsoft-com:vml" xmlns:wp14="http://schemas.microsoft.com/office/word/2010/wordprocessingDrawing" xmlns:wp="http://schemas.openxmlformats.org/drawingml/2006/wordprocessingDrawing" xmlns:w10="urn:schemas-microsoft-com:office:word" xmlns:w="http://schemas.openxmlformats.org/wordprocessingml/2006/main" xmlns:w14="http://schemas.microsoft.com/office/word/2010/wordml" xmlns:w15="http://schemas.microsoft.com/office/word/2012/wordml" xmlns:w16cex="http://schemas.microsoft.com/office/word/2018/wordml/cex" xmlns:w16cid="http://schemas.microsoft.com/office/word/2016/wordml/cid" xmlns:w16="http://schemas.microsoft.com/office/word/2018/wordml" xmlns:w16sdtdh="http://schemas.microsoft.com/office/word/2020/wordml/sdtdatahash" xmlns:w16se="http://schemas.microsoft.com/office/word/2015/wordml/symex" xmlns:wpg="http://schemas.microsoft.com/office/word/2010/wordprocessingGroup" xmlns:wpi="http://schemas.microsoft.com/office/word/2010/wordprocessingInk" xmlns:wne="http://schemas.microsoft.com/office/word/2006/wordml" xmlns:wps="http://schemas.microsoft.com/office/word/2010/wordprocessingShape" mc:Ignorable="w14 w15 w16se w16cid w16 w16cex w16sdtdh wp14">
+<w:numbering xmlns:wpc="http://schemas.microsoft.com/office/word/2010/wordprocessingCanvas" xmlns:cx="http://schemas.microsoft.com/office/drawing/2014/chartex" xmlns:cx1="http://schemas.microsoft.com/office/drawing/2015/9/8/chartex" xmlns:cx2="http://schemas.microsoft.com/office/drawing/2015/10/21/chartex" xmlns:cx3="http://schemas.microsoft.com/office/drawing/2016/5/9/chartex" xmlns:cx4="http://schemas.microsoft.com/office/drawing/2016/5/10/chartex" xmlns:cx5="http://schemas.microsoft.com/office/drawing/2016/5/11/chartex" xmlns:cx6="http://schemas.microsoft.com/office/drawing/2016/5/12/chartex" xmlns:cx7="http://schemas.microsoft.com/office/drawing/2016/5/13/chartex" xmlns:cx8="http://schemas.microsoft.com/office/drawing/2016/5/14/chartex" xmlns:mc="http://schemas.openxmlformats.org/markup-compatibility/2006" xmlns:aink="http://schemas.microsoft.com/office/drawing/2016/ink" xmlns:am3d="http://schemas.microsoft.com/office/drawing/2017/model3d" xmlns:o="urn:schemas-microsoft-com:office:office" xmlns:oel="http://schemas.microsoft.com/office/2019/extlst" xmlns:r="http://schemas.openxmlformats.org/officeDocument/2006/relationships" xmlns:m="http://schemas.openxmlformats.org/officeDocument/2006/math" xmlns:v="urn:schemas-microsoft-com:vml" xmlns:wp14="http://schemas.microsoft.com/office/word/2010/wordprocessingDrawing" xmlns:wp="http://schemas.openxmlformats.org/drawingml/2006/wordprocessingDrawing" xmlns:w10="urn:schemas-microsoft-com:office:word" xmlns:w="http://schemas.openxmlformats.org/wordprocessingml/2006/main" xmlns:w14="http://schemas.microsoft.com/office/word/2010/wordml" xmlns:w15="http://schemas.microsoft.com/office/word/2012/wordml" xmlns:w16cex="http://schemas.microsoft.com/office/word/2018/wordml/cex" xmlns:w16cid="http://schemas.microsoft.com/office/word/2016/wordml/cid" xmlns:w16="http://schemas.microsoft.com/office/word/2018/wordml" xmlns:w16du="http://schemas.microsoft.com/office/word/2023/wordml/word16du" xmlns:w16sdtdh="http://schemas.microsoft.com/office/word/2020/wordml/sdtdatahash" xmlns:w16se="http://schemas.microsoft.com/office/word/2015/wordml/symex" xmlns:wpg="http://schemas.microsoft.com/office/word/2010/wordprocessingGroup" xmlns:wpi="http://schemas.microsoft.com/office/word/2010/wordprocessingInk" xmlns:wne="http://schemas.microsoft.com/office/word/2006/wordml" xmlns:wps="http://schemas.microsoft.com/office/word/2010/wordprocessingShape" mc:Ignorable="w14 w15 w16se w16cid w16 w16cex w16sdtdh w16du wp14">
   <w:abstractNum w:abstractNumId="0" w15:restartNumberingAfterBreak="0">
     <w:nsid w:val="3A7D200A"/>
     <w:multiLevelType w:val="hybridMultilevel"/>
@@ -3953,7 +4321,7 @@
 </file>
 
 <file path=word/styles.xml><?xml version="1.0" encoding="utf-8"?>
-<w:styles xmlns:mc="http://schemas.openxmlformats.org/markup-compatibility/2006" xmlns:r="http://schemas.openxmlformats.org/officeDocument/2006/relationships" xmlns:w="http://schemas.openxmlformats.org/wordprocessingml/2006/main" xmlns:w14="http://schemas.microsoft.com/office/word/2010/wordml" xmlns:w15="http://schemas.microsoft.com/office/word/2012/wordml" xmlns:w16cex="http://schemas.microsoft.com/office/word/2018/wordml/cex" xmlns:w16cid="http://schemas.microsoft.com/office/word/2016/wordml/cid" xmlns:w16="http://schemas.microsoft.com/office/word/2018/wordml" xmlns:w16sdtdh="http://schemas.microsoft.com/office/word/2020/wordml/sdtdatahash" xmlns:w16se="http://schemas.microsoft.com/office/word/2015/wordml/symex" mc:Ignorable="w14 w15 w16se w16cid w16 w16cex w16sdtdh">
+<w:styles xmlns:mc="http://schemas.openxmlformats.org/markup-compatibility/2006" xmlns:r="http://schemas.openxmlformats.org/officeDocument/2006/relationships" xmlns:w="http://schemas.openxmlformats.org/wordprocessingml/2006/main" xmlns:w14="http://schemas.microsoft.com/office/word/2010/wordml" xmlns:w15="http://schemas.microsoft.com/office/word/2012/wordml" xmlns:w16cex="http://schemas.microsoft.com/office/word/2018/wordml/cex" xmlns:w16cid="http://schemas.microsoft.com/office/word/2016/wordml/cid" xmlns:w16="http://schemas.microsoft.com/office/word/2018/wordml" xmlns:w16du="http://schemas.microsoft.com/office/word/2023/wordml/word16du" xmlns:w16sdtdh="http://schemas.microsoft.com/office/word/2020/wordml/sdtdatahash" xmlns:w16se="http://schemas.microsoft.com/office/word/2015/wordml/symex" mc:Ignorable="w14 w15 w16se w16cid w16 w16cex w16sdtdh w16du">
   <w:docDefaults>
     <w:rPrDefault>
       <w:rPr>
@@ -4351,6 +4719,27 @@
     <w:name w:val="Normal"/>
     <w:qFormat/>
   </w:style>
+  <w:style w:type="paragraph" w:styleId="Heading1">
+    <w:name w:val="heading 1"/>
+    <w:basedOn w:val="Normal"/>
+    <w:next w:val="Normal"/>
+    <w:link w:val="Heading1Char"/>
+    <w:uiPriority w:val="9"/>
+    <w:qFormat/>
+    <w:rsid w:val="0042516C"/>
+    <w:pPr>
+      <w:keepNext/>
+      <w:keepLines/>
+      <w:spacing w:before="240" w:after="0"/>
+      <w:outlineLvl w:val="0"/>
+    </w:pPr>
+    <w:rPr>
+      <w:rFonts w:asciiTheme="majorHAnsi" w:eastAsiaTheme="majorEastAsia" w:hAnsiTheme="majorHAnsi" w:cstheme="majorBidi"/>
+      <w:color w:val="365F91" w:themeColor="accent1" w:themeShade="BF"/>
+      <w:sz w:val="32"/>
+      <w:szCs w:val="32"/>
+    </w:rPr>
+  </w:style>
   <w:style w:type="paragraph" w:styleId="Heading2">
     <w:name w:val="heading 2"/>
     <w:basedOn w:val="Normal"/>
@@ -4674,6 +5063,19 @@
       <w:color w:val="4F81BD" w:themeColor="accent1"/>
     </w:rPr>
   </w:style>
+  <w:style w:type="character" w:customStyle="1" w:styleId="Heading1Char">
+    <w:name w:val="Heading 1 Char"/>
+    <w:basedOn w:val="DefaultParagraphFont"/>
+    <w:link w:val="Heading1"/>
+    <w:uiPriority w:val="9"/>
+    <w:rsid w:val="0042516C"/>
+    <w:rPr>
+      <w:rFonts w:asciiTheme="majorHAnsi" w:eastAsiaTheme="majorEastAsia" w:hAnsiTheme="majorHAnsi" w:cstheme="majorBidi"/>
+      <w:color w:val="365F91" w:themeColor="accent1" w:themeShade="BF"/>
+      <w:sz w:val="32"/>
+      <w:szCs w:val="32"/>
+    </w:rPr>
+  </w:style>
 </w:styles>
 </file>
 

</xml_diff>